<commit_message>
docs: adequa trabalho às normas ABNT atuais
Co-authored-by: arena-agent <297053741+arena-agent@users.noreply.github.com>
</commit_message>
<xml_diff>
--- a/docs/TCC-Pratica-dev-2.0-editavel.docx
+++ b/docs/TCC-Pratica-dev-2.0-editavel.docx
@@ -1284,6 +1284,7 @@
     <w:p>
       <w:pPr>
         <w:pStyle w:val="Heading1"/>
+        <w:pageBreakBefore/>
         <w:keepNext/>
       </w:pPr>
       <w:r>
@@ -1318,6 +1319,7 @@
     <w:p>
       <w:pPr>
         <w:pStyle w:val="Heading1"/>
+        <w:pageBreakBefore/>
         <w:keepNext/>
       </w:pPr>
       <w:r>
@@ -1352,6 +1354,7 @@
     <w:p>
       <w:pPr>
         <w:pStyle w:val="Heading1"/>
+        <w:pageBreakBefore/>
         <w:keepNext/>
       </w:pPr>
       <w:r>
@@ -1426,6 +1429,7 @@
     <w:p>
       <w:pPr>
         <w:pStyle w:val="Heading1"/>
+        <w:pageBreakBefore/>
         <w:keepNext/>
       </w:pPr>
       <w:r>
@@ -1513,6 +1517,7 @@
     <w:p>
       <w:pPr>
         <w:pStyle w:val="Heading1"/>
+        <w:pageBreakBefore/>
         <w:keepNext/>
       </w:pPr>
       <w:r>
@@ -2110,6 +2115,7 @@
     <w:p>
       <w:pPr>
         <w:pStyle w:val="Heading1"/>
+        <w:pageBreakBefore/>
         <w:keepNext/>
       </w:pPr>
       <w:r>
@@ -2144,6 +2150,17 @@
     </w:p>
     <w:p>
       <w:pPr>
+        <w:sectPr>
+          <w:headerReference w:type="default" r:id="rId9"/>
+          <w:pgSz w:w="11906" w:h="16838"/>
+          <w:pgMar w:top="1701" w:right="1134" w:bottom="1134" w:left="1701" w:header="1134" w:footer="709" w:gutter="0"/>
+          <w:cols w:space="720"/>
+          <w:docGrid w:linePitch="360"/>
+        </w:sectPr>
+      </w:pPr>
+    </w:p>
+    <w:p>
+      <w:pPr>
         <w:pStyle w:val="Heading1"/>
         <w:keepNext/>
       </w:pPr>
@@ -2439,12 +2456,13 @@
           <w:b w:val="0"/>
           <w:i w:val="0"/>
         </w:rPr>
-        <w:t>Além desta introdução, o capítulo 2 apresenta a fundamentação teórica. O capítulo 3 descreve a metodologia. O capítulo 4 registra requisitos e planejamento. O capítulo 5 detalha o desenvolvimento e a arquitetura. O capítulo 6 reúne testes e resultados. O capítulo 7 discute limitações e possibilidades de evolução. Por fim, o capítulo 8 apresenta as considerações finais.</w:t>
+        <w:t>Além desta introdução, a seção 2 apresenta a fundamentação teórica. A seção 3 descreve a metodologia. A seção 4 registra requisitos e planejamento. A seção 5 detalha o desenvolvimento e a arquitetura. A seção 6 reúne testes e resultados. A seção 7 discute limitações e possibilidades de evolução. Por fim, a seção 8 apresenta as considerações finais.</w:t>
       </w:r>
     </w:p>
     <w:p>
       <w:pPr>
         <w:pStyle w:val="Heading1"/>
+        <w:pageBreakBefore/>
         <w:keepNext/>
       </w:pPr>
       <w:r>
@@ -2640,6 +2658,7 @@
     <w:p>
       <w:pPr>
         <w:pStyle w:val="Heading1"/>
+        <w:pageBreakBefore/>
         <w:keepNext/>
       </w:pPr>
       <w:r>
@@ -3195,6 +3214,7 @@
     <w:p>
       <w:pPr>
         <w:pStyle w:val="Heading1"/>
+        <w:pageBreakBefore/>
         <w:keepNext/>
       </w:pPr>
       <w:r>
@@ -4885,6 +4905,7 @@
     <w:p>
       <w:pPr>
         <w:pStyle w:val="Heading1"/>
+        <w:pageBreakBefore/>
         <w:keepNext/>
       </w:pPr>
       <w:r>
@@ -6337,6 +6358,7 @@
     <w:p>
       <w:pPr>
         <w:pStyle w:val="Heading1"/>
+        <w:pageBreakBefore/>
         <w:keepNext/>
       </w:pPr>
       <w:r>
@@ -6993,6 +7015,7 @@
     <w:p>
       <w:pPr>
         <w:pStyle w:val="Heading1"/>
+        <w:pageBreakBefore/>
         <w:keepNext/>
       </w:pPr>
       <w:r>
@@ -7245,6 +7268,7 @@
     <w:p>
       <w:pPr>
         <w:pStyle w:val="Heading1"/>
+        <w:pageBreakBefore/>
         <w:keepNext/>
       </w:pPr>
       <w:r>
@@ -7290,6 +7314,7 @@
     <w:p>
       <w:pPr>
         <w:pStyle w:val="Heading1"/>
+        <w:pageBreakBefore/>
         <w:keepNext/>
       </w:pPr>
       <w:r>
@@ -7298,7 +7323,8 @@
     </w:p>
     <w:p>
       <w:pPr>
-        <w:spacing w:before="0" w:after="160"/>
+        <w:pStyle w:val="Referencia"/>
+        <w:spacing w:before="0" w:after="0"/>
         <w:ind w:firstLine="0"/>
       </w:pPr>
       <w:r>
@@ -7306,12 +7332,55 @@
           <w:b w:val="0"/>
           <w:i w:val="0"/>
         </w:rPr>
-        <w:t>ABNT — ASSOCIAÇÃO BRASILEIRA DE NORMAS TÉCNICAS. NBR 14724: informação e documentação — trabalhos acadêmicos — apresentação. Rio de Janeiro: ABNT, 2011.</w:t>
-      </w:r>
-    </w:p>
-    <w:p>
-      <w:pPr>
-        <w:spacing w:before="0" w:after="160"/>
+        <w:t>ABNT — ASSOCIAÇÃO BRASILEIRA DE NORMAS TÉCNICAS. ABNT NBR 14724:2024: informação e documentação — trabalhos acadêmicos — apresentação. Rio de Janeiro: ABNT, 2024.</w:t>
+      </w:r>
+    </w:p>
+    <w:p>
+      <w:pPr>
+        <w:pStyle w:val="Referencia"/>
+        <w:spacing w:before="0" w:after="0"/>
+        <w:ind w:firstLine="0"/>
+      </w:pPr>
+      <w:r>
+        <w:rPr>
+          <w:b w:val="0"/>
+          <w:i w:val="0"/>
+        </w:rPr>
+        <w:t>ABNT — ASSOCIAÇÃO BRASILEIRA DE NORMAS TÉCNICAS. ABNT NBR 6023:2025: informação e documentação — referências — elaboração. Rio de Janeiro: ABNT, 2025.</w:t>
+      </w:r>
+    </w:p>
+    <w:p>
+      <w:pPr>
+        <w:pStyle w:val="Referencia"/>
+        <w:spacing w:before="0" w:after="0"/>
+        <w:ind w:firstLine="0"/>
+      </w:pPr>
+      <w:r>
+        <w:rPr>
+          <w:b w:val="0"/>
+          <w:i w:val="0"/>
+        </w:rPr>
+        <w:t>ABNT — ASSOCIAÇÃO BRASILEIRA DE NORMAS TÉCNICAS. ABNT NBR 6028:2021: informação e documentação — resumo, resenha e recensão — apresentação. Rio de Janeiro: ABNT, 2021.</w:t>
+      </w:r>
+    </w:p>
+    <w:p>
+      <w:pPr>
+        <w:pStyle w:val="Referencia"/>
+        <w:spacing w:before="0" w:after="0"/>
+        <w:ind w:firstLine="0"/>
+      </w:pPr>
+      <w:r>
+        <w:rPr>
+          <w:b w:val="0"/>
+          <w:i w:val="0"/>
+        </w:rPr>
+        <w:t>ABNT — ASSOCIAÇÃO BRASILEIRA DE NORMAS TÉCNICAS. ABNT NBR 10520:2023: informação e documentação — citações em documentos — apresentação. Rio de Janeiro: ABNT, 2023.</w:t>
+      </w:r>
+    </w:p>
+    <w:p>
+      <w:pPr>
+        <w:pStyle w:val="Referencia"/>
+        <w:spacing w:before="0" w:after="0"/>
         <w:ind w:firstLine="0"/>
       </w:pPr>
       <w:r>
@@ -7324,7 +7393,8 @@
     </w:p>
     <w:p>
       <w:pPr>
-        <w:spacing w:before="0" w:after="160"/>
+        <w:pStyle w:val="Referencia"/>
+        <w:spacing w:before="0" w:after="0"/>
         <w:ind w:firstLine="0"/>
       </w:pPr>
       <w:r>
@@ -7337,7 +7407,8 @@
     </w:p>
     <w:p>
       <w:pPr>
-        <w:spacing w:before="0" w:after="160"/>
+        <w:pStyle w:val="Referencia"/>
+        <w:spacing w:before="0" w:after="0"/>
         <w:ind w:firstLine="0"/>
       </w:pPr>
       <w:r>
@@ -7350,7 +7421,8 @@
     </w:p>
     <w:p>
       <w:pPr>
-        <w:spacing w:before="0" w:after="160"/>
+        <w:pStyle w:val="Referencia"/>
+        <w:spacing w:before="0" w:after="0"/>
         <w:ind w:firstLine="0"/>
       </w:pPr>
       <w:r>
@@ -7363,7 +7435,8 @@
     </w:p>
     <w:p>
       <w:pPr>
-        <w:spacing w:before="0" w:after="160"/>
+        <w:pStyle w:val="Referencia"/>
+        <w:spacing w:before="0" w:after="0"/>
         <w:ind w:firstLine="0"/>
       </w:pPr>
       <w:r>
@@ -7376,7 +7449,8 @@
     </w:p>
     <w:p>
       <w:pPr>
-        <w:spacing w:before="0" w:after="160"/>
+        <w:pStyle w:val="Referencia"/>
+        <w:spacing w:before="0" w:after="0"/>
         <w:ind w:firstLine="0"/>
       </w:pPr>
       <w:r>
@@ -7389,7 +7463,8 @@
     </w:p>
     <w:p>
       <w:pPr>
-        <w:spacing w:before="0" w:after="160"/>
+        <w:pStyle w:val="Referencia"/>
+        <w:spacing w:before="0" w:after="0"/>
         <w:ind w:firstLine="0"/>
       </w:pPr>
       <w:r>
@@ -7402,7 +7477,8 @@
     </w:p>
     <w:p>
       <w:pPr>
-        <w:spacing w:before="0" w:after="160"/>
+        <w:pStyle w:val="Referencia"/>
+        <w:spacing w:before="0" w:after="0"/>
         <w:ind w:firstLine="0"/>
       </w:pPr>
       <w:r>
@@ -7415,7 +7491,8 @@
     </w:p>
     <w:p>
       <w:pPr>
-        <w:spacing w:before="0" w:after="160"/>
+        <w:pStyle w:val="Referencia"/>
+        <w:spacing w:before="0" w:after="0"/>
         <w:ind w:firstLine="0"/>
       </w:pPr>
       <w:r>
@@ -7428,7 +7505,8 @@
     </w:p>
     <w:p>
       <w:pPr>
-        <w:spacing w:before="0" w:after="160"/>
+        <w:pStyle w:val="Referencia"/>
+        <w:spacing w:before="0" w:after="0"/>
         <w:ind w:firstLine="0"/>
       </w:pPr>
       <w:r>
@@ -7442,6 +7520,7 @@
     <w:p>
       <w:pPr>
         <w:pStyle w:val="Heading1"/>
+        <w:pageBreakBefore/>
         <w:keepNext/>
       </w:pPr>
       <w:r>
@@ -7740,6 +7819,7 @@
     <w:p>
       <w:pPr>
         <w:pStyle w:val="Heading1"/>
+        <w:pageBreakBefore/>
         <w:keepNext/>
       </w:pPr>
       <w:r>
@@ -8310,6 +8390,7 @@
     <w:p>
       <w:pPr>
         <w:pStyle w:val="Heading1"/>
+        <w:pageBreakBefore/>
         <w:keepNext/>
       </w:pPr>
       <w:r>
@@ -8401,28 +8482,40 @@
       </w:r>
     </w:p>
     <w:sectPr>
-      <w:footerReference w:type="default" r:id="rId9"/>
+      <w:headerReference w:type="default" r:id="rId10"/>
       <w:pgSz w:w="11906" w:h="16838"/>
-      <w:pgMar w:top="1701" w:right="1134" w:bottom="1134" w:left="1701" w:header="709" w:footer="709" w:gutter="0"/>
+      <w:pgMar w:top="1701" w:right="1134" w:bottom="1134" w:left="1701" w:header="1134" w:footer="709" w:gutter="0"/>
       <w:cols w:space="720"/>
       <w:docGrid w:linePitch="360"/>
+      <w:pgNumType w:start="9"/>
     </w:sectPr>
   </w:body>
 </w:document>
 </file>
 
-<file path=word/footer1.xml><?xml version="1.0" encoding="utf-8"?>
-<w:ftr xmlns:m="http://schemas.openxmlformats.org/officeDocument/2006/math" xmlns:mc="http://schemas.openxmlformats.org/markup-compatibility/2006" xmlns:mo="http://schemas.microsoft.com/office/mac/office/2008/main" xmlns:mv="urn:schemas-microsoft-com:mac:vml" xmlns:o="urn:schemas-microsoft-com:office:office" xmlns:r="http://schemas.openxmlformats.org/officeDocument/2006/relationships" xmlns:v="urn:schemas-microsoft-com:vml" xmlns:w10="urn:schemas-microsoft-com:office:word" xmlns:w14="http://schemas.microsoft.com/office/word/2010/wordml" xmlns:w="http://schemas.openxmlformats.org/wordprocessingml/2006/main" xmlns:wne="http://schemas.microsoft.com/office/word/2006/wordml" xmlns:wp14="http://schemas.microsoft.com/office/word/2010/wordprocessingDrawing" xmlns:wp="http://schemas.openxmlformats.org/drawingml/2006/wordprocessingDrawing" xmlns:wpc="http://schemas.microsoft.com/office/word/2010/wordprocessingCanvas" xmlns:wpg="http://schemas.microsoft.com/office/word/2010/wordprocessingGroup" xmlns:wpi="http://schemas.microsoft.com/office/word/2010/wordprocessingInk" xmlns:wps="http://schemas.microsoft.com/office/word/2010/wordprocessingShape" mc:Ignorable="w14 wp14">
+<file path=word/header1.xml><?xml version="1.0" encoding="utf-8"?>
+<w:hdr xmlns:m="http://schemas.openxmlformats.org/officeDocument/2006/math" xmlns:mc="http://schemas.openxmlformats.org/markup-compatibility/2006" xmlns:mo="http://schemas.microsoft.com/office/mac/office/2008/main" xmlns:mv="urn:schemas-microsoft-com:mac:vml" xmlns:o="urn:schemas-microsoft-com:office:office" xmlns:r="http://schemas.openxmlformats.org/officeDocument/2006/relationships" xmlns:v="urn:schemas-microsoft-com:vml" xmlns:w10="urn:schemas-microsoft-com:office:word" xmlns:w14="http://schemas.microsoft.com/office/word/2010/wordml" xmlns:w="http://schemas.openxmlformats.org/wordprocessingml/2006/main" xmlns:wne="http://schemas.microsoft.com/office/word/2006/wordml" xmlns:wp14="http://schemas.microsoft.com/office/word/2010/wordprocessingDrawing" xmlns:wp="http://schemas.openxmlformats.org/drawingml/2006/wordprocessingDrawing" xmlns:wpc="http://schemas.microsoft.com/office/word/2010/wordprocessingCanvas" xmlns:wpg="http://schemas.microsoft.com/office/word/2010/wordprocessingGroup" xmlns:wpi="http://schemas.microsoft.com/office/word/2010/wordprocessingInk" xmlns:wps="http://schemas.microsoft.com/office/word/2010/wordprocessingShape" mc:Ignorable="w14 wp14">
   <w:p>
     <w:pPr>
-      <w:pStyle w:val="Footer"/>
+      <w:pStyle w:val="Header"/>
+    </w:pPr>
+    <w:r/>
+  </w:p>
+</w:hdr>
+</file>
+
+<file path=word/header2.xml><?xml version="1.0" encoding="utf-8"?>
+<w:hdr xmlns:m="http://schemas.openxmlformats.org/officeDocument/2006/math" xmlns:mc="http://schemas.openxmlformats.org/markup-compatibility/2006" xmlns:mo="http://schemas.microsoft.com/office/mac/office/2008/main" xmlns:mv="urn:schemas-microsoft-com:mac:vml" xmlns:o="urn:schemas-microsoft-com:office:office" xmlns:r="http://schemas.openxmlformats.org/officeDocument/2006/relationships" xmlns:v="urn:schemas-microsoft-com:vml" xmlns:w10="urn:schemas-microsoft-com:office:word" xmlns:w14="http://schemas.microsoft.com/office/word/2010/wordml" xmlns:w="http://schemas.openxmlformats.org/wordprocessingml/2006/main" xmlns:wne="http://schemas.microsoft.com/office/word/2006/wordml" xmlns:wp14="http://schemas.microsoft.com/office/word/2010/wordprocessingDrawing" xmlns:wp="http://schemas.openxmlformats.org/drawingml/2006/wordprocessingDrawing" xmlns:wpc="http://schemas.microsoft.com/office/word/2010/wordprocessingCanvas" xmlns:wpg="http://schemas.microsoft.com/office/word/2010/wordprocessingGroup" xmlns:wpi="http://schemas.microsoft.com/office/word/2010/wordprocessingInk" xmlns:wps="http://schemas.microsoft.com/office/word/2010/wordprocessingShape" mc:Ignorable="w14 wp14">
+  <w:p>
+    <w:pPr>
+      <w:pStyle w:val="Header"/>
       <w:jc w:val="right"/>
     </w:pPr>
     <w:r>
       <w:fldSimple w:instr="PAGE"/>
     </w:r>
   </w:p>
-</w:ftr>
+</w:hdr>
 </file>
 
 <file path=word/numbering.xml><?xml version="1.0" encoding="utf-8"?>
@@ -8853,7 +8946,6 @@
     <w:pPr>
       <w:keepNext/>
       <w:keepLines/>
-      <w:pageBreakBefore/>
       <w:spacing w:before="240" w:after="120"/>
       <w:ind w:firstLine="0"/>
       <w:outlineLvl w:val="0"/>
@@ -20516,6 +20608,18 @@
     <w:rPr>
       <w:rFonts w:ascii="Arial" w:hAnsi="Arial"/>
       <w:sz w:val="20"/>
+    </w:rPr>
+  </w:style>
+  <w:style w:type="paragraph" w:customStyle="1" w:styleId="Referencia">
+    <w:name w:val="Referencia"/>
+    <w:pPr>
+      <w:spacing w:line="240" w:lineRule="auto" w:after="240"/>
+      <w:ind w:firstLine="0"/>
+      <w:jc w:val="left"/>
+    </w:pPr>
+    <w:rPr>
+      <w:rFonts w:ascii="Arial" w:hAnsi="Arial"/>
+      <w:sz w:val="24"/>
     </w:rPr>
   </w:style>
 </w:styles>

</xml_diff>

<commit_message>
docs: adapta TCC ao modelo da instituição
Co-authored-by: arena-agent <297053741+arena-agent@users.noreply.github.com>
</commit_message>
<xml_diff>
--- a/docs/TCC-Pratica-dev-2.0-editavel.docx
+++ b/docs/TCC-Pratica-dev-2.0-editavel.docx
@@ -1282,10 +1282,116 @@
       </w:r>
     </w:p>
     <w:p>
-      <w:pPr>
-        <w:pStyle w:val="Heading1"/>
-        <w:pageBreakBefore/>
-        <w:keepNext/>
+      <w:r>
+        <w:br w:type="page"/>
+      </w:r>
+    </w:p>
+    <w:p>
+      <w:pPr>
+        <w:spacing w:before="7200" w:after="0" w:line="360" w:lineRule="auto"/>
+        <w:ind w:firstLine="0" w:left="4535"/>
+      </w:pPr>
+      <w:r>
+        <w:rPr>
+          <w:b w:val="0"/>
+          <w:i w:val="0"/>
+        </w:rPr>
+        <w:t>Dedicamos este trabalho às nossas famílias, que nos apoiaram durante toda a formação, aos professores que compartilharam seus conhecimentos e a todos os estudantes que buscam transformar ideias em soluções por meio da tecnologia.</w:t>
+      </w:r>
+    </w:p>
+    <w:p>
+      <w:pPr>
+        <w:pStyle w:val="PreTextual"/>
+      </w:pPr>
+      <w:r>
+        <w:t>AGRADECIMENTOS</w:t>
+      </w:r>
+    </w:p>
+    <w:p>
+      <w:pPr>
+        <w:spacing w:before="0" w:after="0"/>
+      </w:pPr>
+      <w:r>
+        <w:rPr>
+          <w:b w:val="0"/>
+          <w:i w:val="0"/>
+        </w:rPr>
+        <w:t>Agradecemos primeiramente a Deus pela oportunidade, pela força e pela perseverança necessárias para concluir esta etapa.</w:t>
+      </w:r>
+    </w:p>
+    <w:p>
+      <w:pPr>
+        <w:spacing w:before="0" w:after="0"/>
+      </w:pPr>
+      <w:r>
+        <w:rPr>
+          <w:b w:val="0"/>
+          <w:i w:val="0"/>
+        </w:rPr>
+        <w:t>Às nossas famílias, pelo apoio, pela compreensão e pelo incentivo durante o desenvolvimento do curso e deste trabalho.</w:t>
+      </w:r>
+    </w:p>
+    <w:p>
+      <w:pPr>
+        <w:spacing w:before="0" w:after="0"/>
+      </w:pPr>
+      <w:r>
+        <w:rPr>
+          <w:b w:val="0"/>
+          <w:i w:val="0"/>
+        </w:rPr>
+        <w:t>Ao professor orientador Antonio Carlos Ramires Golçalves, pela orientação, pelos conhecimentos compartilhados e pelas contribuições para o aprimoramento do projeto.</w:t>
+      </w:r>
+    </w:p>
+    <w:p>
+      <w:pPr>
+        <w:spacing w:before="0" w:after="0"/>
+      </w:pPr>
+      <w:r>
+        <w:rPr>
+          <w:b w:val="0"/>
+          <w:i w:val="0"/>
+        </w:rPr>
+        <w:t>Aos professores e à equipe do Colégio Estadual Professor Júlio Szymanski, que contribuíram para nossa formação no Curso Técnico em Desenvolvimento de Sistemas.</w:t>
+      </w:r>
+    </w:p>
+    <w:p>
+      <w:pPr>
+        <w:spacing w:before="0" w:after="0"/>
+      </w:pPr>
+      <w:r>
+        <w:rPr>
+          <w:b w:val="0"/>
+          <w:i w:val="0"/>
+        </w:rPr>
+        <w:t>Aos colegas de turma, pelo companheirismo, pela troca de experiências e pelo apoio ao longo dessa jornada.</w:t>
+      </w:r>
+    </w:p>
+    <w:p>
+      <w:r>
+        <w:br w:type="page"/>
+      </w:r>
+    </w:p>
+    <w:p>
+      <w:pPr>
+        <w:spacing w:before="6600" w:after="0" w:line="240" w:lineRule="auto"/>
+        <w:ind w:firstLine="0" w:left="4535"/>
+        <w:jc w:val="right"/>
+      </w:pPr>
+      <w:r>
+        <w:rPr>
+          <w:b w:val="0"/>
+          <w:i w:val="0"/>
+        </w:rPr>
+        <w:t>“Educação não transforma o mundo. Educação muda as pessoas. Pessoas transformam o mundo.”</w:t>
+        <w:br/>
+        <w:br/>
+        <w:t>Paulo Freire</w:t>
+      </w:r>
+    </w:p>
+    <w:p>
+      <w:pPr>
+        <w:pStyle w:val="PreTextual"/>
       </w:pPr>
       <w:r>
         <w:t>RESUMO</w:t>
@@ -1293,7 +1399,8 @@
     </w:p>
     <w:p>
       <w:pPr>
-        <w:spacing w:before="0" w:after="0"/>
+        <w:spacing w:before="0" w:after="0" w:line="360" w:lineRule="auto"/>
+        <w:ind w:firstLine="0"/>
       </w:pPr>
       <w:r>
         <w:rPr>
@@ -1310,55 +1417,39 @@
       </w:pPr>
       <w:r>
         <w:rPr>
-          <w:b/>
+          <w:b w:val="0"/>
           <w:i w:val="0"/>
         </w:rPr>
-        <w:t>Palavras-chave: educação tecnológica; gamificação; desenvolvimento de sistemas; aplicação web; portfólio digital.</w:t>
-      </w:r>
-    </w:p>
-    <w:p>
-      <w:pPr>
-        <w:pStyle w:val="Heading1"/>
-        <w:pageBreakBefore/>
-        <w:keepNext/>
-      </w:pPr>
-      <w:r>
-        <w:t>ABSTRACT</w:t>
+      </w:r>
+      <w:r>
+        <w:rPr>
+          <w:b/>
+        </w:rPr>
+        <w:t xml:space="preserve">Palavras-chave: </w:t>
+      </w:r>
+      <w:r>
+        <w:t>educação tecnológica. Gamificação. Desenvolvimento de sistemas. Aplicação web. Portfólio digital.</w:t>
+      </w:r>
+    </w:p>
+    <w:p>
+      <w:pPr>
+        <w:pStyle w:val="PreTextual"/>
+      </w:pPr>
+      <w:r>
+        <w:t>LISTA DE ABREVIATURAS E SIGLAS</w:t>
       </w:r>
     </w:p>
     <w:p>
       <w:pPr>
         <w:spacing w:before="0" w:after="0"/>
+        <w:ind w:firstLine="0"/>
       </w:pPr>
       <w:r>
         <w:rPr>
           <w:b w:val="0"/>
           <w:i w:val="0"/>
         </w:rPr>
-        <w:t>This work presents the development of Pratica.dev 2.0, a gamified educational web platform aimed at students enrolled in technical Systems Development programs. The addressed problem is the fragmentation of learning content, practical activities and evidence of achievement across different tools, which makes it difficult for students to understand their progress and organize a study path. The proposed solution is a single-page application that combines registration and authentication, a placement quiz, a study center with twelve subjects, quick knowledge tests, projects with professional-style briefs, an experience system, certificates and a public portfolio. The frontend was built with HTML5, CSS3 and JavaScript, while authentication, persistence, storage and access control are provided by Supabase using PostgreSQL, Row Level Security and RPC functions. The project followed an applied, incremental and prototype-oriented approach, with requirements derived from the student journey and validation through automated tests. A total of 259 checks were executed across regression, end-to-end journey and additional verification suites; all checks passed in the development environment on October 1, 2026. Results show that the solution implements the proposed core workflows and includes privacy controls for personal data, portfolios and profile images. It is concluded that the product can support learning organization and the presentation of acquired skills, while future work may include more content, learning analytics, accessibility improvements and evaluations with real users.</w:t>
-      </w:r>
-    </w:p>
-    <w:p>
-      <w:pPr>
-        <w:spacing w:before="240" w:after="0"/>
-        <w:ind w:firstLine="0"/>
-      </w:pPr>
-      <w:r>
-        <w:rPr>
-          <w:b/>
-          <w:i w:val="0"/>
-        </w:rPr>
-        <w:t>Keywords: technology education; gamification; systems development; web application; digital portfolio.</w:t>
-      </w:r>
-    </w:p>
-    <w:p>
-      <w:pPr>
-        <w:pStyle w:val="Heading1"/>
-        <w:pageBreakBefore/>
-        <w:keepNext/>
-      </w:pPr>
-      <w:r>
-        <w:t>LISTA DE FIGURAS</w:t>
+        <w:t>API – Application Programming Interface</w:t>
       </w:r>
     </w:p>
     <w:p>
@@ -1371,7 +1462,7 @@
           <w:b w:val="0"/>
           <w:i w:val="0"/>
         </w:rPr>
-        <w:t>Figura 1 — Visão geral da arquitetura do sistema</w:t>
+        <w:t>CDN – Content Delivery Network</w:t>
       </w:r>
     </w:p>
     <w:p>
@@ -1384,7 +1475,7 @@
           <w:b w:val="0"/>
           <w:i w:val="0"/>
         </w:rPr>
-        <w:t>Figura 2 — Fluxo principal do estudante</w:t>
+        <w:t>CSS – Cascading Style Sheets</w:t>
       </w:r>
     </w:p>
     <w:p>
@@ -1397,7 +1488,7 @@
           <w:b w:val="0"/>
           <w:i w:val="0"/>
         </w:rPr>
-        <w:t>Figura 3 — Relacionamento lógico entre as entidades</w:t>
+        <w:t>HTML – HyperText Markup Language</w:t>
       </w:r>
     </w:p>
     <w:p>
@@ -1410,30 +1501,7 @@
           <w:b w:val="0"/>
           <w:i w:val="0"/>
         </w:rPr>
-        <w:t>Figura 4 — Fluxo de publicação do portfólio</w:t>
-      </w:r>
-    </w:p>
-    <w:p>
-      <w:pPr>
-        <w:spacing w:before="240" w:after="0"/>
-        <w:ind w:firstLine="0"/>
-      </w:pPr>
-      <w:r>
-        <w:rPr>
-          <w:b w:val="0"/>
-          <w:i/>
-        </w:rPr>
-        <w:t>Observação: os números de página podem ser atualizados automaticamente após a inserção das capturas de tela.</w:t>
-      </w:r>
-    </w:p>
-    <w:p>
-      <w:pPr>
-        <w:pStyle w:val="Heading1"/>
-        <w:pageBreakBefore/>
-        <w:keepNext/>
-      </w:pPr>
-      <w:r>
-        <w:t>LISTA DE QUADROS</w:t>
+        <w:t>HTTP – Hypertext Transfer Protocol</w:t>
       </w:r>
     </w:p>
     <w:p>
@@ -1446,7 +1514,7 @@
           <w:b w:val="0"/>
           <w:i w:val="0"/>
         </w:rPr>
-        <w:t>Quadro 1 — Requisitos funcionais</w:t>
+        <w:t>JS – JavaScript</w:t>
       </w:r>
     </w:p>
     <w:p>
@@ -1459,7 +1527,7 @@
           <w:b w:val="0"/>
           <w:i w:val="0"/>
         </w:rPr>
-        <w:t>Quadro 2 — Requisitos não funcionais</w:t>
+        <w:t>RLS – Row Level Security</w:t>
       </w:r>
     </w:p>
     <w:p>
@@ -1472,7 +1540,7 @@
           <w:b w:val="0"/>
           <w:i w:val="0"/>
         </w:rPr>
-        <w:t>Quadro 3 — Tecnologias empregadas</w:t>
+        <w:t>RPC – Remote Procedure Call</w:t>
       </w:r>
     </w:p>
     <w:p>
@@ -1485,7 +1553,7 @@
           <w:b w:val="0"/>
           <w:i w:val="0"/>
         </w:rPr>
-        <w:t>Quadro 4 — Entidades do banco de dados</w:t>
+        <w:t>SPA – Single-Page Application</w:t>
       </w:r>
     </w:p>
     <w:p>
@@ -1498,7 +1566,7 @@
           <w:b w:val="0"/>
           <w:i w:val="0"/>
         </w:rPr>
-        <w:t>Quadro 5 — Resultado dos testes automatizados</w:t>
+        <w:t>SQL – Structured Query Language</w:t>
       </w:r>
     </w:p>
     <w:p>
@@ -1511,597 +1579,12 @@
           <w:b w:val="0"/>
           <w:i w:val="0"/>
         </w:rPr>
-        <w:t>Quadro 6 — Cronograma de execução</w:t>
-      </w:r>
-    </w:p>
-    <w:p>
-      <w:pPr>
-        <w:pStyle w:val="Heading1"/>
-        <w:pageBreakBefore/>
-        <w:keepNext/>
-      </w:pPr>
-      <w:r>
-        <w:t>LISTA DE ABREVIATURAS E SIGLAS</w:t>
-      </w:r>
-    </w:p>
-    <w:tbl>
-      <w:tblPr>
-        <w:tblStyle w:val="TableGrid"/>
-        <w:tblW w:type="auto" w:w="0"/>
-        <w:jc w:val="center"/>
-        <w:tblLook w:firstColumn="1" w:firstRow="1" w:lastColumn="0" w:lastRow="0" w:noHBand="0" w:noVBand="1" w:val="04A0"/>
-      </w:tblPr>
-      <w:tblGrid>
-        <w:gridCol w:w="4535"/>
-        <w:gridCol w:w="4535"/>
-      </w:tblGrid>
-      <w:tr>
-        <w:tc>
-          <w:tcPr>
-            <w:tcW w:type="dxa" w:w="1701"/>
-            <w:shd w:fill="D9EAF7"/>
-            <w:vAlign w:val="center"/>
-          </w:tcPr>
-          <w:p>
-            <w:pPr>
-              <w:jc w:val="center"/>
-            </w:pPr>
-            <w:r>
-              <w:rPr>
-                <w:rFonts w:ascii="Arial" w:hAnsi="Arial"/>
-                <w:b/>
-                <w:sz w:val="20"/>
-              </w:rPr>
-              <w:t>Sigla</w:t>
-            </w:r>
-          </w:p>
-        </w:tc>
-        <w:tc>
-          <w:tcPr>
-            <w:tcW w:type="dxa" w:w="7370"/>
-            <w:shd w:fill="D9EAF7"/>
-            <w:vAlign w:val="center"/>
-          </w:tcPr>
-          <w:p>
-            <w:pPr>
-              <w:jc w:val="center"/>
-            </w:pPr>
-            <w:r>
-              <w:rPr>
-                <w:rFonts w:ascii="Arial" w:hAnsi="Arial"/>
-                <w:b/>
-                <w:sz w:val="20"/>
-              </w:rPr>
-              <w:t>Significado</w:t>
-            </w:r>
-          </w:p>
-        </w:tc>
-      </w:tr>
-      <w:tr>
-        <w:tc>
-          <w:tcPr>
-            <w:tcW w:type="dxa" w:w="1701"/>
-            <w:vAlign w:val="center"/>
-          </w:tcPr>
-          <w:p>
-            <w:pPr>
-              <w:spacing w:line="240" w:lineRule="auto" w:after="40"/>
-              <w:ind w:firstLine="0"/>
-            </w:pPr>
-            <w:r>
-              <w:rPr>
-                <w:rFonts w:ascii="Arial" w:hAnsi="Arial"/>
-                <w:sz w:val="20"/>
-              </w:rPr>
-              <w:t>API</w:t>
-            </w:r>
-          </w:p>
-        </w:tc>
-        <w:tc>
-          <w:tcPr>
-            <w:tcW w:type="dxa" w:w="7370"/>
-            <w:vAlign w:val="center"/>
-          </w:tcPr>
-          <w:p>
-            <w:pPr>
-              <w:spacing w:line="240" w:lineRule="auto" w:after="40"/>
-              <w:ind w:firstLine="0"/>
-            </w:pPr>
-            <w:r>
-              <w:rPr>
-                <w:rFonts w:ascii="Arial" w:hAnsi="Arial"/>
-                <w:sz w:val="20"/>
-              </w:rPr>
-              <w:t>Application Programming Interface</w:t>
-            </w:r>
-          </w:p>
-        </w:tc>
-      </w:tr>
-      <w:tr>
-        <w:tc>
-          <w:tcPr>
-            <w:tcW w:type="dxa" w:w="1701"/>
-            <w:vAlign w:val="center"/>
-          </w:tcPr>
-          <w:p>
-            <w:pPr>
-              <w:spacing w:line="240" w:lineRule="auto" w:after="40"/>
-              <w:ind w:firstLine="0"/>
-            </w:pPr>
-            <w:r>
-              <w:rPr>
-                <w:rFonts w:ascii="Arial" w:hAnsi="Arial"/>
-                <w:sz w:val="20"/>
-              </w:rPr>
-              <w:t>CDN</w:t>
-            </w:r>
-          </w:p>
-        </w:tc>
-        <w:tc>
-          <w:tcPr>
-            <w:tcW w:type="dxa" w:w="7370"/>
-            <w:vAlign w:val="center"/>
-          </w:tcPr>
-          <w:p>
-            <w:pPr>
-              <w:spacing w:line="240" w:lineRule="auto" w:after="40"/>
-              <w:ind w:firstLine="0"/>
-            </w:pPr>
-            <w:r>
-              <w:rPr>
-                <w:rFonts w:ascii="Arial" w:hAnsi="Arial"/>
-                <w:sz w:val="20"/>
-              </w:rPr>
-              <w:t>Content Delivery Network</w:t>
-            </w:r>
-          </w:p>
-        </w:tc>
-      </w:tr>
-      <w:tr>
-        <w:tc>
-          <w:tcPr>
-            <w:tcW w:type="dxa" w:w="1701"/>
-            <w:vAlign w:val="center"/>
-          </w:tcPr>
-          <w:p>
-            <w:pPr>
-              <w:spacing w:line="240" w:lineRule="auto" w:after="40"/>
-              <w:ind w:firstLine="0"/>
-            </w:pPr>
-            <w:r>
-              <w:rPr>
-                <w:rFonts w:ascii="Arial" w:hAnsi="Arial"/>
-                <w:sz w:val="20"/>
-              </w:rPr>
-              <w:t>CSS</w:t>
-            </w:r>
-          </w:p>
-        </w:tc>
-        <w:tc>
-          <w:tcPr>
-            <w:tcW w:type="dxa" w:w="7370"/>
-            <w:vAlign w:val="center"/>
-          </w:tcPr>
-          <w:p>
-            <w:pPr>
-              <w:spacing w:line="240" w:lineRule="auto" w:after="40"/>
-              <w:ind w:firstLine="0"/>
-            </w:pPr>
-            <w:r>
-              <w:rPr>
-                <w:rFonts w:ascii="Arial" w:hAnsi="Arial"/>
-                <w:sz w:val="20"/>
-              </w:rPr>
-              <w:t>Cascading Style Sheets</w:t>
-            </w:r>
-          </w:p>
-        </w:tc>
-      </w:tr>
-      <w:tr>
-        <w:tc>
-          <w:tcPr>
-            <w:tcW w:type="dxa" w:w="1701"/>
-            <w:vAlign w:val="center"/>
-          </w:tcPr>
-          <w:p>
-            <w:pPr>
-              <w:spacing w:line="240" w:lineRule="auto" w:after="40"/>
-              <w:ind w:firstLine="0"/>
-            </w:pPr>
-            <w:r>
-              <w:rPr>
-                <w:rFonts w:ascii="Arial" w:hAnsi="Arial"/>
-                <w:sz w:val="20"/>
-              </w:rPr>
-              <w:t>HTML</w:t>
-            </w:r>
-          </w:p>
-        </w:tc>
-        <w:tc>
-          <w:tcPr>
-            <w:tcW w:type="dxa" w:w="7370"/>
-            <w:vAlign w:val="center"/>
-          </w:tcPr>
-          <w:p>
-            <w:pPr>
-              <w:spacing w:line="240" w:lineRule="auto" w:after="40"/>
-              <w:ind w:firstLine="0"/>
-            </w:pPr>
-            <w:r>
-              <w:rPr>
-                <w:rFonts w:ascii="Arial" w:hAnsi="Arial"/>
-                <w:sz w:val="20"/>
-              </w:rPr>
-              <w:t>HyperText Markup Language</w:t>
-            </w:r>
-          </w:p>
-        </w:tc>
-      </w:tr>
-      <w:tr>
-        <w:tc>
-          <w:tcPr>
-            <w:tcW w:type="dxa" w:w="1701"/>
-            <w:vAlign w:val="center"/>
-          </w:tcPr>
-          <w:p>
-            <w:pPr>
-              <w:spacing w:line="240" w:lineRule="auto" w:after="40"/>
-              <w:ind w:firstLine="0"/>
-            </w:pPr>
-            <w:r>
-              <w:rPr>
-                <w:rFonts w:ascii="Arial" w:hAnsi="Arial"/>
-                <w:sz w:val="20"/>
-              </w:rPr>
-              <w:t>HTTP</w:t>
-            </w:r>
-          </w:p>
-        </w:tc>
-        <w:tc>
-          <w:tcPr>
-            <w:tcW w:type="dxa" w:w="7370"/>
-            <w:vAlign w:val="center"/>
-          </w:tcPr>
-          <w:p>
-            <w:pPr>
-              <w:spacing w:line="240" w:lineRule="auto" w:after="40"/>
-              <w:ind w:firstLine="0"/>
-            </w:pPr>
-            <w:r>
-              <w:rPr>
-                <w:rFonts w:ascii="Arial" w:hAnsi="Arial"/>
-                <w:sz w:val="20"/>
-              </w:rPr>
-              <w:t>Hypertext Transfer Protocol</w:t>
-            </w:r>
-          </w:p>
-        </w:tc>
-      </w:tr>
-      <w:tr>
-        <w:tc>
-          <w:tcPr>
-            <w:tcW w:type="dxa" w:w="1701"/>
-            <w:vAlign w:val="center"/>
-          </w:tcPr>
-          <w:p>
-            <w:pPr>
-              <w:spacing w:line="240" w:lineRule="auto" w:after="40"/>
-              <w:ind w:firstLine="0"/>
-            </w:pPr>
-            <w:r>
-              <w:rPr>
-                <w:rFonts w:ascii="Arial" w:hAnsi="Arial"/>
-                <w:sz w:val="20"/>
-              </w:rPr>
-              <w:t>JS</w:t>
-            </w:r>
-          </w:p>
-        </w:tc>
-        <w:tc>
-          <w:tcPr>
-            <w:tcW w:type="dxa" w:w="7370"/>
-            <w:vAlign w:val="center"/>
-          </w:tcPr>
-          <w:p>
-            <w:pPr>
-              <w:spacing w:line="240" w:lineRule="auto" w:after="40"/>
-              <w:ind w:firstLine="0"/>
-            </w:pPr>
-            <w:r>
-              <w:rPr>
-                <w:rFonts w:ascii="Arial" w:hAnsi="Arial"/>
-                <w:sz w:val="20"/>
-              </w:rPr>
-              <w:t>JavaScript</w:t>
-            </w:r>
-          </w:p>
-        </w:tc>
-      </w:tr>
-      <w:tr>
-        <w:tc>
-          <w:tcPr>
-            <w:tcW w:type="dxa" w:w="1701"/>
-            <w:vAlign w:val="center"/>
-          </w:tcPr>
-          <w:p>
-            <w:pPr>
-              <w:spacing w:line="240" w:lineRule="auto" w:after="40"/>
-              <w:ind w:firstLine="0"/>
-            </w:pPr>
-            <w:r>
-              <w:rPr>
-                <w:rFonts w:ascii="Arial" w:hAnsi="Arial"/>
-                <w:sz w:val="20"/>
-              </w:rPr>
-              <w:t>RLS</w:t>
-            </w:r>
-          </w:p>
-        </w:tc>
-        <w:tc>
-          <w:tcPr>
-            <w:tcW w:type="dxa" w:w="7370"/>
-            <w:vAlign w:val="center"/>
-          </w:tcPr>
-          <w:p>
-            <w:pPr>
-              <w:spacing w:line="240" w:lineRule="auto" w:after="40"/>
-              <w:ind w:firstLine="0"/>
-            </w:pPr>
-            <w:r>
-              <w:rPr>
-                <w:rFonts w:ascii="Arial" w:hAnsi="Arial"/>
-                <w:sz w:val="20"/>
-              </w:rPr>
-              <w:t>Row Level Security</w:t>
-            </w:r>
-          </w:p>
-        </w:tc>
-      </w:tr>
-      <w:tr>
-        <w:tc>
-          <w:tcPr>
-            <w:tcW w:type="dxa" w:w="1701"/>
-            <w:vAlign w:val="center"/>
-          </w:tcPr>
-          <w:p>
-            <w:pPr>
-              <w:spacing w:line="240" w:lineRule="auto" w:after="40"/>
-              <w:ind w:firstLine="0"/>
-            </w:pPr>
-            <w:r>
-              <w:rPr>
-                <w:rFonts w:ascii="Arial" w:hAnsi="Arial"/>
-                <w:sz w:val="20"/>
-              </w:rPr>
-              <w:t>RPC</w:t>
-            </w:r>
-          </w:p>
-        </w:tc>
-        <w:tc>
-          <w:tcPr>
-            <w:tcW w:type="dxa" w:w="7370"/>
-            <w:vAlign w:val="center"/>
-          </w:tcPr>
-          <w:p>
-            <w:pPr>
-              <w:spacing w:line="240" w:lineRule="auto" w:after="40"/>
-              <w:ind w:firstLine="0"/>
-            </w:pPr>
-            <w:r>
-              <w:rPr>
-                <w:rFonts w:ascii="Arial" w:hAnsi="Arial"/>
-                <w:sz w:val="20"/>
-              </w:rPr>
-              <w:t>Remote Procedure Call</w:t>
-            </w:r>
-          </w:p>
-        </w:tc>
-      </w:tr>
-      <w:tr>
-        <w:tc>
-          <w:tcPr>
-            <w:tcW w:type="dxa" w:w="1701"/>
-            <w:vAlign w:val="center"/>
-          </w:tcPr>
-          <w:p>
-            <w:pPr>
-              <w:spacing w:line="240" w:lineRule="auto" w:after="40"/>
-              <w:ind w:firstLine="0"/>
-            </w:pPr>
-            <w:r>
-              <w:rPr>
-                <w:rFonts w:ascii="Arial" w:hAnsi="Arial"/>
-                <w:sz w:val="20"/>
-              </w:rPr>
-              <w:t>SPA</w:t>
-            </w:r>
-          </w:p>
-        </w:tc>
-        <w:tc>
-          <w:tcPr>
-            <w:tcW w:type="dxa" w:w="7370"/>
-            <w:vAlign w:val="center"/>
-          </w:tcPr>
-          <w:p>
-            <w:pPr>
-              <w:spacing w:line="240" w:lineRule="auto" w:after="40"/>
-              <w:ind w:firstLine="0"/>
-            </w:pPr>
-            <w:r>
-              <w:rPr>
-                <w:rFonts w:ascii="Arial" w:hAnsi="Arial"/>
-                <w:sz w:val="20"/>
-              </w:rPr>
-              <w:t>Single-Page Application</w:t>
-            </w:r>
-          </w:p>
-        </w:tc>
-      </w:tr>
-      <w:tr>
-        <w:tc>
-          <w:tcPr>
-            <w:tcW w:type="dxa" w:w="1701"/>
-            <w:vAlign w:val="center"/>
-          </w:tcPr>
-          <w:p>
-            <w:pPr>
-              <w:spacing w:line="240" w:lineRule="auto" w:after="40"/>
-              <w:ind w:firstLine="0"/>
-            </w:pPr>
-            <w:r>
-              <w:rPr>
-                <w:rFonts w:ascii="Arial" w:hAnsi="Arial"/>
-                <w:sz w:val="20"/>
-              </w:rPr>
-              <w:t>SQL</w:t>
-            </w:r>
-          </w:p>
-        </w:tc>
-        <w:tc>
-          <w:tcPr>
-            <w:tcW w:type="dxa" w:w="7370"/>
-            <w:vAlign w:val="center"/>
-          </w:tcPr>
-          <w:p>
-            <w:pPr>
-              <w:spacing w:line="240" w:lineRule="auto" w:after="40"/>
-              <w:ind w:firstLine="0"/>
-            </w:pPr>
-            <w:r>
-              <w:rPr>
-                <w:rFonts w:ascii="Arial" w:hAnsi="Arial"/>
-                <w:sz w:val="20"/>
-              </w:rPr>
-              <w:t>Structured Query Language</w:t>
-            </w:r>
-          </w:p>
-        </w:tc>
-      </w:tr>
-      <w:tr>
-        <w:tc>
-          <w:tcPr>
-            <w:tcW w:type="dxa" w:w="1701"/>
-            <w:vAlign w:val="center"/>
-          </w:tcPr>
-          <w:p>
-            <w:pPr>
-              <w:spacing w:line="240" w:lineRule="auto" w:after="40"/>
-              <w:ind w:firstLine="0"/>
-            </w:pPr>
-            <w:r>
-              <w:rPr>
-                <w:rFonts w:ascii="Arial" w:hAnsi="Arial"/>
-                <w:sz w:val="20"/>
-              </w:rPr>
-              <w:t>TCC</w:t>
-            </w:r>
-          </w:p>
-        </w:tc>
-        <w:tc>
-          <w:tcPr>
-            <w:tcW w:type="dxa" w:w="7370"/>
-            <w:vAlign w:val="center"/>
-          </w:tcPr>
-          <w:p>
-            <w:pPr>
-              <w:spacing w:line="240" w:lineRule="auto" w:after="40"/>
-              <w:ind w:firstLine="0"/>
-            </w:pPr>
-            <w:r>
-              <w:rPr>
-                <w:rFonts w:ascii="Arial" w:hAnsi="Arial"/>
-                <w:sz w:val="20"/>
-              </w:rPr>
-              <w:t>Trabalho de Conclusão de Curso</w:t>
-            </w:r>
-          </w:p>
-        </w:tc>
-      </w:tr>
-      <w:tr>
-        <w:tc>
-          <w:tcPr>
-            <w:tcW w:type="dxa" w:w="1701"/>
-            <w:vAlign w:val="center"/>
-          </w:tcPr>
-          <w:p>
-            <w:pPr>
-              <w:spacing w:line="240" w:lineRule="auto" w:after="40"/>
-              <w:ind w:firstLine="0"/>
-            </w:pPr>
-            <w:r>
-              <w:rPr>
-                <w:rFonts w:ascii="Arial" w:hAnsi="Arial"/>
-                <w:sz w:val="20"/>
-              </w:rPr>
-              <w:t>UX</w:t>
-            </w:r>
-          </w:p>
-        </w:tc>
-        <w:tc>
-          <w:tcPr>
-            <w:tcW w:type="dxa" w:w="7370"/>
-            <w:vAlign w:val="center"/>
-          </w:tcPr>
-          <w:p>
-            <w:pPr>
-              <w:spacing w:line="240" w:lineRule="auto" w:after="40"/>
-              <w:ind w:firstLine="0"/>
-            </w:pPr>
-            <w:r>
-              <w:rPr>
-                <w:rFonts w:ascii="Arial" w:hAnsi="Arial"/>
-                <w:sz w:val="20"/>
-              </w:rPr>
-              <w:t>User Experience</w:t>
-            </w:r>
-          </w:p>
-        </w:tc>
-      </w:tr>
-      <w:tr>
-        <w:tc>
-          <w:tcPr>
-            <w:tcW w:type="dxa" w:w="1701"/>
-            <w:vAlign w:val="center"/>
-          </w:tcPr>
-          <w:p>
-            <w:pPr>
-              <w:spacing w:line="240" w:lineRule="auto" w:after="40"/>
-              <w:ind w:firstLine="0"/>
-            </w:pPr>
-            <w:r>
-              <w:rPr>
-                <w:rFonts w:ascii="Arial" w:hAnsi="Arial"/>
-                <w:sz w:val="20"/>
-              </w:rPr>
-              <w:t>XP</w:t>
-            </w:r>
-          </w:p>
-        </w:tc>
-        <w:tc>
-          <w:tcPr>
-            <w:tcW w:type="dxa" w:w="7370"/>
-            <w:vAlign w:val="center"/>
-          </w:tcPr>
-          <w:p>
-            <w:pPr>
-              <w:spacing w:line="240" w:lineRule="auto" w:after="40"/>
-              <w:ind w:firstLine="0"/>
-            </w:pPr>
-            <w:r>
-              <w:rPr>
-                <w:rFonts w:ascii="Arial" w:hAnsi="Arial"/>
-                <w:sz w:val="20"/>
-              </w:rPr>
-              <w:t>Experience Points</w:t>
-            </w:r>
-          </w:p>
-        </w:tc>
-      </w:tr>
-    </w:tbl>
-    <w:p>
-      <w:pPr>
-        <w:pStyle w:val="Legenda"/>
-        <w:spacing w:before="0" w:after="120"/>
+        <w:t>TCC – Trabalho de Conclusão de Curso</w:t>
+      </w:r>
+    </w:p>
+    <w:p>
+      <w:pPr>
+        <w:spacing w:before="0" w:after="0"/>
         <w:ind w:firstLine="0"/>
       </w:pPr>
       <w:r>
@@ -2109,17 +1592,7 @@
           <w:b w:val="0"/>
           <w:i w:val="0"/>
         </w:rPr>
-        <w:t>Fonte: Elaborado pelos autores (2026).</w:t>
-      </w:r>
-    </w:p>
-    <w:p>
-      <w:pPr>
-        <w:pStyle w:val="Heading1"/>
-        <w:pageBreakBefore/>
-        <w:keepNext/>
-      </w:pPr>
-      <w:r>
-        <w:t>SUMÁRIO</w:t>
+        <w:t>UX – User Experience</w:t>
       </w:r>
     </w:p>
     <w:p>
@@ -2132,21 +1605,29 @@
           <w:b w:val="0"/>
           <w:i w:val="0"/>
         </w:rPr>
-      </w:r>
-      <w:fldSimple w:instr="TOC \o &quot;1-3&quot; \h \z \u"/>
-    </w:p>
-    <w:p>
-      <w:pPr>
-        <w:spacing w:before="240" w:after="0"/>
+        <w:t>XP – Experience Points</w:t>
+      </w:r>
+    </w:p>
+    <w:p>
+      <w:pPr>
+        <w:pStyle w:val="PreTextual"/>
+      </w:pPr>
+      <w:r>
+        <w:t>SUMÁRIO</w:t>
+      </w:r>
+    </w:p>
+    <w:p>
+      <w:pPr>
+        <w:spacing w:before="0" w:after="0"/>
         <w:ind w:firstLine="0"/>
       </w:pPr>
       <w:r>
         <w:rPr>
           <w:b w:val="0"/>
-          <w:i/>
+          <w:i w:val="0"/>
         </w:rPr>
-        <w:t>No Microsoft Word: clique com o botão direito sobre o sumário e escolha “Atualizar Campo” &gt; “Atualizar o índice inteiro”. No LibreOffice Writer: Ferramentas &gt; Atualizar &gt; Atualizar tudo.</w:t>
-      </w:r>
+      </w:r>
+      <w:fldSimple w:instr="TOC \o &quot;1-3&quot; \h \z \u"/>
     </w:p>
     <w:p>
       <w:pPr>
@@ -2456,7 +1937,7 @@
           <w:b w:val="0"/>
           <w:i w:val="0"/>
         </w:rPr>
-        <w:t>Além desta introdução, a seção 2 apresenta a fundamentação teórica. A seção 3 descreve a metodologia. A seção 4 registra requisitos e planejamento. A seção 5 detalha o desenvolvimento e a arquitetura. A seção 6 reúne testes e resultados. A seção 7 discute limitações e possibilidades de evolução. Por fim, a seção 8 apresenta as considerações finais.</w:t>
+        <w:t>Além desta introdução, a seção 2 apresenta a fundamentação teórica. A seção 3 descreve a metodologia. A seção 4 registra requisitos e planejamento. A seção 5 detalha o desenvolvimento e a arquitetura. A seção 6 reúne testes e resultados. A seção 7 discute limitações e possibilidades de evolução. Por fim, a seção 8 apresenta a conclusão.</w:t>
       </w:r>
     </w:p>
     <w:p>
@@ -2840,6 +2321,25 @@
       </w:pPr>
       <w:r>
         <w:t>3.4 FERRAMENTAS</w:t>
+      </w:r>
+    </w:p>
+    <w:p>
+      <w:pPr>
+        <w:spacing w:before="240" w:after="60"/>
+        <w:ind w:firstLine="0"/>
+        <w:jc w:val="center"/>
+      </w:pPr>
+      <w:r>
+        <w:rPr>
+          <w:b w:val="0"/>
+          <w:i w:val="0"/>
+        </w:rPr>
+      </w:r>
+      <w:r>
+        <w:rPr>
+          <w:b/>
+        </w:rPr>
+        <w:t>Quadro 1 – Tecnologias empregadas no desenvolvimento</w:t>
       </w:r>
     </w:p>
     <w:tbl>
@@ -2857,7 +2357,6 @@
         <w:tc>
           <w:tcPr>
             <w:tcW w:type="dxa" w:w="2835"/>
-            <w:shd w:fill="D9EAF7"/>
             <w:vAlign w:val="center"/>
           </w:tcPr>
           <w:p>
@@ -2877,7 +2376,6 @@
         <w:tc>
           <w:tcPr>
             <w:tcW w:type="dxa" w:w="6236"/>
-            <w:shd w:fill="D9EAF7"/>
             <w:vAlign w:val="center"/>
           </w:tcPr>
           <w:p>
@@ -3251,6 +2749,25 @@
         <w:t>4.2 REQUISITOS FUNCIONAIS</w:t>
       </w:r>
     </w:p>
+    <w:p>
+      <w:pPr>
+        <w:spacing w:before="240" w:after="60"/>
+        <w:ind w:firstLine="0"/>
+        <w:jc w:val="center"/>
+      </w:pPr>
+      <w:r>
+        <w:rPr>
+          <w:b w:val="0"/>
+          <w:i w:val="0"/>
+        </w:rPr>
+      </w:r>
+      <w:r>
+        <w:rPr>
+          <w:b/>
+        </w:rPr>
+        <w:t>Quadro 2 – Requisitos funcionais do sistema</w:t>
+      </w:r>
+    </w:p>
     <w:tbl>
       <w:tblPr>
         <w:tblStyle w:val="TableGrid"/>
@@ -3266,7 +2783,6 @@
         <w:tc>
           <w:tcPr>
             <w:tcW w:type="dxa" w:w="1134"/>
-            <w:shd w:fill="D9EAF7"/>
             <w:vAlign w:val="center"/>
           </w:tcPr>
           <w:p>
@@ -3286,7 +2802,6 @@
         <w:tc>
           <w:tcPr>
             <w:tcW w:type="dxa" w:w="7937"/>
-            <w:shd w:fill="D9EAF7"/>
             <w:vAlign w:val="center"/>
           </w:tcPr>
           <w:p>
@@ -3808,6 +3323,25 @@
         <w:t>4.3 REQUISITOS NÃO FUNCIONAIS</w:t>
       </w:r>
     </w:p>
+    <w:p>
+      <w:pPr>
+        <w:spacing w:before="240" w:after="60"/>
+        <w:ind w:firstLine="0"/>
+        <w:jc w:val="center"/>
+      </w:pPr>
+      <w:r>
+        <w:rPr>
+          <w:b w:val="0"/>
+          <w:i w:val="0"/>
+        </w:rPr>
+      </w:r>
+      <w:r>
+        <w:rPr>
+          <w:b/>
+        </w:rPr>
+        <w:t>Quadro 3 – Requisitos não funcionais do sistema</w:t>
+      </w:r>
+    </w:p>
     <w:tbl>
       <w:tblPr>
         <w:tblStyle w:val="TableGrid"/>
@@ -3823,7 +3357,6 @@
         <w:tc>
           <w:tcPr>
             <w:tcW w:type="dxa" w:w="1134"/>
-            <w:shd w:fill="D9EAF7"/>
             <w:vAlign w:val="center"/>
           </w:tcPr>
           <w:p>
@@ -3843,7 +3376,6 @@
         <w:tc>
           <w:tcPr>
             <w:tcW w:type="dxa" w:w="7937"/>
-            <w:shd w:fill="D9EAF7"/>
             <w:vAlign w:val="center"/>
           </w:tcPr>
           <w:p>
@@ -4334,6 +3866,25 @@
         <w:t>4.5 CRONOGRAMA</w:t>
       </w:r>
     </w:p>
+    <w:p>
+      <w:pPr>
+        <w:spacing w:before="240" w:after="60"/>
+        <w:ind w:firstLine="0"/>
+        <w:jc w:val="center"/>
+      </w:pPr>
+      <w:r>
+        <w:rPr>
+          <w:b w:val="0"/>
+          <w:i w:val="0"/>
+        </w:rPr>
+      </w:r>
+      <w:r>
+        <w:rPr>
+          <w:b/>
+        </w:rPr>
+        <w:t>Quadro 4 – Cronograma de execução do projeto</w:t>
+      </w:r>
+    </w:p>
     <w:tbl>
       <w:tblPr>
         <w:tblStyle w:val="TableGrid"/>
@@ -4351,7 +3902,6 @@
         <w:tc>
           <w:tcPr>
             <w:tcW w:type="dxa" w:w="4535"/>
-            <w:shd w:fill="D9EAF7"/>
             <w:vAlign w:val="center"/>
           </w:tcPr>
           <w:p>
@@ -4371,7 +3921,6 @@
         <w:tc>
           <w:tcPr>
             <w:tcW w:type="dxa" w:w="1417"/>
-            <w:shd w:fill="D9EAF7"/>
             <w:vAlign w:val="center"/>
           </w:tcPr>
           <w:p>
@@ -4391,7 +3940,6 @@
         <w:tc>
           <w:tcPr>
             <w:tcW w:type="dxa" w:w="1417"/>
-            <w:shd w:fill="D9EAF7"/>
             <w:vAlign w:val="center"/>
           </w:tcPr>
           <w:p>
@@ -4411,7 +3959,6 @@
         <w:tc>
           <w:tcPr>
             <w:tcW w:type="dxa" w:w="1417"/>
-            <w:shd w:fill="D9EAF7"/>
             <w:vAlign w:val="center"/>
           </w:tcPr>
           <w:p>
@@ -4933,6 +4480,25 @@
         <w:t>A aplicação adota arquitetura cliente-serviço. O cliente é composto por index.html, style.css, script.js e supabase.js, publicados no GitHub Pages. Bibliotecas externas são carregadas por CDN. O cliente se comunica por HTTPS com os serviços do Supabase. Não existe servidor Node.js de produção neste repositório.</w:t>
       </w:r>
     </w:p>
+    <w:p>
+      <w:pPr>
+        <w:spacing w:before="240" w:after="60"/>
+        <w:ind w:firstLine="0"/>
+        <w:jc w:val="center"/>
+      </w:pPr>
+      <w:r>
+        <w:rPr>
+          <w:b w:val="0"/>
+          <w:i w:val="0"/>
+        </w:rPr>
+      </w:r>
+      <w:r>
+        <w:rPr>
+          <w:b/>
+        </w:rPr>
+        <w:t>Quadro 5 – Camadas da arquitetura do sistema</w:t>
+      </w:r>
+    </w:p>
     <w:tbl>
       <w:tblPr>
         <w:tblStyle w:val="TableGrid"/>
@@ -4949,7 +4515,6 @@
         <w:tc>
           <w:tcPr>
             <w:tcW w:type="dxa" w:w="1984"/>
-            <w:shd w:fill="D9EAF7"/>
             <w:vAlign w:val="center"/>
           </w:tcPr>
           <w:p>
@@ -4969,7 +4534,6 @@
         <w:tc>
           <w:tcPr>
             <w:tcW w:type="dxa" w:w="2835"/>
-            <w:shd w:fill="D9EAF7"/>
             <w:vAlign w:val="center"/>
           </w:tcPr>
           <w:p>
@@ -4989,7 +4553,6 @@
         <w:tc>
           <w:tcPr>
             <w:tcW w:type="dxa" w:w="4535"/>
-            <w:shd w:fill="D9EAF7"/>
             <w:vAlign w:val="center"/>
           </w:tcPr>
           <w:p>
@@ -5678,6 +5241,25 @@
         <w:t>5.6 MODELO DE DADOS</w:t>
       </w:r>
     </w:p>
+    <w:p>
+      <w:pPr>
+        <w:spacing w:before="240" w:after="60"/>
+        <w:ind w:firstLine="0"/>
+        <w:jc w:val="center"/>
+      </w:pPr>
+      <w:r>
+        <w:rPr>
+          <w:b w:val="0"/>
+          <w:i w:val="0"/>
+        </w:rPr>
+      </w:r>
+      <w:r>
+        <w:rPr>
+          <w:b/>
+        </w:rPr>
+        <w:t>Quadro 6 – Entidades do banco de dados</w:t>
+      </w:r>
+    </w:p>
     <w:tbl>
       <w:tblPr>
         <w:tblStyle w:val="TableGrid"/>
@@ -5694,7 +5276,6 @@
         <w:tc>
           <w:tcPr>
             <w:tcW w:type="dxa" w:w="2268"/>
-            <w:shd w:fill="D9EAF7"/>
             <w:vAlign w:val="center"/>
           </w:tcPr>
           <w:p>
@@ -5714,7 +5295,6 @@
         <w:tc>
           <w:tcPr>
             <w:tcW w:type="dxa" w:w="4252"/>
-            <w:shd w:fill="D9EAF7"/>
             <w:vAlign w:val="center"/>
           </w:tcPr>
           <w:p>
@@ -5734,7 +5314,6 @@
         <w:tc>
           <w:tcPr>
             <w:tcW w:type="dxa" w:w="2835"/>
-            <w:shd w:fill="D9EAF7"/>
             <w:vAlign w:val="center"/>
           </w:tcPr>
           <w:p>
@@ -6395,6 +5974,25 @@
         <w:t>6.2 RESULTADOS AUTOMATIZADOS</w:t>
       </w:r>
     </w:p>
+    <w:p>
+      <w:pPr>
+        <w:spacing w:before="240" w:after="60"/>
+        <w:ind w:firstLine="0"/>
+        <w:jc w:val="center"/>
+      </w:pPr>
+      <w:r>
+        <w:rPr>
+          <w:b w:val="0"/>
+          <w:i w:val="0"/>
+        </w:rPr>
+      </w:r>
+      <w:r>
+        <w:rPr>
+          <w:b/>
+        </w:rPr>
+        <w:t>Quadro 7 – Resultados dos testes automatizados</w:t>
+      </w:r>
+    </w:p>
     <w:tbl>
       <w:tblPr>
         <w:tblStyle w:val="TableGrid"/>
@@ -6412,7 +6010,6 @@
         <w:tc>
           <w:tcPr>
             <w:tcW w:type="dxa" w:w="2268"/>
-            <w:shd w:fill="D9EAF7"/>
             <w:vAlign w:val="center"/>
           </w:tcPr>
           <w:p>
@@ -6432,7 +6029,6 @@
         <w:tc>
           <w:tcPr>
             <w:tcW w:type="dxa" w:w="3969"/>
-            <w:shd w:fill="D9EAF7"/>
             <w:vAlign w:val="center"/>
           </w:tcPr>
           <w:p>
@@ -6452,7 +6048,6 @@
         <w:tc>
           <w:tcPr>
             <w:tcW w:type="dxa" w:w="1701"/>
-            <w:shd w:fill="D9EAF7"/>
             <w:vAlign w:val="center"/>
           </w:tcPr>
           <w:p>
@@ -6472,7 +6067,6 @@
         <w:tc>
           <w:tcPr>
             <w:tcW w:type="dxa" w:w="1701"/>
-            <w:shd w:fill="D9EAF7"/>
             <w:vAlign w:val="center"/>
           </w:tcPr>
           <w:p>
@@ -7272,7 +6866,7 @@
         <w:keepNext/>
       </w:pPr>
       <w:r>
-        <w:t>8 CONSIDERAÇÕES FINAIS</w:t>
+        <w:t>8 CONCLUSÃO</w:t>
       </w:r>
     </w:p>
     <w:p>
@@ -7824,6 +7418,25 @@
       </w:pPr>
       <w:r>
         <w:t>APÊNDICE B — ROTEIRO DE VALIDAÇÃO MANUAL</w:t>
+      </w:r>
+    </w:p>
+    <w:p>
+      <w:pPr>
+        <w:spacing w:before="240" w:after="60"/>
+        <w:ind w:firstLine="0"/>
+        <w:jc w:val="center"/>
+      </w:pPr>
+      <w:r>
+        <w:rPr>
+          <w:b w:val="0"/>
+          <w:i w:val="0"/>
+        </w:rPr>
+      </w:r>
+      <w:r>
+        <w:rPr>
+          <w:b/>
+        </w:rPr>
+        <w:t>Quadro 8 – Roteiro de validação manual</w:t>
       </w:r>
     </w:p>
     <w:tbl>
@@ -7842,7 +7455,6 @@
         <w:tc>
           <w:tcPr>
             <w:tcW w:type="dxa" w:w="850"/>
-            <w:shd w:fill="D9EAF7"/>
             <w:vAlign w:val="center"/>
           </w:tcPr>
           <w:p>
@@ -7862,7 +7474,6 @@
         <w:tc>
           <w:tcPr>
             <w:tcW w:type="dxa" w:w="6236"/>
-            <w:shd w:fill="D9EAF7"/>
             <w:vAlign w:val="center"/>
           </w:tcPr>
           <w:p>
@@ -7882,7 +7493,6 @@
         <w:tc>
           <w:tcPr>
             <w:tcW w:type="dxa" w:w="2268"/>
-            <w:shd w:fill="D9EAF7"/>
             <w:vAlign w:val="center"/>
           </w:tcPr>
           <w:p>
@@ -8978,7 +8588,7 @@
     </w:pPr>
     <w:rPr>
       <w:rFonts w:asciiTheme="majorHAnsi" w:eastAsiaTheme="majorEastAsia" w:hAnsiTheme="majorHAnsi" w:cstheme="majorBidi" w:ascii="Arial" w:hAnsi="Arial" w:eastAsia="Arial"/>
-      <w:b/>
+      <w:b w:val="0"/>
       <w:bCs/>
       <w:color w:val="4F81BD" w:themeColor="accent1"/>
       <w:sz w:val="24"/>
@@ -20619,6 +20229,20 @@
     </w:pPr>
     <w:rPr>
       <w:rFonts w:ascii="Arial" w:hAnsi="Arial"/>
+      <w:sz w:val="24"/>
+    </w:rPr>
+  </w:style>
+  <w:style w:type="paragraph" w:customStyle="1" w:styleId="PreTextual">
+    <w:name w:val="PreTextual"/>
+    <w:pPr>
+      <w:pageBreakBefore/>
+      <w:spacing w:after="480"/>
+      <w:ind w:firstLine="0"/>
+      <w:jc w:val="center"/>
+    </w:pPr>
+    <w:rPr>
+      <w:rFonts w:ascii="Arial" w:hAnsi="Arial" w:eastAsia="Arial"/>
+      <w:b/>
       <w:sz w:val="24"/>
     </w:rPr>
   </w:style>

</xml_diff>

<commit_message>
fix: exibe sumário preenchido no documento
Co-authored-by: arena-agent <297053741+arena-agent@users.noreply.github.com>
</commit_message>
<xml_diff>
--- a/docs/TCC-Pratica-dev-2.0-editavel.docx
+++ b/docs/TCC-Pratica-dev-2.0-editavel.docx
@@ -1618,16 +1618,1827 @@
     </w:p>
     <w:p>
       <w:pPr>
-        <w:spacing w:before="0" w:after="0"/>
-        <w:ind w:firstLine="0"/>
-      </w:pPr>
-      <w:r>
-        <w:rPr>
+        <w:pStyle w:val="Semrecuo"/>
+        <w:tabs>
+          <w:tab w:pos="8787" w:val="right" w:leader="dot"/>
+        </w:tabs>
+        <w:spacing w:line="240" w:lineRule="auto" w:after="60"/>
+        <w:ind w:left="0" w:firstLine="0"/>
+      </w:pPr>
+      <w:r>
+        <w:rPr>
+          <w:rFonts w:ascii="Arial" w:hAnsi="Arial"/>
+          <w:b/>
+          <w:sz w:val="20"/>
+        </w:rPr>
+        <w:t>1 INTRODUÇÃO</w:t>
+      </w:r>
+      <w:r>
+        <w:tab/>
+      </w:r>
+      <w:r>
+        <w:rPr>
+          <w:rFonts w:ascii="Arial" w:hAnsi="Arial"/>
+          <w:sz w:val="20"/>
+        </w:rPr>
+        <w:fldChar w:fldCharType="begin" w:dirty="true"/>
+        <w:instrText xml:space="preserve"> PAGEREF _TccToc1 \h </w:instrText>
+        <w:fldChar w:fldCharType="separate"/>
+        <w:t>10</w:t>
+        <w:fldChar w:fldCharType="end"/>
+      </w:r>
+    </w:p>
+    <w:p>
+      <w:pPr>
+        <w:pStyle w:val="Semrecuo"/>
+        <w:tabs>
+          <w:tab w:pos="8787" w:val="right" w:leader="dot"/>
+        </w:tabs>
+        <w:spacing w:line="240" w:lineRule="auto" w:after="60"/>
+        <w:ind w:left="425" w:firstLine="0"/>
+      </w:pPr>
+      <w:r>
+        <w:rPr>
+          <w:rFonts w:ascii="Arial" w:hAnsi="Arial"/>
           <w:b w:val="0"/>
-          <w:i w:val="0"/>
-        </w:rPr>
-      </w:r>
-      <w:fldSimple w:instr="TOC \o &quot;1-3&quot; \h \z \u"/>
+          <w:sz w:val="20"/>
+        </w:rPr>
+        <w:t>1.1 PROBLEMA DE PESQUISA</w:t>
+      </w:r>
+      <w:r>
+        <w:tab/>
+      </w:r>
+      <w:r>
+        <w:rPr>
+          <w:rFonts w:ascii="Arial" w:hAnsi="Arial"/>
+          <w:sz w:val="20"/>
+        </w:rPr>
+        <w:fldChar w:fldCharType="begin" w:dirty="true"/>
+        <w:instrText xml:space="preserve"> PAGEREF _TccToc2 \h </w:instrText>
+        <w:fldChar w:fldCharType="separate"/>
+        <w:t>10</w:t>
+        <w:fldChar w:fldCharType="end"/>
+      </w:r>
+    </w:p>
+    <w:p>
+      <w:pPr>
+        <w:pStyle w:val="Semrecuo"/>
+        <w:tabs>
+          <w:tab w:pos="8787" w:val="right" w:leader="dot"/>
+        </w:tabs>
+        <w:spacing w:line="240" w:lineRule="auto" w:after="60"/>
+        <w:ind w:left="425" w:firstLine="0"/>
+      </w:pPr>
+      <w:r>
+        <w:rPr>
+          <w:rFonts w:ascii="Arial" w:hAnsi="Arial"/>
+          <w:b w:val="0"/>
+          <w:sz w:val="20"/>
+        </w:rPr>
+        <w:t>1.2 HIPÓTESE</w:t>
+      </w:r>
+      <w:r>
+        <w:tab/>
+      </w:r>
+      <w:r>
+        <w:rPr>
+          <w:rFonts w:ascii="Arial" w:hAnsi="Arial"/>
+          <w:sz w:val="20"/>
+        </w:rPr>
+        <w:fldChar w:fldCharType="begin" w:dirty="true"/>
+        <w:instrText xml:space="preserve"> PAGEREF _TccToc3 \h </w:instrText>
+        <w:fldChar w:fldCharType="separate"/>
+        <w:t>10</w:t>
+        <w:fldChar w:fldCharType="end"/>
+      </w:r>
+    </w:p>
+    <w:p>
+      <w:pPr>
+        <w:pStyle w:val="Semrecuo"/>
+        <w:tabs>
+          <w:tab w:pos="8787" w:val="right" w:leader="dot"/>
+        </w:tabs>
+        <w:spacing w:line="240" w:lineRule="auto" w:after="60"/>
+        <w:ind w:left="425" w:firstLine="0"/>
+      </w:pPr>
+      <w:r>
+        <w:rPr>
+          <w:rFonts w:ascii="Arial" w:hAnsi="Arial"/>
+          <w:b w:val="0"/>
+          <w:sz w:val="20"/>
+        </w:rPr>
+        <w:t>1.3 OBJETIVO GERAL</w:t>
+      </w:r>
+      <w:r>
+        <w:tab/>
+      </w:r>
+      <w:r>
+        <w:rPr>
+          <w:rFonts w:ascii="Arial" w:hAnsi="Arial"/>
+          <w:sz w:val="20"/>
+        </w:rPr>
+        <w:fldChar w:fldCharType="begin" w:dirty="true"/>
+        <w:instrText xml:space="preserve"> PAGEREF _TccToc4 \h </w:instrText>
+        <w:fldChar w:fldCharType="separate"/>
+        <w:t>10</w:t>
+        <w:fldChar w:fldCharType="end"/>
+      </w:r>
+    </w:p>
+    <w:p>
+      <w:pPr>
+        <w:pStyle w:val="Semrecuo"/>
+        <w:tabs>
+          <w:tab w:pos="8787" w:val="right" w:leader="dot"/>
+        </w:tabs>
+        <w:spacing w:line="240" w:lineRule="auto" w:after="60"/>
+        <w:ind w:left="425" w:firstLine="0"/>
+      </w:pPr>
+      <w:r>
+        <w:rPr>
+          <w:rFonts w:ascii="Arial" w:hAnsi="Arial"/>
+          <w:b w:val="0"/>
+          <w:sz w:val="20"/>
+        </w:rPr>
+        <w:t>1.4 OBJETIVOS ESPECÍFICOS</w:t>
+      </w:r>
+      <w:r>
+        <w:tab/>
+      </w:r>
+      <w:r>
+        <w:rPr>
+          <w:rFonts w:ascii="Arial" w:hAnsi="Arial"/>
+          <w:sz w:val="20"/>
+        </w:rPr>
+        <w:fldChar w:fldCharType="begin" w:dirty="true"/>
+        <w:instrText xml:space="preserve"> PAGEREF _TccToc5 \h </w:instrText>
+        <w:fldChar w:fldCharType="separate"/>
+        <w:t>11</w:t>
+        <w:fldChar w:fldCharType="end"/>
+      </w:r>
+    </w:p>
+    <w:p>
+      <w:pPr>
+        <w:pStyle w:val="Semrecuo"/>
+        <w:tabs>
+          <w:tab w:pos="8787" w:val="right" w:leader="dot"/>
+        </w:tabs>
+        <w:spacing w:line="240" w:lineRule="auto" w:after="60"/>
+        <w:ind w:left="425" w:firstLine="0"/>
+      </w:pPr>
+      <w:r>
+        <w:rPr>
+          <w:rFonts w:ascii="Arial" w:hAnsi="Arial"/>
+          <w:b w:val="0"/>
+          <w:sz w:val="20"/>
+        </w:rPr>
+        <w:t>1.5 JUSTIFICATIVA</w:t>
+      </w:r>
+      <w:r>
+        <w:tab/>
+      </w:r>
+      <w:r>
+        <w:rPr>
+          <w:rFonts w:ascii="Arial" w:hAnsi="Arial"/>
+          <w:sz w:val="20"/>
+        </w:rPr>
+        <w:fldChar w:fldCharType="begin" w:dirty="true"/>
+        <w:instrText xml:space="preserve"> PAGEREF _TccToc6 \h </w:instrText>
+        <w:fldChar w:fldCharType="separate"/>
+        <w:t>11</w:t>
+        <w:fldChar w:fldCharType="end"/>
+      </w:r>
+    </w:p>
+    <w:p>
+      <w:pPr>
+        <w:pStyle w:val="Semrecuo"/>
+        <w:tabs>
+          <w:tab w:pos="8787" w:val="right" w:leader="dot"/>
+        </w:tabs>
+        <w:spacing w:line="240" w:lineRule="auto" w:after="60"/>
+        <w:ind w:left="425" w:firstLine="0"/>
+      </w:pPr>
+      <w:r>
+        <w:rPr>
+          <w:rFonts w:ascii="Arial" w:hAnsi="Arial"/>
+          <w:b w:val="0"/>
+          <w:sz w:val="20"/>
+        </w:rPr>
+        <w:t>1.6 DELIMITAÇÃO</w:t>
+      </w:r>
+      <w:r>
+        <w:tab/>
+      </w:r>
+      <w:r>
+        <w:rPr>
+          <w:rFonts w:ascii="Arial" w:hAnsi="Arial"/>
+          <w:sz w:val="20"/>
+        </w:rPr>
+        <w:fldChar w:fldCharType="begin" w:dirty="true"/>
+        <w:instrText xml:space="preserve"> PAGEREF _TccToc7 \h </w:instrText>
+        <w:fldChar w:fldCharType="separate"/>
+        <w:t>11</w:t>
+        <w:fldChar w:fldCharType="end"/>
+      </w:r>
+    </w:p>
+    <w:p>
+      <w:pPr>
+        <w:pStyle w:val="Semrecuo"/>
+        <w:tabs>
+          <w:tab w:pos="8787" w:val="right" w:leader="dot"/>
+        </w:tabs>
+        <w:spacing w:line="240" w:lineRule="auto" w:after="60"/>
+        <w:ind w:left="425" w:firstLine="0"/>
+      </w:pPr>
+      <w:r>
+        <w:rPr>
+          <w:rFonts w:ascii="Arial" w:hAnsi="Arial"/>
+          <w:b w:val="0"/>
+          <w:sz w:val="20"/>
+        </w:rPr>
+        <w:t>1.7 ESTRUTURA DO TRABALHO</w:t>
+      </w:r>
+      <w:r>
+        <w:tab/>
+      </w:r>
+      <w:r>
+        <w:rPr>
+          <w:rFonts w:ascii="Arial" w:hAnsi="Arial"/>
+          <w:sz w:val="20"/>
+        </w:rPr>
+        <w:fldChar w:fldCharType="begin" w:dirty="true"/>
+        <w:instrText xml:space="preserve"> PAGEREF _TccToc8 \h </w:instrText>
+        <w:fldChar w:fldCharType="separate"/>
+        <w:t>12</w:t>
+        <w:fldChar w:fldCharType="end"/>
+      </w:r>
+    </w:p>
+    <w:p>
+      <w:pPr>
+        <w:pStyle w:val="Semrecuo"/>
+        <w:tabs>
+          <w:tab w:pos="8787" w:val="right" w:leader="dot"/>
+        </w:tabs>
+        <w:spacing w:line="240" w:lineRule="auto" w:after="60"/>
+        <w:ind w:left="0" w:firstLine="0"/>
+      </w:pPr>
+      <w:r>
+        <w:rPr>
+          <w:rFonts w:ascii="Arial" w:hAnsi="Arial"/>
+          <w:b/>
+          <w:sz w:val="20"/>
+        </w:rPr>
+        <w:t>2 FUNDAMENTAÇÃO TEÓRICA</w:t>
+      </w:r>
+      <w:r>
+        <w:tab/>
+      </w:r>
+      <w:r>
+        <w:rPr>
+          <w:rFonts w:ascii="Arial" w:hAnsi="Arial"/>
+          <w:sz w:val="20"/>
+        </w:rPr>
+        <w:fldChar w:fldCharType="begin" w:dirty="true"/>
+        <w:instrText xml:space="preserve"> PAGEREF _TccToc9 \h </w:instrText>
+        <w:fldChar w:fldCharType="separate"/>
+        <w:t>13</w:t>
+        <w:fldChar w:fldCharType="end"/>
+      </w:r>
+    </w:p>
+    <w:p>
+      <w:pPr>
+        <w:pStyle w:val="Semrecuo"/>
+        <w:tabs>
+          <w:tab w:pos="8787" w:val="right" w:leader="dot"/>
+        </w:tabs>
+        <w:spacing w:line="240" w:lineRule="auto" w:after="60"/>
+        <w:ind w:left="425" w:firstLine="0"/>
+      </w:pPr>
+      <w:r>
+        <w:rPr>
+          <w:rFonts w:ascii="Arial" w:hAnsi="Arial"/>
+          <w:b w:val="0"/>
+          <w:sz w:val="20"/>
+        </w:rPr>
+        <w:t>2.1 EDUCAÇÃO TECNOLÓGICA E APRENDIZAGEM PRÁTICA</w:t>
+      </w:r>
+      <w:r>
+        <w:tab/>
+      </w:r>
+      <w:r>
+        <w:rPr>
+          <w:rFonts w:ascii="Arial" w:hAnsi="Arial"/>
+          <w:sz w:val="20"/>
+        </w:rPr>
+        <w:fldChar w:fldCharType="begin" w:dirty="true"/>
+        <w:instrText xml:space="preserve"> PAGEREF _TccToc10 \h </w:instrText>
+        <w:fldChar w:fldCharType="separate"/>
+        <w:t>13</w:t>
+        <w:fldChar w:fldCharType="end"/>
+      </w:r>
+    </w:p>
+    <w:p>
+      <w:pPr>
+        <w:pStyle w:val="Semrecuo"/>
+        <w:tabs>
+          <w:tab w:pos="8787" w:val="right" w:leader="dot"/>
+        </w:tabs>
+        <w:spacing w:line="240" w:lineRule="auto" w:after="60"/>
+        <w:ind w:left="425" w:firstLine="0"/>
+      </w:pPr>
+      <w:r>
+        <w:rPr>
+          <w:rFonts w:ascii="Arial" w:hAnsi="Arial"/>
+          <w:b w:val="0"/>
+          <w:sz w:val="20"/>
+        </w:rPr>
+        <w:t>2.2 GAMIFICAÇÃO</w:t>
+      </w:r>
+      <w:r>
+        <w:tab/>
+      </w:r>
+      <w:r>
+        <w:rPr>
+          <w:rFonts w:ascii="Arial" w:hAnsi="Arial"/>
+          <w:sz w:val="20"/>
+        </w:rPr>
+        <w:fldChar w:fldCharType="begin" w:dirty="true"/>
+        <w:instrText xml:space="preserve"> PAGEREF _TccToc11 \h </w:instrText>
+        <w:fldChar w:fldCharType="separate"/>
+        <w:t>13</w:t>
+        <w:fldChar w:fldCharType="end"/>
+      </w:r>
+    </w:p>
+    <w:p>
+      <w:pPr>
+        <w:pStyle w:val="Semrecuo"/>
+        <w:tabs>
+          <w:tab w:pos="8787" w:val="right" w:leader="dot"/>
+        </w:tabs>
+        <w:spacing w:line="240" w:lineRule="auto" w:after="60"/>
+        <w:ind w:left="425" w:firstLine="0"/>
+      </w:pPr>
+      <w:r>
+        <w:rPr>
+          <w:rFonts w:ascii="Arial" w:hAnsi="Arial"/>
+          <w:b w:val="0"/>
+          <w:sz w:val="20"/>
+        </w:rPr>
+        <w:t>2.3 EXPERIÊNCIA DO USUÁRIO E RESPONSIVIDADE</w:t>
+      </w:r>
+      <w:r>
+        <w:tab/>
+      </w:r>
+      <w:r>
+        <w:rPr>
+          <w:rFonts w:ascii="Arial" w:hAnsi="Arial"/>
+          <w:sz w:val="20"/>
+        </w:rPr>
+        <w:fldChar w:fldCharType="begin" w:dirty="true"/>
+        <w:instrText xml:space="preserve"> PAGEREF _TccToc12 \h </w:instrText>
+        <w:fldChar w:fldCharType="separate"/>
+        <w:t>13</w:t>
+        <w:fldChar w:fldCharType="end"/>
+      </w:r>
+    </w:p>
+    <w:p>
+      <w:pPr>
+        <w:pStyle w:val="Semrecuo"/>
+        <w:tabs>
+          <w:tab w:pos="8787" w:val="right" w:leader="dot"/>
+        </w:tabs>
+        <w:spacing w:line="240" w:lineRule="auto" w:after="60"/>
+        <w:ind w:left="425" w:firstLine="0"/>
+      </w:pPr>
+      <w:r>
+        <w:rPr>
+          <w:rFonts w:ascii="Arial" w:hAnsi="Arial"/>
+          <w:b w:val="0"/>
+          <w:sz w:val="20"/>
+        </w:rPr>
+        <w:t>2.4 APLICAÇÕES WEB DE PÁGINA ÚNICA</w:t>
+      </w:r>
+      <w:r>
+        <w:tab/>
+      </w:r>
+      <w:r>
+        <w:rPr>
+          <w:rFonts w:ascii="Arial" w:hAnsi="Arial"/>
+          <w:sz w:val="20"/>
+        </w:rPr>
+        <w:fldChar w:fldCharType="begin" w:dirty="true"/>
+        <w:instrText xml:space="preserve"> PAGEREF _TccToc13 \h </w:instrText>
+        <w:fldChar w:fldCharType="separate"/>
+        <w:t>14</w:t>
+        <w:fldChar w:fldCharType="end"/>
+      </w:r>
+    </w:p>
+    <w:p>
+      <w:pPr>
+        <w:pStyle w:val="Semrecuo"/>
+        <w:tabs>
+          <w:tab w:pos="8787" w:val="right" w:leader="dot"/>
+        </w:tabs>
+        <w:spacing w:line="240" w:lineRule="auto" w:after="60"/>
+        <w:ind w:left="425" w:firstLine="0"/>
+      </w:pPr>
+      <w:r>
+        <w:rPr>
+          <w:rFonts w:ascii="Arial" w:hAnsi="Arial"/>
+          <w:b w:val="0"/>
+          <w:sz w:val="20"/>
+        </w:rPr>
+        <w:t>2.5 BANCO DE DADOS, AUTENTICAÇÃO E AUTORIZAÇÃO</w:t>
+      </w:r>
+      <w:r>
+        <w:tab/>
+      </w:r>
+      <w:r>
+        <w:rPr>
+          <w:rFonts w:ascii="Arial" w:hAnsi="Arial"/>
+          <w:sz w:val="20"/>
+        </w:rPr>
+        <w:fldChar w:fldCharType="begin" w:dirty="true"/>
+        <w:instrText xml:space="preserve"> PAGEREF _TccToc14 \h </w:instrText>
+        <w:fldChar w:fldCharType="separate"/>
+        <w:t>14</w:t>
+        <w:fldChar w:fldCharType="end"/>
+      </w:r>
+    </w:p>
+    <w:p>
+      <w:pPr>
+        <w:pStyle w:val="Semrecuo"/>
+        <w:tabs>
+          <w:tab w:pos="8787" w:val="right" w:leader="dot"/>
+        </w:tabs>
+        <w:spacing w:line="240" w:lineRule="auto" w:after="60"/>
+        <w:ind w:left="425" w:firstLine="0"/>
+      </w:pPr>
+      <w:r>
+        <w:rPr>
+          <w:rFonts w:ascii="Arial" w:hAnsi="Arial"/>
+          <w:b w:val="0"/>
+          <w:sz w:val="20"/>
+        </w:rPr>
+        <w:t>2.6 PORTFÓLIO DIGITAL E PRIVACIDADE</w:t>
+      </w:r>
+      <w:r>
+        <w:tab/>
+      </w:r>
+      <w:r>
+        <w:rPr>
+          <w:rFonts w:ascii="Arial" w:hAnsi="Arial"/>
+          <w:sz w:val="20"/>
+        </w:rPr>
+        <w:fldChar w:fldCharType="begin" w:dirty="true"/>
+        <w:instrText xml:space="preserve"> PAGEREF _TccToc15 \h </w:instrText>
+        <w:fldChar w:fldCharType="separate"/>
+        <w:t>14</w:t>
+        <w:fldChar w:fldCharType="end"/>
+      </w:r>
+    </w:p>
+    <w:p>
+      <w:pPr>
+        <w:pStyle w:val="Semrecuo"/>
+        <w:tabs>
+          <w:tab w:pos="8787" w:val="right" w:leader="dot"/>
+        </w:tabs>
+        <w:spacing w:line="240" w:lineRule="auto" w:after="60"/>
+        <w:ind w:left="0" w:firstLine="0"/>
+      </w:pPr>
+      <w:r>
+        <w:rPr>
+          <w:rFonts w:ascii="Arial" w:hAnsi="Arial"/>
+          <w:b/>
+          <w:sz w:val="20"/>
+        </w:rPr>
+        <w:t>3 METODOLOGIA</w:t>
+      </w:r>
+      <w:r>
+        <w:tab/>
+      </w:r>
+      <w:r>
+        <w:rPr>
+          <w:rFonts w:ascii="Arial" w:hAnsi="Arial"/>
+          <w:sz w:val="20"/>
+        </w:rPr>
+        <w:fldChar w:fldCharType="begin" w:dirty="true"/>
+        <w:instrText xml:space="preserve"> PAGEREF _TccToc16 \h </w:instrText>
+        <w:fldChar w:fldCharType="separate"/>
+        <w:t>16</w:t>
+        <w:fldChar w:fldCharType="end"/>
+      </w:r>
+    </w:p>
+    <w:p>
+      <w:pPr>
+        <w:pStyle w:val="Semrecuo"/>
+        <w:tabs>
+          <w:tab w:pos="8787" w:val="right" w:leader="dot"/>
+        </w:tabs>
+        <w:spacing w:line="240" w:lineRule="auto" w:after="60"/>
+        <w:ind w:left="425" w:firstLine="0"/>
+      </w:pPr>
+      <w:r>
+        <w:rPr>
+          <w:rFonts w:ascii="Arial" w:hAnsi="Arial"/>
+          <w:b w:val="0"/>
+          <w:sz w:val="20"/>
+        </w:rPr>
+        <w:t>3.1 NATUREZA DA PESQUISA</w:t>
+      </w:r>
+      <w:r>
+        <w:tab/>
+      </w:r>
+      <w:r>
+        <w:rPr>
+          <w:rFonts w:ascii="Arial" w:hAnsi="Arial"/>
+          <w:sz w:val="20"/>
+        </w:rPr>
+        <w:fldChar w:fldCharType="begin" w:dirty="true"/>
+        <w:instrText xml:space="preserve"> PAGEREF _TccToc17 \h </w:instrText>
+        <w:fldChar w:fldCharType="separate"/>
+        <w:t>16</w:t>
+        <w:fldChar w:fldCharType="end"/>
+      </w:r>
+    </w:p>
+    <w:p>
+      <w:pPr>
+        <w:pStyle w:val="Semrecuo"/>
+        <w:tabs>
+          <w:tab w:pos="8787" w:val="right" w:leader="dot"/>
+        </w:tabs>
+        <w:spacing w:line="240" w:lineRule="auto" w:after="60"/>
+        <w:ind w:left="425" w:firstLine="0"/>
+      </w:pPr>
+      <w:r>
+        <w:rPr>
+          <w:rFonts w:ascii="Arial" w:hAnsi="Arial"/>
+          <w:b w:val="0"/>
+          <w:sz w:val="20"/>
+        </w:rPr>
+        <w:t>3.2 PROCESSO DE DESENVOLVIMENTO</w:t>
+      </w:r>
+      <w:r>
+        <w:tab/>
+      </w:r>
+      <w:r>
+        <w:rPr>
+          <w:rFonts w:ascii="Arial" w:hAnsi="Arial"/>
+          <w:sz w:val="20"/>
+        </w:rPr>
+        <w:fldChar w:fldCharType="begin" w:dirty="true"/>
+        <w:instrText xml:space="preserve"> PAGEREF _TccToc18 \h </w:instrText>
+        <w:fldChar w:fldCharType="separate"/>
+        <w:t>16</w:t>
+        <w:fldChar w:fldCharType="end"/>
+      </w:r>
+    </w:p>
+    <w:p>
+      <w:pPr>
+        <w:pStyle w:val="Semrecuo"/>
+        <w:tabs>
+          <w:tab w:pos="8787" w:val="right" w:leader="dot"/>
+        </w:tabs>
+        <w:spacing w:line="240" w:lineRule="auto" w:after="60"/>
+        <w:ind w:left="425" w:firstLine="0"/>
+      </w:pPr>
+      <w:r>
+        <w:rPr>
+          <w:rFonts w:ascii="Arial" w:hAnsi="Arial"/>
+          <w:b w:val="0"/>
+          <w:sz w:val="20"/>
+        </w:rPr>
+        <w:t>3.3 COLETA E ANÁLISE DE DADOS</w:t>
+      </w:r>
+      <w:r>
+        <w:tab/>
+      </w:r>
+      <w:r>
+        <w:rPr>
+          <w:rFonts w:ascii="Arial" w:hAnsi="Arial"/>
+          <w:sz w:val="20"/>
+        </w:rPr>
+        <w:fldChar w:fldCharType="begin" w:dirty="true"/>
+        <w:instrText xml:space="preserve"> PAGEREF _TccToc19 \h </w:instrText>
+        <w:fldChar w:fldCharType="separate"/>
+        <w:t>16</w:t>
+        <w:fldChar w:fldCharType="end"/>
+      </w:r>
+    </w:p>
+    <w:p>
+      <w:pPr>
+        <w:pStyle w:val="Semrecuo"/>
+        <w:tabs>
+          <w:tab w:pos="8787" w:val="right" w:leader="dot"/>
+        </w:tabs>
+        <w:spacing w:line="240" w:lineRule="auto" w:after="60"/>
+        <w:ind w:left="425" w:firstLine="0"/>
+      </w:pPr>
+      <w:r>
+        <w:rPr>
+          <w:rFonts w:ascii="Arial" w:hAnsi="Arial"/>
+          <w:b w:val="0"/>
+          <w:sz w:val="20"/>
+        </w:rPr>
+        <w:t>3.4 FERRAMENTAS</w:t>
+      </w:r>
+      <w:r>
+        <w:tab/>
+      </w:r>
+      <w:r>
+        <w:rPr>
+          <w:rFonts w:ascii="Arial" w:hAnsi="Arial"/>
+          <w:sz w:val="20"/>
+        </w:rPr>
+        <w:fldChar w:fldCharType="begin" w:dirty="true"/>
+        <w:instrText xml:space="preserve"> PAGEREF _TccToc20 \h </w:instrText>
+        <w:fldChar w:fldCharType="separate"/>
+        <w:t>17</w:t>
+        <w:fldChar w:fldCharType="end"/>
+      </w:r>
+    </w:p>
+    <w:p>
+      <w:pPr>
+        <w:pStyle w:val="Semrecuo"/>
+        <w:tabs>
+          <w:tab w:pos="8787" w:val="right" w:leader="dot"/>
+        </w:tabs>
+        <w:spacing w:line="240" w:lineRule="auto" w:after="60"/>
+        <w:ind w:left="425" w:firstLine="0"/>
+      </w:pPr>
+      <w:r>
+        <w:rPr>
+          <w:rFonts w:ascii="Arial" w:hAnsi="Arial"/>
+          <w:b w:val="0"/>
+          <w:sz w:val="20"/>
+        </w:rPr>
+        <w:t>3.5 CRITÉRIOS DE VALIDAÇÃO</w:t>
+      </w:r>
+      <w:r>
+        <w:tab/>
+      </w:r>
+      <w:r>
+        <w:rPr>
+          <w:rFonts w:ascii="Arial" w:hAnsi="Arial"/>
+          <w:sz w:val="20"/>
+        </w:rPr>
+        <w:fldChar w:fldCharType="begin" w:dirty="true"/>
+        <w:instrText xml:space="preserve"> PAGEREF _TccToc21 \h </w:instrText>
+        <w:fldChar w:fldCharType="separate"/>
+        <w:t>17</w:t>
+        <w:fldChar w:fldCharType="end"/>
+      </w:r>
+    </w:p>
+    <w:p>
+      <w:pPr>
+        <w:pStyle w:val="Semrecuo"/>
+        <w:tabs>
+          <w:tab w:pos="8787" w:val="right" w:leader="dot"/>
+        </w:tabs>
+        <w:spacing w:line="240" w:lineRule="auto" w:after="60"/>
+        <w:ind w:left="0" w:firstLine="0"/>
+      </w:pPr>
+      <w:r>
+        <w:rPr>
+          <w:rFonts w:ascii="Arial" w:hAnsi="Arial"/>
+          <w:b/>
+          <w:sz w:val="20"/>
+        </w:rPr>
+        <w:t>4 LEVANTAMENTO DE REQUISITOS E PLANEJAMENTO</w:t>
+      </w:r>
+      <w:r>
+        <w:tab/>
+      </w:r>
+      <w:r>
+        <w:rPr>
+          <w:rFonts w:ascii="Arial" w:hAnsi="Arial"/>
+          <w:sz w:val="20"/>
+        </w:rPr>
+        <w:fldChar w:fldCharType="begin" w:dirty="true"/>
+        <w:instrText xml:space="preserve"> PAGEREF _TccToc22 \h </w:instrText>
+        <w:fldChar w:fldCharType="separate"/>
+        <w:t>19</w:t>
+        <w:fldChar w:fldCharType="end"/>
+      </w:r>
+    </w:p>
+    <w:p>
+      <w:pPr>
+        <w:pStyle w:val="Semrecuo"/>
+        <w:tabs>
+          <w:tab w:pos="8787" w:val="right" w:leader="dot"/>
+        </w:tabs>
+        <w:spacing w:line="240" w:lineRule="auto" w:after="60"/>
+        <w:ind w:left="425" w:firstLine="0"/>
+      </w:pPr>
+      <w:r>
+        <w:rPr>
+          <w:rFonts w:ascii="Arial" w:hAnsi="Arial"/>
+          <w:b w:val="0"/>
+          <w:sz w:val="20"/>
+        </w:rPr>
+        <w:t>4.1 PÚBLICO-ALVO</w:t>
+      </w:r>
+      <w:r>
+        <w:tab/>
+      </w:r>
+      <w:r>
+        <w:rPr>
+          <w:rFonts w:ascii="Arial" w:hAnsi="Arial"/>
+          <w:sz w:val="20"/>
+        </w:rPr>
+        <w:fldChar w:fldCharType="begin" w:dirty="true"/>
+        <w:instrText xml:space="preserve"> PAGEREF _TccToc23 \h </w:instrText>
+        <w:fldChar w:fldCharType="separate"/>
+        <w:t>19</w:t>
+        <w:fldChar w:fldCharType="end"/>
+      </w:r>
+    </w:p>
+    <w:p>
+      <w:pPr>
+        <w:pStyle w:val="Semrecuo"/>
+        <w:tabs>
+          <w:tab w:pos="8787" w:val="right" w:leader="dot"/>
+        </w:tabs>
+        <w:spacing w:line="240" w:lineRule="auto" w:after="60"/>
+        <w:ind w:left="425" w:firstLine="0"/>
+      </w:pPr>
+      <w:r>
+        <w:rPr>
+          <w:rFonts w:ascii="Arial" w:hAnsi="Arial"/>
+          <w:b w:val="0"/>
+          <w:sz w:val="20"/>
+        </w:rPr>
+        <w:t>4.2 REQUISITOS FUNCIONAIS</w:t>
+      </w:r>
+      <w:r>
+        <w:tab/>
+      </w:r>
+      <w:r>
+        <w:rPr>
+          <w:rFonts w:ascii="Arial" w:hAnsi="Arial"/>
+          <w:sz w:val="20"/>
+        </w:rPr>
+        <w:fldChar w:fldCharType="begin" w:dirty="true"/>
+        <w:instrText xml:space="preserve"> PAGEREF _TccToc24 \h </w:instrText>
+        <w:fldChar w:fldCharType="separate"/>
+        <w:t>19</w:t>
+        <w:fldChar w:fldCharType="end"/>
+      </w:r>
+    </w:p>
+    <w:p>
+      <w:pPr>
+        <w:pStyle w:val="Semrecuo"/>
+        <w:tabs>
+          <w:tab w:pos="8787" w:val="right" w:leader="dot"/>
+        </w:tabs>
+        <w:spacing w:line="240" w:lineRule="auto" w:after="60"/>
+        <w:ind w:left="425" w:firstLine="0"/>
+      </w:pPr>
+      <w:r>
+        <w:rPr>
+          <w:rFonts w:ascii="Arial" w:hAnsi="Arial"/>
+          <w:b w:val="0"/>
+          <w:sz w:val="20"/>
+        </w:rPr>
+        <w:t>4.3 REQUISITOS NÃO FUNCIONAIS</w:t>
+      </w:r>
+      <w:r>
+        <w:tab/>
+      </w:r>
+      <w:r>
+        <w:rPr>
+          <w:rFonts w:ascii="Arial" w:hAnsi="Arial"/>
+          <w:sz w:val="20"/>
+        </w:rPr>
+        <w:fldChar w:fldCharType="begin" w:dirty="true"/>
+        <w:instrText xml:space="preserve"> PAGEREF _TccToc25 \h </w:instrText>
+        <w:fldChar w:fldCharType="separate"/>
+        <w:t>19</w:t>
+        <w:fldChar w:fldCharType="end"/>
+      </w:r>
+    </w:p>
+    <w:p>
+      <w:pPr>
+        <w:pStyle w:val="Semrecuo"/>
+        <w:tabs>
+          <w:tab w:pos="8787" w:val="right" w:leader="dot"/>
+        </w:tabs>
+        <w:spacing w:line="240" w:lineRule="auto" w:after="60"/>
+        <w:ind w:left="425" w:firstLine="0"/>
+      </w:pPr>
+      <w:r>
+        <w:rPr>
+          <w:rFonts w:ascii="Arial" w:hAnsi="Arial"/>
+          <w:b w:val="0"/>
+          <w:sz w:val="20"/>
+        </w:rPr>
+        <w:t>4.4 REGRAS DE NEGÓCIO</w:t>
+      </w:r>
+      <w:r>
+        <w:tab/>
+      </w:r>
+      <w:r>
+        <w:rPr>
+          <w:rFonts w:ascii="Arial" w:hAnsi="Arial"/>
+          <w:sz w:val="20"/>
+        </w:rPr>
+        <w:fldChar w:fldCharType="begin" w:dirty="true"/>
+        <w:instrText xml:space="preserve"> PAGEREF _TccToc26 \h </w:instrText>
+        <w:fldChar w:fldCharType="separate"/>
+        <w:t>20</w:t>
+        <w:fldChar w:fldCharType="end"/>
+      </w:r>
+    </w:p>
+    <w:p>
+      <w:pPr>
+        <w:pStyle w:val="Semrecuo"/>
+        <w:tabs>
+          <w:tab w:pos="8787" w:val="right" w:leader="dot"/>
+        </w:tabs>
+        <w:spacing w:line="240" w:lineRule="auto" w:after="60"/>
+        <w:ind w:left="425" w:firstLine="0"/>
+      </w:pPr>
+      <w:r>
+        <w:rPr>
+          <w:rFonts w:ascii="Arial" w:hAnsi="Arial"/>
+          <w:b w:val="0"/>
+          <w:sz w:val="20"/>
+        </w:rPr>
+        <w:t>4.5 CRONOGRAMA</w:t>
+      </w:r>
+      <w:r>
+        <w:tab/>
+      </w:r>
+      <w:r>
+        <w:rPr>
+          <w:rFonts w:ascii="Arial" w:hAnsi="Arial"/>
+          <w:sz w:val="20"/>
+        </w:rPr>
+        <w:fldChar w:fldCharType="begin" w:dirty="true"/>
+        <w:instrText xml:space="preserve"> PAGEREF _TccToc27 \h </w:instrText>
+        <w:fldChar w:fldCharType="separate"/>
+        <w:t>20</w:t>
+        <w:fldChar w:fldCharType="end"/>
+      </w:r>
+    </w:p>
+    <w:p>
+      <w:pPr>
+        <w:pStyle w:val="Semrecuo"/>
+        <w:tabs>
+          <w:tab w:pos="8787" w:val="right" w:leader="dot"/>
+        </w:tabs>
+        <w:spacing w:line="240" w:lineRule="auto" w:after="60"/>
+        <w:ind w:left="0" w:firstLine="0"/>
+      </w:pPr>
+      <w:r>
+        <w:rPr>
+          <w:rFonts w:ascii="Arial" w:hAnsi="Arial"/>
+          <w:b/>
+          <w:sz w:val="20"/>
+        </w:rPr>
+        <w:t>5 DESENVOLVIMENTO DA SOLUÇÃO</w:t>
+      </w:r>
+      <w:r>
+        <w:tab/>
+      </w:r>
+      <w:r>
+        <w:rPr>
+          <w:rFonts w:ascii="Arial" w:hAnsi="Arial"/>
+          <w:sz w:val="20"/>
+        </w:rPr>
+        <w:fldChar w:fldCharType="begin" w:dirty="true"/>
+        <w:instrText xml:space="preserve"> PAGEREF _TccToc28 \h </w:instrText>
+        <w:fldChar w:fldCharType="separate"/>
+        <w:t>23</w:t>
+        <w:fldChar w:fldCharType="end"/>
+      </w:r>
+    </w:p>
+    <w:p>
+      <w:pPr>
+        <w:pStyle w:val="Semrecuo"/>
+        <w:tabs>
+          <w:tab w:pos="8787" w:val="right" w:leader="dot"/>
+        </w:tabs>
+        <w:spacing w:line="240" w:lineRule="auto" w:after="60"/>
+        <w:ind w:left="425" w:firstLine="0"/>
+      </w:pPr>
+      <w:r>
+        <w:rPr>
+          <w:rFonts w:ascii="Arial" w:hAnsi="Arial"/>
+          <w:b w:val="0"/>
+          <w:sz w:val="20"/>
+        </w:rPr>
+        <w:t>5.1 VISÃO GERAL DA ARQUITETURA</w:t>
+      </w:r>
+      <w:r>
+        <w:tab/>
+      </w:r>
+      <w:r>
+        <w:rPr>
+          <w:rFonts w:ascii="Arial" w:hAnsi="Arial"/>
+          <w:sz w:val="20"/>
+        </w:rPr>
+        <w:fldChar w:fldCharType="begin" w:dirty="true"/>
+        <w:instrText xml:space="preserve"> PAGEREF _TccToc29 \h </w:instrText>
+        <w:fldChar w:fldCharType="separate"/>
+        <w:t>23</w:t>
+        <w:fldChar w:fldCharType="end"/>
+      </w:r>
+    </w:p>
+    <w:p>
+      <w:pPr>
+        <w:pStyle w:val="Semrecuo"/>
+        <w:tabs>
+          <w:tab w:pos="8787" w:val="right" w:leader="dot"/>
+        </w:tabs>
+        <w:spacing w:line="240" w:lineRule="auto" w:after="60"/>
+        <w:ind w:left="425" w:firstLine="0"/>
+      </w:pPr>
+      <w:r>
+        <w:rPr>
+          <w:rFonts w:ascii="Arial" w:hAnsi="Arial"/>
+          <w:b w:val="0"/>
+          <w:sz w:val="20"/>
+        </w:rPr>
+        <w:t>5.2 ORGANIZAÇÃO DO FRONTEND</w:t>
+      </w:r>
+      <w:r>
+        <w:tab/>
+      </w:r>
+      <w:r>
+        <w:rPr>
+          <w:rFonts w:ascii="Arial" w:hAnsi="Arial"/>
+          <w:sz w:val="20"/>
+        </w:rPr>
+        <w:fldChar w:fldCharType="begin" w:dirty="true"/>
+        <w:instrText xml:space="preserve"> PAGEREF _TccToc30 \h </w:instrText>
+        <w:fldChar w:fldCharType="separate"/>
+        <w:t>23</w:t>
+        <w:fldChar w:fldCharType="end"/>
+      </w:r>
+    </w:p>
+    <w:p>
+      <w:pPr>
+        <w:pStyle w:val="Semrecuo"/>
+        <w:tabs>
+          <w:tab w:pos="8787" w:val="right" w:leader="dot"/>
+        </w:tabs>
+        <w:spacing w:line="240" w:lineRule="auto" w:after="60"/>
+        <w:ind w:left="425" w:firstLine="0"/>
+      </w:pPr>
+      <w:r>
+        <w:rPr>
+          <w:rFonts w:ascii="Arial" w:hAnsi="Arial"/>
+          <w:b w:val="0"/>
+          <w:sz w:val="20"/>
+        </w:rPr>
+        <w:t>5.3 JORNADA DO ESTUDANTE</w:t>
+      </w:r>
+      <w:r>
+        <w:tab/>
+      </w:r>
+      <w:r>
+        <w:rPr>
+          <w:rFonts w:ascii="Arial" w:hAnsi="Arial"/>
+          <w:sz w:val="20"/>
+        </w:rPr>
+        <w:fldChar w:fldCharType="begin" w:dirty="true"/>
+        <w:instrText xml:space="preserve"> PAGEREF _TccToc31 \h </w:instrText>
+        <w:fldChar w:fldCharType="separate"/>
+        <w:t>23</w:t>
+        <w:fldChar w:fldCharType="end"/>
+      </w:r>
+    </w:p>
+    <w:p>
+      <w:pPr>
+        <w:pStyle w:val="Semrecuo"/>
+        <w:tabs>
+          <w:tab w:pos="8787" w:val="right" w:leader="dot"/>
+        </w:tabs>
+        <w:spacing w:line="240" w:lineRule="auto" w:after="60"/>
+        <w:ind w:left="425" w:firstLine="0"/>
+      </w:pPr>
+      <w:r>
+        <w:rPr>
+          <w:rFonts w:ascii="Arial" w:hAnsi="Arial"/>
+          <w:b w:val="0"/>
+          <w:sz w:val="20"/>
+        </w:rPr>
+        <w:t>5.4 CENTRO DE ESTUDOS</w:t>
+      </w:r>
+      <w:r>
+        <w:tab/>
+      </w:r>
+      <w:r>
+        <w:rPr>
+          <w:rFonts w:ascii="Arial" w:hAnsi="Arial"/>
+          <w:sz w:val="20"/>
+        </w:rPr>
+        <w:fldChar w:fldCharType="begin" w:dirty="true"/>
+        <w:instrText xml:space="preserve"> PAGEREF _TccToc32 \h </w:instrText>
+        <w:fldChar w:fldCharType="separate"/>
+        <w:t>24</w:t>
+        <w:fldChar w:fldCharType="end"/>
+      </w:r>
+    </w:p>
+    <w:p>
+      <w:pPr>
+        <w:pStyle w:val="Semrecuo"/>
+        <w:tabs>
+          <w:tab w:pos="8787" w:val="right" w:leader="dot"/>
+        </w:tabs>
+        <w:spacing w:line="240" w:lineRule="auto" w:after="60"/>
+        <w:ind w:left="425" w:firstLine="0"/>
+      </w:pPr>
+      <w:r>
+        <w:rPr>
+          <w:rFonts w:ascii="Arial" w:hAnsi="Arial"/>
+          <w:b w:val="0"/>
+          <w:sz w:val="20"/>
+        </w:rPr>
+        <w:t>5.5 PROJETOS, CERTIFICADOS E PORTFÓLIO</w:t>
+      </w:r>
+      <w:r>
+        <w:tab/>
+      </w:r>
+      <w:r>
+        <w:rPr>
+          <w:rFonts w:ascii="Arial" w:hAnsi="Arial"/>
+          <w:sz w:val="20"/>
+        </w:rPr>
+        <w:fldChar w:fldCharType="begin" w:dirty="true"/>
+        <w:instrText xml:space="preserve"> PAGEREF _TccToc33 \h </w:instrText>
+        <w:fldChar w:fldCharType="separate"/>
+        <w:t>24</w:t>
+        <w:fldChar w:fldCharType="end"/>
+      </w:r>
+    </w:p>
+    <w:p>
+      <w:pPr>
+        <w:pStyle w:val="Semrecuo"/>
+        <w:tabs>
+          <w:tab w:pos="8787" w:val="right" w:leader="dot"/>
+        </w:tabs>
+        <w:spacing w:line="240" w:lineRule="auto" w:after="60"/>
+        <w:ind w:left="425" w:firstLine="0"/>
+      </w:pPr>
+      <w:r>
+        <w:rPr>
+          <w:rFonts w:ascii="Arial" w:hAnsi="Arial"/>
+          <w:b w:val="0"/>
+          <w:sz w:val="20"/>
+        </w:rPr>
+        <w:t>5.6 MODELO DE DADOS</w:t>
+      </w:r>
+      <w:r>
+        <w:tab/>
+      </w:r>
+      <w:r>
+        <w:rPr>
+          <w:rFonts w:ascii="Arial" w:hAnsi="Arial"/>
+          <w:sz w:val="20"/>
+        </w:rPr>
+        <w:fldChar w:fldCharType="begin" w:dirty="true"/>
+        <w:instrText xml:space="preserve"> PAGEREF _TccToc34 \h </w:instrText>
+        <w:fldChar w:fldCharType="separate"/>
+        <w:t>24</w:t>
+        <w:fldChar w:fldCharType="end"/>
+      </w:r>
+    </w:p>
+    <w:p>
+      <w:pPr>
+        <w:pStyle w:val="Semrecuo"/>
+        <w:tabs>
+          <w:tab w:pos="8787" w:val="right" w:leader="dot"/>
+        </w:tabs>
+        <w:spacing w:line="240" w:lineRule="auto" w:after="60"/>
+        <w:ind w:left="425" w:firstLine="0"/>
+      </w:pPr>
+      <w:r>
+        <w:rPr>
+          <w:rFonts w:ascii="Arial" w:hAnsi="Arial"/>
+          <w:b w:val="0"/>
+          <w:sz w:val="20"/>
+        </w:rPr>
+        <w:t>5.7 REGRAS DE XP E CONSISTÊNCIA</w:t>
+      </w:r>
+      <w:r>
+        <w:tab/>
+      </w:r>
+      <w:r>
+        <w:rPr>
+          <w:rFonts w:ascii="Arial" w:hAnsi="Arial"/>
+          <w:sz w:val="20"/>
+        </w:rPr>
+        <w:fldChar w:fldCharType="begin" w:dirty="true"/>
+        <w:instrText xml:space="preserve"> PAGEREF _TccToc35 \h </w:instrText>
+        <w:fldChar w:fldCharType="separate"/>
+        <w:t>25</w:t>
+        <w:fldChar w:fldCharType="end"/>
+      </w:r>
+    </w:p>
+    <w:p>
+      <w:pPr>
+        <w:pStyle w:val="Semrecuo"/>
+        <w:tabs>
+          <w:tab w:pos="8787" w:val="right" w:leader="dot"/>
+        </w:tabs>
+        <w:spacing w:line="240" w:lineRule="auto" w:after="60"/>
+        <w:ind w:left="425" w:firstLine="0"/>
+      </w:pPr>
+      <w:r>
+        <w:rPr>
+          <w:rFonts w:ascii="Arial" w:hAnsi="Arial"/>
+          <w:b w:val="0"/>
+          <w:sz w:val="20"/>
+        </w:rPr>
+        <w:t>5.8 SEGURANÇA E PRIVACIDADE</w:t>
+      </w:r>
+      <w:r>
+        <w:tab/>
+      </w:r>
+      <w:r>
+        <w:rPr>
+          <w:rFonts w:ascii="Arial" w:hAnsi="Arial"/>
+          <w:sz w:val="20"/>
+        </w:rPr>
+        <w:fldChar w:fldCharType="begin" w:dirty="true"/>
+        <w:instrText xml:space="preserve"> PAGEREF _TccToc36 \h </w:instrText>
+        <w:fldChar w:fldCharType="separate"/>
+        <w:t>25</w:t>
+        <w:fldChar w:fldCharType="end"/>
+      </w:r>
+    </w:p>
+    <w:p>
+      <w:pPr>
+        <w:pStyle w:val="Semrecuo"/>
+        <w:tabs>
+          <w:tab w:pos="8787" w:val="right" w:leader="dot"/>
+        </w:tabs>
+        <w:spacing w:line="240" w:lineRule="auto" w:after="60"/>
+        <w:ind w:left="425" w:firstLine="0"/>
+      </w:pPr>
+      <w:r>
+        <w:rPr>
+          <w:rFonts w:ascii="Arial" w:hAnsi="Arial"/>
+          <w:b w:val="0"/>
+          <w:sz w:val="20"/>
+        </w:rPr>
+        <w:t>5.9 PAINEL ADMINISTRATIVO</w:t>
+      </w:r>
+      <w:r>
+        <w:tab/>
+      </w:r>
+      <w:r>
+        <w:rPr>
+          <w:rFonts w:ascii="Arial" w:hAnsi="Arial"/>
+          <w:sz w:val="20"/>
+        </w:rPr>
+        <w:fldChar w:fldCharType="begin" w:dirty="true"/>
+        <w:instrText xml:space="preserve"> PAGEREF _TccToc37 \h </w:instrText>
+        <w:fldChar w:fldCharType="separate"/>
+        <w:t>25</w:t>
+        <w:fldChar w:fldCharType="end"/>
+      </w:r>
+    </w:p>
+    <w:p>
+      <w:pPr>
+        <w:pStyle w:val="Semrecuo"/>
+        <w:tabs>
+          <w:tab w:pos="8787" w:val="right" w:leader="dot"/>
+        </w:tabs>
+        <w:spacing w:line="240" w:lineRule="auto" w:after="60"/>
+        <w:ind w:left="425" w:firstLine="0"/>
+      </w:pPr>
+      <w:r>
+        <w:rPr>
+          <w:rFonts w:ascii="Arial" w:hAnsi="Arial"/>
+          <w:b w:val="0"/>
+          <w:sz w:val="20"/>
+        </w:rPr>
+        <w:t>5.10 PUBLICAÇÃO</w:t>
+      </w:r>
+      <w:r>
+        <w:tab/>
+      </w:r>
+      <w:r>
+        <w:rPr>
+          <w:rFonts w:ascii="Arial" w:hAnsi="Arial"/>
+          <w:sz w:val="20"/>
+        </w:rPr>
+        <w:fldChar w:fldCharType="begin" w:dirty="true"/>
+        <w:instrText xml:space="preserve"> PAGEREF _TccToc38 \h </w:instrText>
+        <w:fldChar w:fldCharType="separate"/>
+        <w:t>26</w:t>
+        <w:fldChar w:fldCharType="end"/>
+      </w:r>
+    </w:p>
+    <w:p>
+      <w:pPr>
+        <w:pStyle w:val="Semrecuo"/>
+        <w:tabs>
+          <w:tab w:pos="8787" w:val="right" w:leader="dot"/>
+        </w:tabs>
+        <w:spacing w:line="240" w:lineRule="auto" w:after="60"/>
+        <w:ind w:left="0" w:firstLine="0"/>
+      </w:pPr>
+      <w:r>
+        <w:rPr>
+          <w:rFonts w:ascii="Arial" w:hAnsi="Arial"/>
+          <w:b/>
+          <w:sz w:val="20"/>
+        </w:rPr>
+        <w:t>6 TESTES E RESULTADOS</w:t>
+      </w:r>
+      <w:r>
+        <w:tab/>
+      </w:r>
+      <w:r>
+        <w:rPr>
+          <w:rFonts w:ascii="Arial" w:hAnsi="Arial"/>
+          <w:sz w:val="20"/>
+        </w:rPr>
+        <w:fldChar w:fldCharType="begin" w:dirty="true"/>
+        <w:instrText xml:space="preserve"> PAGEREF _TccToc39 \h </w:instrText>
+        <w:fldChar w:fldCharType="separate"/>
+        <w:t>31</w:t>
+        <w:fldChar w:fldCharType="end"/>
+      </w:r>
+    </w:p>
+    <w:p>
+      <w:pPr>
+        <w:pStyle w:val="Semrecuo"/>
+        <w:tabs>
+          <w:tab w:pos="8787" w:val="right" w:leader="dot"/>
+        </w:tabs>
+        <w:spacing w:line="240" w:lineRule="auto" w:after="60"/>
+        <w:ind w:left="425" w:firstLine="0"/>
+      </w:pPr>
+      <w:r>
+        <w:rPr>
+          <w:rFonts w:ascii="Arial" w:hAnsi="Arial"/>
+          <w:b w:val="0"/>
+          <w:sz w:val="20"/>
+        </w:rPr>
+        <w:t>6.1 ESTRATÉGIA DE TESTES</w:t>
+      </w:r>
+      <w:r>
+        <w:tab/>
+      </w:r>
+      <w:r>
+        <w:rPr>
+          <w:rFonts w:ascii="Arial" w:hAnsi="Arial"/>
+          <w:sz w:val="20"/>
+        </w:rPr>
+        <w:fldChar w:fldCharType="begin" w:dirty="true"/>
+        <w:instrText xml:space="preserve"> PAGEREF _TccToc40 \h </w:instrText>
+        <w:fldChar w:fldCharType="separate"/>
+        <w:t>31</w:t>
+        <w:fldChar w:fldCharType="end"/>
+      </w:r>
+    </w:p>
+    <w:p>
+      <w:pPr>
+        <w:pStyle w:val="Semrecuo"/>
+        <w:tabs>
+          <w:tab w:pos="8787" w:val="right" w:leader="dot"/>
+        </w:tabs>
+        <w:spacing w:line="240" w:lineRule="auto" w:after="60"/>
+        <w:ind w:left="425" w:firstLine="0"/>
+      </w:pPr>
+      <w:r>
+        <w:rPr>
+          <w:rFonts w:ascii="Arial" w:hAnsi="Arial"/>
+          <w:b w:val="0"/>
+          <w:sz w:val="20"/>
+        </w:rPr>
+        <w:t>6.2 RESULTADOS AUTOMATIZADOS</w:t>
+      </w:r>
+      <w:r>
+        <w:tab/>
+      </w:r>
+      <w:r>
+        <w:rPr>
+          <w:rFonts w:ascii="Arial" w:hAnsi="Arial"/>
+          <w:sz w:val="20"/>
+        </w:rPr>
+        <w:fldChar w:fldCharType="begin" w:dirty="true"/>
+        <w:instrText xml:space="preserve"> PAGEREF _TccToc41 \h </w:instrText>
+        <w:fldChar w:fldCharType="separate"/>
+        <w:t>31</w:t>
+        <w:fldChar w:fldCharType="end"/>
+      </w:r>
+    </w:p>
+    <w:p>
+      <w:pPr>
+        <w:pStyle w:val="Semrecuo"/>
+        <w:tabs>
+          <w:tab w:pos="8787" w:val="right" w:leader="dot"/>
+        </w:tabs>
+        <w:spacing w:line="240" w:lineRule="auto" w:after="60"/>
+        <w:ind w:left="425" w:firstLine="0"/>
+      </w:pPr>
+      <w:r>
+        <w:rPr>
+          <w:rFonts w:ascii="Arial" w:hAnsi="Arial"/>
+          <w:b w:val="0"/>
+          <w:sz w:val="20"/>
+        </w:rPr>
+        <w:t>6.3 CENÁRIOS REPRESENTATIVOS</w:t>
+      </w:r>
+      <w:r>
+        <w:tab/>
+      </w:r>
+      <w:r>
+        <w:rPr>
+          <w:rFonts w:ascii="Arial" w:hAnsi="Arial"/>
+          <w:sz w:val="20"/>
+        </w:rPr>
+        <w:fldChar w:fldCharType="begin" w:dirty="true"/>
+        <w:instrText xml:space="preserve"> PAGEREF _TccToc42 \h </w:instrText>
+        <w:fldChar w:fldCharType="separate"/>
+        <w:t>31</w:t>
+        <w:fldChar w:fldCharType="end"/>
+      </w:r>
+    </w:p>
+    <w:p>
+      <w:pPr>
+        <w:pStyle w:val="Semrecuo"/>
+        <w:tabs>
+          <w:tab w:pos="8787" w:val="right" w:leader="dot"/>
+        </w:tabs>
+        <w:spacing w:line="240" w:lineRule="auto" w:after="60"/>
+        <w:ind w:left="425" w:firstLine="0"/>
+      </w:pPr>
+      <w:r>
+        <w:rPr>
+          <w:rFonts w:ascii="Arial" w:hAnsi="Arial"/>
+          <w:b w:val="0"/>
+          <w:sz w:val="20"/>
+        </w:rPr>
+        <w:t>6.4 ANÁLISE DOS RESULTADOS</w:t>
+      </w:r>
+      <w:r>
+        <w:tab/>
+      </w:r>
+      <w:r>
+        <w:rPr>
+          <w:rFonts w:ascii="Arial" w:hAnsi="Arial"/>
+          <w:sz w:val="20"/>
+        </w:rPr>
+        <w:fldChar w:fldCharType="begin" w:dirty="true"/>
+        <w:instrText xml:space="preserve"> PAGEREF _TccToc43 \h </w:instrText>
+        <w:fldChar w:fldCharType="separate"/>
+        <w:t>32</w:t>
+        <w:fldChar w:fldCharType="end"/>
+      </w:r>
+    </w:p>
+    <w:p>
+      <w:pPr>
+        <w:pStyle w:val="Semrecuo"/>
+        <w:tabs>
+          <w:tab w:pos="8787" w:val="right" w:leader="dot"/>
+        </w:tabs>
+        <w:spacing w:line="240" w:lineRule="auto" w:after="60"/>
+        <w:ind w:left="425" w:firstLine="0"/>
+      </w:pPr>
+      <w:r>
+        <w:rPr>
+          <w:rFonts w:ascii="Arial" w:hAnsi="Arial"/>
+          <w:b w:val="0"/>
+          <w:sz w:val="20"/>
+        </w:rPr>
+        <w:t>6.5 VALIDAÇÃO MANUAL RECOMENDADA</w:t>
+      </w:r>
+      <w:r>
+        <w:tab/>
+      </w:r>
+      <w:r>
+        <w:rPr>
+          <w:rFonts w:ascii="Arial" w:hAnsi="Arial"/>
+          <w:sz w:val="20"/>
+        </w:rPr>
+        <w:fldChar w:fldCharType="begin" w:dirty="true"/>
+        <w:instrText xml:space="preserve"> PAGEREF _TccToc44 \h </w:instrText>
+        <w:fldChar w:fldCharType="separate"/>
+        <w:t>32</w:t>
+        <w:fldChar w:fldCharType="end"/>
+      </w:r>
+    </w:p>
+    <w:p>
+      <w:pPr>
+        <w:pStyle w:val="Semrecuo"/>
+        <w:tabs>
+          <w:tab w:pos="8787" w:val="right" w:leader="dot"/>
+        </w:tabs>
+        <w:spacing w:line="240" w:lineRule="auto" w:after="60"/>
+        <w:ind w:left="0" w:firstLine="0"/>
+      </w:pPr>
+      <w:r>
+        <w:rPr>
+          <w:rFonts w:ascii="Arial" w:hAnsi="Arial"/>
+          <w:b/>
+          <w:sz w:val="20"/>
+        </w:rPr>
+        <w:t>7 DISCUSSÃO, LIMITAÇÕES E TRABALHOS FUTUROS</w:t>
+      </w:r>
+      <w:r>
+        <w:tab/>
+      </w:r>
+      <w:r>
+        <w:rPr>
+          <w:rFonts w:ascii="Arial" w:hAnsi="Arial"/>
+          <w:sz w:val="20"/>
+        </w:rPr>
+        <w:fldChar w:fldCharType="begin" w:dirty="true"/>
+        <w:instrText xml:space="preserve"> PAGEREF _TccToc45 \h </w:instrText>
+        <w:fldChar w:fldCharType="separate"/>
+        <w:t>34</w:t>
+        <w:fldChar w:fldCharType="end"/>
+      </w:r>
+    </w:p>
+    <w:p>
+      <w:pPr>
+        <w:pStyle w:val="Semrecuo"/>
+        <w:tabs>
+          <w:tab w:pos="8787" w:val="right" w:leader="dot"/>
+        </w:tabs>
+        <w:spacing w:line="240" w:lineRule="auto" w:after="60"/>
+        <w:ind w:left="425" w:firstLine="0"/>
+      </w:pPr>
+      <w:r>
+        <w:rPr>
+          <w:rFonts w:ascii="Arial" w:hAnsi="Arial"/>
+          <w:b w:val="0"/>
+          <w:sz w:val="20"/>
+        </w:rPr>
+        <w:t>7.1 CONTRIBUIÇÕES</w:t>
+      </w:r>
+      <w:r>
+        <w:tab/>
+      </w:r>
+      <w:r>
+        <w:rPr>
+          <w:rFonts w:ascii="Arial" w:hAnsi="Arial"/>
+          <w:sz w:val="20"/>
+        </w:rPr>
+        <w:fldChar w:fldCharType="begin" w:dirty="true"/>
+        <w:instrText xml:space="preserve"> PAGEREF _TccToc46 \h </w:instrText>
+        <w:fldChar w:fldCharType="separate"/>
+        <w:t>34</w:t>
+        <w:fldChar w:fldCharType="end"/>
+      </w:r>
+    </w:p>
+    <w:p>
+      <w:pPr>
+        <w:pStyle w:val="Semrecuo"/>
+        <w:tabs>
+          <w:tab w:pos="8787" w:val="right" w:leader="dot"/>
+        </w:tabs>
+        <w:spacing w:line="240" w:lineRule="auto" w:after="60"/>
+        <w:ind w:left="425" w:firstLine="0"/>
+      </w:pPr>
+      <w:r>
+        <w:rPr>
+          <w:rFonts w:ascii="Arial" w:hAnsi="Arial"/>
+          <w:b w:val="0"/>
+          <w:sz w:val="20"/>
+        </w:rPr>
+        <w:t>7.2 LIMITAÇÕES</w:t>
+      </w:r>
+      <w:r>
+        <w:tab/>
+      </w:r>
+      <w:r>
+        <w:rPr>
+          <w:rFonts w:ascii="Arial" w:hAnsi="Arial"/>
+          <w:sz w:val="20"/>
+        </w:rPr>
+        <w:fldChar w:fldCharType="begin" w:dirty="true"/>
+        <w:instrText xml:space="preserve"> PAGEREF _TccToc47 \h </w:instrText>
+        <w:fldChar w:fldCharType="separate"/>
+        <w:t>34</w:t>
+        <w:fldChar w:fldCharType="end"/>
+      </w:r>
+    </w:p>
+    <w:p>
+      <w:pPr>
+        <w:pStyle w:val="Semrecuo"/>
+        <w:tabs>
+          <w:tab w:pos="8787" w:val="right" w:leader="dot"/>
+        </w:tabs>
+        <w:spacing w:line="240" w:lineRule="auto" w:after="60"/>
+        <w:ind w:left="425" w:firstLine="0"/>
+      </w:pPr>
+      <w:r>
+        <w:rPr>
+          <w:rFonts w:ascii="Arial" w:hAnsi="Arial"/>
+          <w:b w:val="0"/>
+          <w:sz w:val="20"/>
+        </w:rPr>
+        <w:t>7.3 POSSIBILIDADES DE EVOLUÇÃO</w:t>
+      </w:r>
+      <w:r>
+        <w:tab/>
+      </w:r>
+      <w:r>
+        <w:rPr>
+          <w:rFonts w:ascii="Arial" w:hAnsi="Arial"/>
+          <w:sz w:val="20"/>
+        </w:rPr>
+        <w:fldChar w:fldCharType="begin" w:dirty="true"/>
+        <w:instrText xml:space="preserve"> PAGEREF _TccToc48 \h </w:instrText>
+        <w:fldChar w:fldCharType="separate"/>
+        <w:t>34</w:t>
+        <w:fldChar w:fldCharType="end"/>
+      </w:r>
+    </w:p>
+    <w:p>
+      <w:pPr>
+        <w:pStyle w:val="Semrecuo"/>
+        <w:tabs>
+          <w:tab w:pos="8787" w:val="right" w:leader="dot"/>
+        </w:tabs>
+        <w:spacing w:line="240" w:lineRule="auto" w:after="60"/>
+        <w:ind w:left="0" w:firstLine="0"/>
+      </w:pPr>
+      <w:r>
+        <w:rPr>
+          <w:rFonts w:ascii="Arial" w:hAnsi="Arial"/>
+          <w:b/>
+          <w:sz w:val="20"/>
+        </w:rPr>
+        <w:t>8 CONCLUSÃO</w:t>
+      </w:r>
+      <w:r>
+        <w:tab/>
+      </w:r>
+      <w:r>
+        <w:rPr>
+          <w:rFonts w:ascii="Arial" w:hAnsi="Arial"/>
+          <w:sz w:val="20"/>
+        </w:rPr>
+        <w:fldChar w:fldCharType="begin" w:dirty="true"/>
+        <w:instrText xml:space="preserve"> PAGEREF _TccToc49 \h </w:instrText>
+        <w:fldChar w:fldCharType="separate"/>
+        <w:t>36</w:t>
+        <w:fldChar w:fldCharType="end"/>
+      </w:r>
+    </w:p>
+    <w:p>
+      <w:pPr>
+        <w:pStyle w:val="Semrecuo"/>
+        <w:tabs>
+          <w:tab w:pos="8787" w:val="right" w:leader="dot"/>
+        </w:tabs>
+        <w:spacing w:line="240" w:lineRule="auto" w:after="60"/>
+        <w:ind w:left="0" w:firstLine="0"/>
+      </w:pPr>
+      <w:r>
+        <w:rPr>
+          <w:rFonts w:ascii="Arial" w:hAnsi="Arial"/>
+          <w:b/>
+          <w:sz w:val="20"/>
+        </w:rPr>
+        <w:t>REFERÊNCIAS</w:t>
+      </w:r>
+      <w:r>
+        <w:tab/>
+      </w:r>
+      <w:r>
+        <w:rPr>
+          <w:rFonts w:ascii="Arial" w:hAnsi="Arial"/>
+          <w:sz w:val="20"/>
+        </w:rPr>
+        <w:fldChar w:fldCharType="begin" w:dirty="true"/>
+        <w:instrText xml:space="preserve"> PAGEREF _TccToc50 \h </w:instrText>
+        <w:fldChar w:fldCharType="separate"/>
+        <w:t>37</w:t>
+        <w:fldChar w:fldCharType="end"/>
+      </w:r>
+    </w:p>
+    <w:p>
+      <w:pPr>
+        <w:pStyle w:val="Semrecuo"/>
+        <w:tabs>
+          <w:tab w:pos="8787" w:val="right" w:leader="dot"/>
+        </w:tabs>
+        <w:spacing w:line="240" w:lineRule="auto" w:after="60"/>
+        <w:ind w:left="0" w:firstLine="0"/>
+      </w:pPr>
+      <w:r>
+        <w:rPr>
+          <w:rFonts w:ascii="Arial" w:hAnsi="Arial"/>
+          <w:b/>
+          <w:sz w:val="20"/>
+        </w:rPr>
+        <w:t>APÊNDICE A — GUIA DE INSTALAÇÃO E EXECUÇÃO</w:t>
+      </w:r>
+      <w:r>
+        <w:tab/>
+      </w:r>
+      <w:r>
+        <w:rPr>
+          <w:rFonts w:ascii="Arial" w:hAnsi="Arial"/>
+          <w:sz w:val="20"/>
+        </w:rPr>
+        <w:fldChar w:fldCharType="begin" w:dirty="true"/>
+        <w:instrText xml:space="preserve"> PAGEREF _TccToc51 \h </w:instrText>
+        <w:fldChar w:fldCharType="separate"/>
+        <w:t>39</w:t>
+        <w:fldChar w:fldCharType="end"/>
+      </w:r>
+    </w:p>
+    <w:p>
+      <w:pPr>
+        <w:pStyle w:val="Semrecuo"/>
+        <w:tabs>
+          <w:tab w:pos="8787" w:val="right" w:leader="dot"/>
+        </w:tabs>
+        <w:spacing w:line="240" w:lineRule="auto" w:after="60"/>
+        <w:ind w:left="425" w:firstLine="0"/>
+      </w:pPr>
+      <w:r>
+        <w:rPr>
+          <w:rFonts w:ascii="Arial" w:hAnsi="Arial"/>
+          <w:b w:val="0"/>
+          <w:sz w:val="20"/>
+        </w:rPr>
+        <w:t>A.1 PRÉ-REQUISITOS</w:t>
+      </w:r>
+      <w:r>
+        <w:tab/>
+      </w:r>
+      <w:r>
+        <w:rPr>
+          <w:rFonts w:ascii="Arial" w:hAnsi="Arial"/>
+          <w:sz w:val="20"/>
+        </w:rPr>
+        <w:fldChar w:fldCharType="begin" w:dirty="true"/>
+        <w:instrText xml:space="preserve"> PAGEREF _TccToc52 \h </w:instrText>
+        <w:fldChar w:fldCharType="separate"/>
+        <w:t>39</w:t>
+        <w:fldChar w:fldCharType="end"/>
+      </w:r>
+    </w:p>
+    <w:p>
+      <w:pPr>
+        <w:pStyle w:val="Semrecuo"/>
+        <w:tabs>
+          <w:tab w:pos="8787" w:val="right" w:leader="dot"/>
+        </w:tabs>
+        <w:spacing w:line="240" w:lineRule="auto" w:after="60"/>
+        <w:ind w:left="425" w:firstLine="0"/>
+      </w:pPr>
+      <w:r>
+        <w:rPr>
+          <w:rFonts w:ascii="Arial" w:hAnsi="Arial"/>
+          <w:b w:val="0"/>
+          <w:sz w:val="20"/>
+        </w:rPr>
+        <w:t>A.2 EXECUÇÃO LOCAL</w:t>
+      </w:r>
+      <w:r>
+        <w:tab/>
+      </w:r>
+      <w:r>
+        <w:rPr>
+          <w:rFonts w:ascii="Arial" w:hAnsi="Arial"/>
+          <w:sz w:val="20"/>
+        </w:rPr>
+        <w:fldChar w:fldCharType="begin" w:dirty="true"/>
+        <w:instrText xml:space="preserve"> PAGEREF _TccToc53 \h </w:instrText>
+        <w:fldChar w:fldCharType="separate"/>
+        <w:t>39</w:t>
+        <w:fldChar w:fldCharType="end"/>
+      </w:r>
+    </w:p>
+    <w:p>
+      <w:pPr>
+        <w:pStyle w:val="Semrecuo"/>
+        <w:tabs>
+          <w:tab w:pos="8787" w:val="right" w:leader="dot"/>
+        </w:tabs>
+        <w:spacing w:line="240" w:lineRule="auto" w:after="60"/>
+        <w:ind w:left="425" w:firstLine="0"/>
+      </w:pPr>
+      <w:r>
+        <w:rPr>
+          <w:rFonts w:ascii="Arial" w:hAnsi="Arial"/>
+          <w:b w:val="0"/>
+          <w:sz w:val="20"/>
+        </w:rPr>
+        <w:t>A.3 CONFIGURAÇÃO DO BANCO</w:t>
+      </w:r>
+      <w:r>
+        <w:tab/>
+      </w:r>
+      <w:r>
+        <w:rPr>
+          <w:rFonts w:ascii="Arial" w:hAnsi="Arial"/>
+          <w:sz w:val="20"/>
+        </w:rPr>
+        <w:fldChar w:fldCharType="begin" w:dirty="true"/>
+        <w:instrText xml:space="preserve"> PAGEREF _TccToc54 \h </w:instrText>
+        <w:fldChar w:fldCharType="separate"/>
+        <w:t>39</w:t>
+        <w:fldChar w:fldCharType="end"/>
+      </w:r>
+    </w:p>
+    <w:p>
+      <w:pPr>
+        <w:pStyle w:val="Semrecuo"/>
+        <w:tabs>
+          <w:tab w:pos="8787" w:val="right" w:leader="dot"/>
+        </w:tabs>
+        <w:spacing w:line="240" w:lineRule="auto" w:after="60"/>
+        <w:ind w:left="425" w:firstLine="0"/>
+      </w:pPr>
+      <w:r>
+        <w:rPr>
+          <w:rFonts w:ascii="Arial" w:hAnsi="Arial"/>
+          <w:b w:val="0"/>
+          <w:sz w:val="20"/>
+        </w:rPr>
+        <w:t>A.4 TESTES</w:t>
+      </w:r>
+      <w:r>
+        <w:tab/>
+      </w:r>
+      <w:r>
+        <w:rPr>
+          <w:rFonts w:ascii="Arial" w:hAnsi="Arial"/>
+          <w:sz w:val="20"/>
+        </w:rPr>
+        <w:fldChar w:fldCharType="begin" w:dirty="true"/>
+        <w:instrText xml:space="preserve"> PAGEREF _TccToc55 \h </w:instrText>
+        <w:fldChar w:fldCharType="separate"/>
+        <w:t>40</w:t>
+        <w:fldChar w:fldCharType="end"/>
+      </w:r>
+    </w:p>
+    <w:p>
+      <w:pPr>
+        <w:pStyle w:val="Semrecuo"/>
+        <w:tabs>
+          <w:tab w:pos="8787" w:val="right" w:leader="dot"/>
+        </w:tabs>
+        <w:spacing w:line="240" w:lineRule="auto" w:after="60"/>
+        <w:ind w:left="0" w:firstLine="0"/>
+      </w:pPr>
+      <w:r>
+        <w:rPr>
+          <w:rFonts w:ascii="Arial" w:hAnsi="Arial"/>
+          <w:b/>
+          <w:sz w:val="20"/>
+        </w:rPr>
+        <w:t>APÊNDICE B — ROTEIRO DE VALIDAÇÃO MANUAL</w:t>
+      </w:r>
+      <w:r>
+        <w:tab/>
+      </w:r>
+      <w:r>
+        <w:rPr>
+          <w:rFonts w:ascii="Arial" w:hAnsi="Arial"/>
+          <w:sz w:val="20"/>
+        </w:rPr>
+        <w:fldChar w:fldCharType="begin" w:dirty="true"/>
+        <w:instrText xml:space="preserve"> PAGEREF _TccToc56 \h </w:instrText>
+        <w:fldChar w:fldCharType="separate"/>
+        <w:t>41</w:t>
+        <w:fldChar w:fldCharType="end"/>
+      </w:r>
+    </w:p>
+    <w:p>
+      <w:pPr>
+        <w:pStyle w:val="Semrecuo"/>
+        <w:tabs>
+          <w:tab w:pos="8787" w:val="right" w:leader="dot"/>
+        </w:tabs>
+        <w:spacing w:line="240" w:lineRule="auto" w:after="60"/>
+        <w:ind w:left="0" w:firstLine="0"/>
+      </w:pPr>
+      <w:r>
+        <w:rPr>
+          <w:rFonts w:ascii="Arial" w:hAnsi="Arial"/>
+          <w:b/>
+          <w:sz w:val="20"/>
+        </w:rPr>
+        <w:t>APÊNDICE C — CAMPOS A CONFERIR ANTES DA ENTREGA</w:t>
+      </w:r>
+      <w:r>
+        <w:tab/>
+      </w:r>
+      <w:r>
+        <w:rPr>
+          <w:rFonts w:ascii="Arial" w:hAnsi="Arial"/>
+          <w:sz w:val="20"/>
+        </w:rPr>
+        <w:fldChar w:fldCharType="begin" w:dirty="true"/>
+        <w:instrText xml:space="preserve"> PAGEREF _TccToc57 \h </w:instrText>
+        <w:fldChar w:fldCharType="separate"/>
+        <w:t>42</w:t>
+        <w:fldChar w:fldCharType="end"/>
+      </w:r>
     </w:p>
     <w:p>
       <w:pPr>
@@ -1641,6 +3452,7 @@
       </w:pPr>
     </w:p>
     <w:p>
+      <w:bookmarkStart w:id="1001" w:name="_TccToc1"/>
       <w:pPr>
         <w:pStyle w:val="Heading1"/>
         <w:keepNext/>
@@ -1648,6 +3460,7 @@
       <w:r>
         <w:t>1 INTRODUÇÃO</w:t>
       </w:r>
+      <w:bookmarkEnd w:id="1001"/>
     </w:p>
     <w:p>
       <w:pPr>
@@ -1686,6 +3499,7 @@
       </w:r>
     </w:p>
     <w:p>
+      <w:bookmarkStart w:id="1002" w:name="_TccToc2"/>
       <w:pPr>
         <w:pStyle w:val="Heading2"/>
         <w:keepNext/>
@@ -1693,6 +3507,7 @@
       <w:r>
         <w:t>1.1 PROBLEMA DE PESQUISA</w:t>
       </w:r>
+      <w:bookmarkEnd w:id="1002"/>
     </w:p>
     <w:p>
       <w:pPr>
@@ -1707,6 +3522,7 @@
       </w:r>
     </w:p>
     <w:p>
+      <w:bookmarkStart w:id="1003" w:name="_TccToc3"/>
       <w:pPr>
         <w:pStyle w:val="Heading2"/>
         <w:keepNext/>
@@ -1714,6 +3530,7 @@
       <w:r>
         <w:t>1.2 HIPÓTESE</w:t>
       </w:r>
+      <w:bookmarkEnd w:id="1003"/>
     </w:p>
     <w:p>
       <w:pPr>
@@ -1728,6 +3545,7 @@
       </w:r>
     </w:p>
     <w:p>
+      <w:bookmarkStart w:id="1004" w:name="_TccToc4"/>
       <w:pPr>
         <w:pStyle w:val="Heading2"/>
         <w:keepNext/>
@@ -1735,6 +3553,7 @@
       <w:r>
         <w:t>1.3 OBJETIVO GERAL</w:t>
       </w:r>
+      <w:bookmarkEnd w:id="1004"/>
     </w:p>
     <w:p>
       <w:pPr>
@@ -1749,6 +3568,7 @@
       </w:r>
     </w:p>
     <w:p>
+      <w:bookmarkStart w:id="1005" w:name="_TccToc5"/>
       <w:pPr>
         <w:pStyle w:val="Heading2"/>
         <w:keepNext/>
@@ -1756,6 +3576,7 @@
       <w:r>
         <w:t>1.4 OBJETIVOS ESPECÍFICOS</w:t>
       </w:r>
+      <w:bookmarkEnd w:id="1005"/>
     </w:p>
     <w:p>
       <w:pPr>
@@ -1866,6 +3687,7 @@
       </w:r>
     </w:p>
     <w:p>
+      <w:bookmarkStart w:id="1006" w:name="_TccToc6"/>
       <w:pPr>
         <w:pStyle w:val="Heading2"/>
         <w:keepNext/>
@@ -1873,6 +3695,7 @@
       <w:r>
         <w:t>1.5 JUSTIFICATIVA</w:t>
       </w:r>
+      <w:bookmarkEnd w:id="1006"/>
     </w:p>
     <w:p>
       <w:pPr>
@@ -1899,6 +3722,7 @@
       </w:r>
     </w:p>
     <w:p>
+      <w:bookmarkStart w:id="1007" w:name="_TccToc7"/>
       <w:pPr>
         <w:pStyle w:val="Heading2"/>
         <w:keepNext/>
@@ -1906,6 +3730,7 @@
       <w:r>
         <w:t>1.6 DELIMITAÇÃO</w:t>
       </w:r>
+      <w:bookmarkEnd w:id="1007"/>
     </w:p>
     <w:p>
       <w:pPr>
@@ -1920,6 +3745,7 @@
       </w:r>
     </w:p>
     <w:p>
+      <w:bookmarkStart w:id="1008" w:name="_TccToc8"/>
       <w:pPr>
         <w:pStyle w:val="Heading2"/>
         <w:keepNext/>
@@ -1927,6 +3753,7 @@
       <w:r>
         <w:t>1.7 ESTRUTURA DO TRABALHO</w:t>
       </w:r>
+      <w:bookmarkEnd w:id="1008"/>
     </w:p>
     <w:p>
       <w:pPr>
@@ -1941,6 +3768,7 @@
       </w:r>
     </w:p>
     <w:p>
+      <w:bookmarkStart w:id="1009" w:name="_TccToc9"/>
       <w:pPr>
         <w:pStyle w:val="Heading1"/>
         <w:pageBreakBefore/>
@@ -1949,8 +3777,10 @@
       <w:r>
         <w:t>2 FUNDAMENTAÇÃO TEÓRICA</w:t>
       </w:r>
-    </w:p>
-    <w:p>
+      <w:bookmarkEnd w:id="1009"/>
+    </w:p>
+    <w:p>
+      <w:bookmarkStart w:id="1010" w:name="_TccToc10"/>
       <w:pPr>
         <w:pStyle w:val="Heading2"/>
         <w:keepNext/>
@@ -1958,6 +3788,7 @@
       <w:r>
         <w:t>2.1 EDUCAÇÃO TECNOLÓGICA E APRENDIZAGEM PRÁTICA</w:t>
       </w:r>
+      <w:bookmarkEnd w:id="1010"/>
     </w:p>
     <w:p>
       <w:pPr>
@@ -1984,6 +3815,7 @@
       </w:r>
     </w:p>
     <w:p>
+      <w:bookmarkStart w:id="1011" w:name="_TccToc11"/>
       <w:pPr>
         <w:pStyle w:val="Heading2"/>
         <w:keepNext/>
@@ -1991,6 +3823,7 @@
       <w:r>
         <w:t>2.2 GAMIFICAÇÃO</w:t>
       </w:r>
+      <w:bookmarkEnd w:id="1011"/>
     </w:p>
     <w:p>
       <w:pPr>
@@ -2017,6 +3850,7 @@
       </w:r>
     </w:p>
     <w:p>
+      <w:bookmarkStart w:id="1012" w:name="_TccToc12"/>
       <w:pPr>
         <w:pStyle w:val="Heading2"/>
         <w:keepNext/>
@@ -2024,6 +3858,7 @@
       <w:r>
         <w:t>2.3 EXPERIÊNCIA DO USUÁRIO E RESPONSIVIDADE</w:t>
       </w:r>
+      <w:bookmarkEnd w:id="1012"/>
     </w:p>
     <w:p>
       <w:pPr>
@@ -2050,6 +3885,7 @@
       </w:r>
     </w:p>
     <w:p>
+      <w:bookmarkStart w:id="1013" w:name="_TccToc13"/>
       <w:pPr>
         <w:pStyle w:val="Heading2"/>
         <w:keepNext/>
@@ -2057,6 +3893,7 @@
       <w:r>
         <w:t>2.4 APLICAÇÕES WEB DE PÁGINA ÚNICA</w:t>
       </w:r>
+      <w:bookmarkEnd w:id="1013"/>
     </w:p>
     <w:p>
       <w:pPr>
@@ -2071,6 +3908,7 @@
       </w:r>
     </w:p>
     <w:p>
+      <w:bookmarkStart w:id="1014" w:name="_TccToc14"/>
       <w:pPr>
         <w:pStyle w:val="Heading2"/>
         <w:keepNext/>
@@ -2078,6 +3916,7 @@
       <w:r>
         <w:t>2.5 BANCO DE DADOS, AUTENTICAÇÃO E AUTORIZAÇÃO</w:t>
       </w:r>
+      <w:bookmarkEnd w:id="1014"/>
     </w:p>
     <w:p>
       <w:pPr>
@@ -2104,6 +3943,7 @@
       </w:r>
     </w:p>
     <w:p>
+      <w:bookmarkStart w:id="1015" w:name="_TccToc15"/>
       <w:pPr>
         <w:pStyle w:val="Heading2"/>
         <w:keepNext/>
@@ -2111,6 +3951,7 @@
       <w:r>
         <w:t>2.6 PORTFÓLIO DIGITAL E PRIVACIDADE</w:t>
       </w:r>
+      <w:bookmarkEnd w:id="1015"/>
     </w:p>
     <w:p>
       <w:pPr>
@@ -2137,6 +3978,7 @@
       </w:r>
     </w:p>
     <w:p>
+      <w:bookmarkStart w:id="1016" w:name="_TccToc16"/>
       <w:pPr>
         <w:pStyle w:val="Heading1"/>
         <w:pageBreakBefore/>
@@ -2145,8 +3987,10 @@
       <w:r>
         <w:t>3 METODOLOGIA</w:t>
       </w:r>
-    </w:p>
-    <w:p>
+      <w:bookmarkEnd w:id="1016"/>
+    </w:p>
+    <w:p>
+      <w:bookmarkStart w:id="1017" w:name="_TccToc17"/>
       <w:pPr>
         <w:pStyle w:val="Heading2"/>
         <w:keepNext/>
@@ -2154,6 +3998,7 @@
       <w:r>
         <w:t>3.1 NATUREZA DA PESQUISA</w:t>
       </w:r>
+      <w:bookmarkEnd w:id="1017"/>
     </w:p>
     <w:p>
       <w:pPr>
@@ -2168,6 +4013,7 @@
       </w:r>
     </w:p>
     <w:p>
+      <w:bookmarkStart w:id="1018" w:name="_TccToc18"/>
       <w:pPr>
         <w:pStyle w:val="Heading2"/>
         <w:keepNext/>
@@ -2175,6 +4021,7 @@
       <w:r>
         <w:t>3.2 PROCESSO DE DESENVOLVIMENTO</w:t>
       </w:r>
+      <w:bookmarkEnd w:id="1018"/>
     </w:p>
     <w:p>
       <w:pPr>
@@ -2294,6 +4141,7 @@
       </w:r>
     </w:p>
     <w:p>
+      <w:bookmarkStart w:id="1019" w:name="_TccToc19"/>
       <w:pPr>
         <w:pStyle w:val="Heading2"/>
         <w:keepNext/>
@@ -2301,6 +4149,7 @@
       <w:r>
         <w:t>3.3 COLETA E ANÁLISE DE DADOS</w:t>
       </w:r>
+      <w:bookmarkEnd w:id="1019"/>
     </w:p>
     <w:p>
       <w:pPr>
@@ -2315,6 +4164,7 @@
       </w:r>
     </w:p>
     <w:p>
+      <w:bookmarkStart w:id="1020" w:name="_TccToc20"/>
       <w:pPr>
         <w:pStyle w:val="Heading2"/>
         <w:keepNext/>
@@ -2322,6 +4172,7 @@
       <w:r>
         <w:t>3.4 FERRAMENTAS</w:t>
       </w:r>
+      <w:bookmarkEnd w:id="1020"/>
     </w:p>
     <w:p>
       <w:pPr>
@@ -2689,6 +4540,7 @@
       </w:r>
     </w:p>
     <w:p>
+      <w:bookmarkStart w:id="1021" w:name="_TccToc21"/>
       <w:pPr>
         <w:pStyle w:val="Heading2"/>
         <w:keepNext/>
@@ -2696,6 +4548,7 @@
       <w:r>
         <w:t>3.5 CRITÉRIOS DE VALIDAÇÃO</w:t>
       </w:r>
+      <w:bookmarkEnd w:id="1021"/>
     </w:p>
     <w:p>
       <w:pPr>
@@ -2710,6 +4563,7 @@
       </w:r>
     </w:p>
     <w:p>
+      <w:bookmarkStart w:id="1022" w:name="_TccToc22"/>
       <w:pPr>
         <w:pStyle w:val="Heading1"/>
         <w:pageBreakBefore/>
@@ -2718,8 +4572,10 @@
       <w:r>
         <w:t>4 LEVANTAMENTO DE REQUISITOS E PLANEJAMENTO</w:t>
       </w:r>
-    </w:p>
-    <w:p>
+      <w:bookmarkEnd w:id="1022"/>
+    </w:p>
+    <w:p>
+      <w:bookmarkStart w:id="1023" w:name="_TccToc23"/>
       <w:pPr>
         <w:pStyle w:val="Heading2"/>
         <w:keepNext/>
@@ -2727,6 +4583,7 @@
       <w:r>
         <w:t>4.1 PÚBLICO-ALVO</w:t>
       </w:r>
+      <w:bookmarkEnd w:id="1023"/>
     </w:p>
     <w:p>
       <w:pPr>
@@ -2741,6 +4598,7 @@
       </w:r>
     </w:p>
     <w:p>
+      <w:bookmarkStart w:id="1024" w:name="_TccToc24"/>
       <w:pPr>
         <w:pStyle w:val="Heading2"/>
         <w:keepNext/>
@@ -2748,6 +4606,7 @@
       <w:r>
         <w:t>4.2 REQUISITOS FUNCIONAIS</w:t>
       </w:r>
+      <w:bookmarkEnd w:id="1024"/>
     </w:p>
     <w:p>
       <w:pPr>
@@ -3315,6 +5174,7 @@
       </w:r>
     </w:p>
     <w:p>
+      <w:bookmarkStart w:id="1025" w:name="_TccToc25"/>
       <w:pPr>
         <w:pStyle w:val="Heading2"/>
         <w:keepNext/>
@@ -3322,6 +5182,7 @@
       <w:r>
         <w:t>4.3 REQUISITOS NÃO FUNCIONAIS</w:t>
       </w:r>
+      <w:bookmarkEnd w:id="1025"/>
     </w:p>
     <w:p>
       <w:pPr>
@@ -3729,6 +5590,7 @@
       </w:r>
     </w:p>
     <w:p>
+      <w:bookmarkStart w:id="1026" w:name="_TccToc26"/>
       <w:pPr>
         <w:pStyle w:val="Heading2"/>
         <w:keepNext/>
@@ -3736,6 +5598,7 @@
       <w:r>
         <w:t>4.4 REGRAS DE NEGÓCIO</w:t>
       </w:r>
+      <w:bookmarkEnd w:id="1026"/>
     </w:p>
     <w:p>
       <w:pPr>
@@ -3858,6 +5721,7 @@
       </w:r>
     </w:p>
     <w:p>
+      <w:bookmarkStart w:id="1027" w:name="_TccToc27"/>
       <w:pPr>
         <w:pStyle w:val="Heading2"/>
         <w:keepNext/>
@@ -3865,6 +5729,7 @@
       <w:r>
         <w:t>4.5 CRONOGRAMA</w:t>
       </w:r>
+      <w:bookmarkEnd w:id="1027"/>
     </w:p>
     <w:p>
       <w:pPr>
@@ -4450,6 +6315,7 @@
       </w:r>
     </w:p>
     <w:p>
+      <w:bookmarkStart w:id="1028" w:name="_TccToc28"/>
       <w:pPr>
         <w:pStyle w:val="Heading1"/>
         <w:pageBreakBefore/>
@@ -4458,8 +6324,10 @@
       <w:r>
         <w:t>5 DESENVOLVIMENTO DA SOLUÇÃO</w:t>
       </w:r>
-    </w:p>
-    <w:p>
+      <w:bookmarkEnd w:id="1028"/>
+    </w:p>
+    <w:p>
+      <w:bookmarkStart w:id="1029" w:name="_TccToc29"/>
       <w:pPr>
         <w:pStyle w:val="Heading2"/>
         <w:keepNext/>
@@ -4467,6 +6335,7 @@
       <w:r>
         <w:t>5.1 VISÃO GERAL DA ARQUITETURA</w:t>
       </w:r>
+      <w:bookmarkEnd w:id="1029"/>
     </w:p>
     <w:p>
       <w:pPr>
@@ -4923,6 +6792,7 @@
       </w:r>
     </w:p>
     <w:p>
+      <w:bookmarkStart w:id="1030" w:name="_TccToc30"/>
       <w:pPr>
         <w:pStyle w:val="Heading2"/>
         <w:keepNext/>
@@ -4930,6 +6800,7 @@
       <w:r>
         <w:t>5.2 ORGANIZAÇÃO DO FRONTEND</w:t>
       </w:r>
+      <w:bookmarkEnd w:id="1030"/>
     </w:p>
     <w:p>
       <w:pPr>
@@ -4956,6 +6827,7 @@
       </w:r>
     </w:p>
     <w:p>
+      <w:bookmarkStart w:id="1031" w:name="_TccToc31"/>
       <w:pPr>
         <w:pStyle w:val="Heading2"/>
         <w:keepNext/>
@@ -4963,6 +6835,7 @@
       <w:r>
         <w:t>5.3 JORNADA DO ESTUDANTE</w:t>
       </w:r>
+      <w:bookmarkEnd w:id="1031"/>
     </w:p>
     <w:p>
       <w:pPr>
@@ -5127,6 +7000,7 @@
       </w:r>
     </w:p>
     <w:p>
+      <w:bookmarkStart w:id="1032" w:name="_TccToc32"/>
       <w:pPr>
         <w:pStyle w:val="Heading2"/>
         <w:keepNext/>
@@ -5134,6 +7008,7 @@
       <w:r>
         <w:t>5.4 CENTRO DE ESTUDOS</w:t>
       </w:r>
+      <w:bookmarkEnd w:id="1032"/>
     </w:p>
     <w:p>
       <w:pPr>
@@ -5168,6 +7043,7 @@
       </w:r>
     </w:p>
     <w:p>
+      <w:bookmarkStart w:id="1033" w:name="_TccToc33"/>
       <w:pPr>
         <w:pStyle w:val="Heading2"/>
         <w:keepNext/>
@@ -5175,6 +7051,7 @@
       <w:r>
         <w:t>5.5 PROJETOS, CERTIFICADOS E PORTFÓLIO</w:t>
       </w:r>
+      <w:bookmarkEnd w:id="1033"/>
     </w:p>
     <w:p>
       <w:pPr>
@@ -5233,6 +7110,7 @@
       </w:r>
     </w:p>
     <w:p>
+      <w:bookmarkStart w:id="1034" w:name="_TccToc34"/>
       <w:pPr>
         <w:pStyle w:val="Heading2"/>
         <w:keepNext/>
@@ -5240,6 +7118,7 @@
       <w:r>
         <w:t>5.6 MODELO DE DADOS</w:t>
       </w:r>
+      <w:bookmarkEnd w:id="1034"/>
     </w:p>
     <w:p>
       <w:pPr>
@@ -5743,6 +7622,7 @@
       </w:r>
     </w:p>
     <w:p>
+      <w:bookmarkStart w:id="1035" w:name="_TccToc35"/>
       <w:pPr>
         <w:pStyle w:val="Heading2"/>
         <w:keepNext/>
@@ -5750,6 +7630,7 @@
       <w:r>
         <w:t>5.7 REGRAS DE XP E CONSISTÊNCIA</w:t>
       </w:r>
+      <w:bookmarkEnd w:id="1035"/>
     </w:p>
     <w:p>
       <w:pPr>
@@ -5776,6 +7657,7 @@
       </w:r>
     </w:p>
     <w:p>
+      <w:bookmarkStart w:id="1036" w:name="_TccToc36"/>
       <w:pPr>
         <w:pStyle w:val="Heading2"/>
         <w:keepNext/>
@@ -5783,6 +7665,7 @@
       <w:r>
         <w:t>5.8 SEGURANÇA E PRIVACIDADE</w:t>
       </w:r>
+      <w:bookmarkEnd w:id="1036"/>
     </w:p>
     <w:p>
       <w:pPr>
@@ -5893,6 +7776,7 @@
       </w:r>
     </w:p>
     <w:p>
+      <w:bookmarkStart w:id="1037" w:name="_TccToc37"/>
       <w:pPr>
         <w:pStyle w:val="Heading2"/>
         <w:keepNext/>
@@ -5900,6 +7784,7 @@
       <w:r>
         <w:t>5.9 PAINEL ADMINISTRATIVO</w:t>
       </w:r>
+      <w:bookmarkEnd w:id="1037"/>
     </w:p>
     <w:p>
       <w:pPr>
@@ -5914,6 +7799,7 @@
       </w:r>
     </w:p>
     <w:p>
+      <w:bookmarkStart w:id="1038" w:name="_TccToc38"/>
       <w:pPr>
         <w:pStyle w:val="Heading2"/>
         <w:keepNext/>
@@ -5921,6 +7807,7 @@
       <w:r>
         <w:t>5.10 PUBLICAÇÃO</w:t>
       </w:r>
+      <w:bookmarkEnd w:id="1038"/>
     </w:p>
     <w:p>
       <w:pPr>
@@ -5935,6 +7822,7 @@
       </w:r>
     </w:p>
     <w:p>
+      <w:bookmarkStart w:id="1039" w:name="_TccToc39"/>
       <w:pPr>
         <w:pStyle w:val="Heading1"/>
         <w:pageBreakBefore/>
@@ -5943,8 +7831,10 @@
       <w:r>
         <w:t>6 TESTES E RESULTADOS</w:t>
       </w:r>
-    </w:p>
-    <w:p>
+      <w:bookmarkEnd w:id="1039"/>
+    </w:p>
+    <w:p>
+      <w:bookmarkStart w:id="1040" w:name="_TccToc40"/>
       <w:pPr>
         <w:pStyle w:val="Heading2"/>
         <w:keepNext/>
@@ -5952,6 +7842,7 @@
       <w:r>
         <w:t>6.1 ESTRATÉGIA DE TESTES</w:t>
       </w:r>
+      <w:bookmarkEnd w:id="1040"/>
     </w:p>
     <w:p>
       <w:pPr>
@@ -5966,6 +7857,7 @@
       </w:r>
     </w:p>
     <w:p>
+      <w:bookmarkStart w:id="1041" w:name="_TccToc41"/>
       <w:pPr>
         <w:pStyle w:val="Heading2"/>
         <w:keepNext/>
@@ -5973,6 +7865,7 @@
       <w:r>
         <w:t>6.2 RESULTADOS AUTOMATIZADOS</w:t>
       </w:r>
+      <w:bookmarkEnd w:id="1041"/>
     </w:p>
     <w:p>
       <w:pPr>
@@ -6424,6 +8317,7 @@
       </w:r>
     </w:p>
     <w:p>
+      <w:bookmarkStart w:id="1042" w:name="_TccToc42"/>
       <w:pPr>
         <w:pStyle w:val="Heading2"/>
         <w:keepNext/>
@@ -6431,6 +8325,7 @@
       <w:r>
         <w:t>6.3 CENÁRIOS REPRESENTATIVOS</w:t>
       </w:r>
+      <w:bookmarkEnd w:id="1042"/>
     </w:p>
     <w:p>
       <w:pPr>
@@ -6553,6 +8448,7 @@
       </w:r>
     </w:p>
     <w:p>
+      <w:bookmarkStart w:id="1043" w:name="_TccToc43"/>
       <w:pPr>
         <w:pStyle w:val="Heading2"/>
         <w:keepNext/>
@@ -6560,6 +8456,7 @@
       <w:r>
         <w:t>6.4 ANÁLISE DOS RESULTADOS</w:t>
       </w:r>
+      <w:bookmarkEnd w:id="1043"/>
     </w:p>
     <w:p>
       <w:pPr>
@@ -6586,6 +8483,7 @@
       </w:r>
     </w:p>
     <w:p>
+      <w:bookmarkStart w:id="1044" w:name="_TccToc44"/>
       <w:pPr>
         <w:pStyle w:val="Heading2"/>
         <w:keepNext/>
@@ -6593,6 +8491,7 @@
       <w:r>
         <w:t>6.5 VALIDAÇÃO MANUAL RECOMENDADA</w:t>
       </w:r>
+      <w:bookmarkEnd w:id="1044"/>
     </w:p>
     <w:p>
       <w:pPr>
@@ -6607,6 +8506,7 @@
       </w:r>
     </w:p>
     <w:p>
+      <w:bookmarkStart w:id="1045" w:name="_TccToc45"/>
       <w:pPr>
         <w:pStyle w:val="Heading1"/>
         <w:pageBreakBefore/>
@@ -6615,8 +8515,10 @@
       <w:r>
         <w:t>7 DISCUSSÃO, LIMITAÇÕES E TRABALHOS FUTUROS</w:t>
       </w:r>
-    </w:p>
-    <w:p>
+      <w:bookmarkEnd w:id="1045"/>
+    </w:p>
+    <w:p>
+      <w:bookmarkStart w:id="1046" w:name="_TccToc46"/>
       <w:pPr>
         <w:pStyle w:val="Heading2"/>
         <w:keepNext/>
@@ -6624,6 +8526,7 @@
       <w:r>
         <w:t>7.1 CONTRIBUIÇÕES</w:t>
       </w:r>
+      <w:bookmarkEnd w:id="1046"/>
     </w:p>
     <w:p>
       <w:pPr>
@@ -6638,6 +8541,7 @@
       </w:r>
     </w:p>
     <w:p>
+      <w:bookmarkStart w:id="1047" w:name="_TccToc47"/>
       <w:pPr>
         <w:pStyle w:val="Heading2"/>
         <w:keepNext/>
@@ -6645,6 +8549,7 @@
       <w:r>
         <w:t>7.2 LIMITAÇÕES</w:t>
       </w:r>
+      <w:bookmarkEnd w:id="1047"/>
     </w:p>
     <w:p>
       <w:pPr>
@@ -6743,6 +8648,7 @@
       </w:r>
     </w:p>
     <w:p>
+      <w:bookmarkStart w:id="1048" w:name="_TccToc48"/>
       <w:pPr>
         <w:pStyle w:val="Heading2"/>
         <w:keepNext/>
@@ -6750,6 +8656,7 @@
       <w:r>
         <w:t>7.3 POSSIBILIDADES DE EVOLUÇÃO</w:t>
       </w:r>
+      <w:bookmarkEnd w:id="1048"/>
     </w:p>
     <w:p>
       <w:pPr>
@@ -6860,6 +8767,7 @@
       </w:r>
     </w:p>
     <w:p>
+      <w:bookmarkStart w:id="1049" w:name="_TccToc49"/>
       <w:pPr>
         <w:pStyle w:val="Heading1"/>
         <w:pageBreakBefore/>
@@ -6868,6 +8776,7 @@
       <w:r>
         <w:t>8 CONCLUSÃO</w:t>
       </w:r>
+      <w:bookmarkEnd w:id="1049"/>
     </w:p>
     <w:p>
       <w:pPr>
@@ -6906,6 +8815,7 @@
       </w:r>
     </w:p>
     <w:p>
+      <w:bookmarkStart w:id="1050" w:name="_TccToc50"/>
       <w:pPr>
         <w:pStyle w:val="Heading1"/>
         <w:pageBreakBefore/>
@@ -6914,6 +8824,7 @@
       <w:r>
         <w:t>REFERÊNCIAS</w:t>
       </w:r>
+      <w:bookmarkEnd w:id="1050"/>
     </w:p>
     <w:p>
       <w:pPr>
@@ -7112,6 +9023,7 @@
       </w:r>
     </w:p>
     <w:p>
+      <w:bookmarkStart w:id="1051" w:name="_TccToc51"/>
       <w:pPr>
         <w:pStyle w:val="Heading1"/>
         <w:pageBreakBefore/>
@@ -7120,8 +9032,10 @@
       <w:r>
         <w:t>APÊNDICE A — GUIA DE INSTALAÇÃO E EXECUÇÃO</w:t>
       </w:r>
-    </w:p>
-    <w:p>
+      <w:bookmarkEnd w:id="1051"/>
+    </w:p>
+    <w:p>
+      <w:bookmarkStart w:id="1052" w:name="_TccToc52"/>
       <w:pPr>
         <w:pStyle w:val="Heading2"/>
         <w:keepNext/>
@@ -7129,6 +9043,7 @@
       <w:r>
         <w:t>A.1 PRÉ-REQUISITOS</w:t>
       </w:r>
+      <w:bookmarkEnd w:id="1052"/>
     </w:p>
     <w:p>
       <w:pPr>
@@ -7179,6 +9094,7 @@
       </w:r>
     </w:p>
     <w:p>
+      <w:bookmarkStart w:id="1053" w:name="_TccToc53"/>
       <w:pPr>
         <w:pStyle w:val="Heading2"/>
         <w:keepNext/>
@@ -7186,6 +9102,7 @@
       <w:r>
         <w:t>A.2 EXECUÇÃO LOCAL</w:t>
       </w:r>
+      <w:bookmarkEnd w:id="1053"/>
     </w:p>
     <w:p>
       <w:pPr>
@@ -7258,6 +9175,7 @@
       </w:r>
     </w:p>
     <w:p>
+      <w:bookmarkStart w:id="1054" w:name="_TccToc54"/>
       <w:pPr>
         <w:pStyle w:val="Heading2"/>
         <w:keepNext/>
@@ -7265,6 +9183,7 @@
       <w:r>
         <w:t>A.3 CONFIGURAÇÃO DO BANCO</w:t>
       </w:r>
+      <w:bookmarkEnd w:id="1054"/>
     </w:p>
     <w:p>
       <w:pPr>
@@ -7342,6 +9261,7 @@
       </w:r>
     </w:p>
     <w:p>
+      <w:bookmarkStart w:id="1055" w:name="_TccToc55"/>
       <w:pPr>
         <w:pStyle w:val="Heading2"/>
         <w:keepNext/>
@@ -7349,6 +9269,7 @@
       <w:r>
         <w:t>A.4 TESTES</w:t>
       </w:r>
+      <w:bookmarkEnd w:id="1055"/>
     </w:p>
     <w:p>
       <w:pPr>
@@ -7411,6 +9332,7 @@
       </w:r>
     </w:p>
     <w:p>
+      <w:bookmarkStart w:id="1056" w:name="_TccToc56"/>
       <w:pPr>
         <w:pStyle w:val="Heading1"/>
         <w:pageBreakBefore/>
@@ -7419,6 +9341,7 @@
       <w:r>
         <w:t>APÊNDICE B — ROTEIRO DE VALIDAÇÃO MANUAL</w:t>
       </w:r>
+      <w:bookmarkEnd w:id="1056"/>
     </w:p>
     <w:p>
       <w:pPr>
@@ -7998,6 +9921,7 @@
       </w:r>
     </w:p>
     <w:p>
+      <w:bookmarkStart w:id="1057" w:name="_TccToc57"/>
       <w:pPr>
         <w:pStyle w:val="Heading1"/>
         <w:pageBreakBefore/>
@@ -8006,6 +9930,7 @@
       <w:r>
         <w:t>APÊNDICE C — CAMPOS A CONFERIR ANTES DA ENTREGA</w:t>
       </w:r>
+      <w:bookmarkEnd w:id="1057"/>
     </w:p>
     <w:p>
       <w:pPr>
@@ -8097,7 +10022,7 @@
       <w:pgMar w:top="1701" w:right="1134" w:bottom="1134" w:left="1701" w:header="1134" w:footer="709" w:gutter="0"/>
       <w:cols w:space="720"/>
       <w:docGrid w:linePitch="360"/>
-      <w:pgNumType w:start="9"/>
+      <w:pgNumType w:start="10"/>
     </w:sectPr>
   </w:body>
 </w:document>

</xml_diff>

<commit_message>
docs: finaliza TCC ABNT com capturas do sistema
Co-authored-by: arena-agent <297053741+arena-agent@users.noreply.github.com>
</commit_message>
<xml_diff>
--- a/docs/TCC-Pratica-dev-2.0-editavel.docx
+++ b/docs/TCC-Pratica-dev-2.0-editavel.docx
@@ -1407,7 +1407,7 @@
           <w:b w:val="0"/>
           <w:i w:val="0"/>
         </w:rPr>
-        <w:t>Este trabalho apresenta o desenvolvimento do Pratica.dev 2.0, uma plataforma web educacional gamificada destinada a estudantes de cursos técnicos de Desenvolvimento de Sistemas. O problema abordado é a dispersão de conteúdos, atividades práticas e evidências de aprendizagem em diferentes ferramentas, situação que dificulta ao estudante visualizar sua evolução e organizar uma trilha de estudos. Como solução, foi construída uma aplicação de página única que reúne cadastro e autenticação, quiz de nivelamento, centro de estudos com doze matérias, testes rápidos, projetos com briefing, sistema de experiência, certificados e portfólio público. O frontend utiliza HTML5, CSS3 e JavaScript, enquanto autenticação, persistência, armazenamento e controle de acesso são fornecidos pelo Supabase, com PostgreSQL, Row Level Security e funções RPC. O desenvolvimento adotou abordagem aplicada, incremental e orientada a protótipos, com requisitos extraídos da jornada do estudante e validação por testes automatizados. Foram executadas 259 verificações distribuídas entre testes de regressão, jornada completa e verificações adicionais; todas foram aprovadas no ambiente de desenvolvimento em 1º de outubro de 2026. Os resultados indicam que a solução implementa os fluxos essenciais propostos e mantém controles de privacidade para dados pessoais, portfólios e imagens de perfil. Conclui-se que o produto funciona como apoio à organização do aprendizado e à apresentação das competências desenvolvidas, permanecendo como possibilidades futuras a ampliação do conteúdo, métricas de aprendizagem, acessibilidade e avaliação com usuários reais.</w:t>
+        <w:t>Este trabalho apresenta o desenvolvimento do Pratica.dev 2.0, uma plataforma web educacional gamificada destinada a estudantes de cursos técnicos de Desenvolvimento de Sistemas. O problema abordado é a dispersão de conteúdos, atividades práticas e evidências de aprendizagem em diferentes ferramentas, situação que dificulta ao estudante visualizar sua evolução e organizar uma trilha de estudos. Como solução, foi construída uma aplicação de página única que reúne cadastro e autenticação, quiz de nivelamento, centro de estudos com doze matérias, testes rápidos, projetos com briefing, sistema de experiência, certificados e portfólio público. O frontend utiliza HTML5, CSS3 e JavaScript, enquanto autenticação, persistência, armazenamento e controle de acesso são fornecidos pelo Supabase, com PostgreSQL, Row Level Security e funções RPC. O desenvolvimento adotou abordagem aplicada, incremental e orientada a protótipos, com requisitos extraídos da jornada do estudante e validação por testes automatizados. Foram executadas 259 verificações distribuídas entre testes de regressão, jornada completa e verificações adicionais; todas foram aprovadas no ambiente de desenvolvimento em 6 de outubro de 2026. Os resultados indicam que a solução implementa os fluxos essenciais propostos e mantém controles de privacidade para dados pessoais, portfólios e imagens de perfil. Conclui-se que o produto funciona como apoio à organização do aprendizado e à apresentação das competências desenvolvidas, permanecendo como possibilidades futuras a ampliação do conteúdo, métricas de aprendizagem, acessibilidade e avaliação com usuários reais.</w:t>
       </w:r>
     </w:p>
     <w:p>
@@ -1428,7 +1428,429 @@
         <w:t xml:space="preserve">Palavras-chave: </w:t>
       </w:r>
       <w:r>
-        <w:t>educação tecnológica. Gamificação. Desenvolvimento de sistemas. Aplicação web. Portfólio digital.</w:t>
+        <w:t>educação tecnológica; gamificação; desenvolvimento de sistemas; aplicação web; portfólio digital.</w:t>
+      </w:r>
+    </w:p>
+    <w:p>
+      <w:pPr>
+        <w:pStyle w:val="PreTextual"/>
+      </w:pPr>
+      <w:r>
+        <w:t>ABSTRACT</w:t>
+      </w:r>
+    </w:p>
+    <w:p>
+      <w:pPr>
+        <w:spacing w:before="0" w:after="0" w:line="360" w:lineRule="auto"/>
+        <w:ind w:firstLine="0"/>
+      </w:pPr>
+      <w:r>
+        <w:rPr>
+          <w:b w:val="0"/>
+          <w:i w:val="0"/>
+        </w:rPr>
+        <w:t>This work presents the development of Pratica.dev 2.0, a gamified educational web platform aimed at students enrolled in technical Systems Development programs. The problem addressed is the fragmentation of content, practical activities and evidence of learning across different tools, which makes it difficult for students to visualize their progress and organize a study path. The proposed solution is a single-page application that combines registration and authentication, a placement quiz, a study center with twelve subjects, quick tests, projects with professional-style briefs, an experience system, certificates and a public portfolio. The frontend uses HTML5, CSS3 and JavaScript, while authentication, persistence, storage and access control are provided by Supabase with PostgreSQL, Row Level Security and RPC functions. The development adopted an applied, incremental and prototype-oriented approach, with requirements derived from the student journey and validation through automated tests. A total of 259 checks were performed across regression, complete journey and additional verification suites, all of which passed in the development environment. The results indicate that the solution implements the proposed core workflows and maintains privacy controls for personal data, portfolios and profile images. It is concluded that the product supports the organization of learning and the presentation of acquired skills, while future improvements may include broader content, learning analytics, accessibility enhancements and evaluations with real users.</w:t>
+      </w:r>
+    </w:p>
+    <w:p>
+      <w:pPr>
+        <w:spacing w:before="240" w:after="0"/>
+        <w:ind w:firstLine="0"/>
+      </w:pPr>
+      <w:r>
+        <w:rPr>
+          <w:b w:val="0"/>
+          <w:i w:val="0"/>
+        </w:rPr>
+      </w:r>
+      <w:r>
+        <w:rPr>
+          <w:b/>
+        </w:rPr>
+        <w:t xml:space="preserve">Keywords: </w:t>
+      </w:r>
+      <w:r>
+        <w:t>technology education; gamification; systems development; web application; digital portfolio.</w:t>
+      </w:r>
+    </w:p>
+    <w:p>
+      <w:pPr>
+        <w:pStyle w:val="PreTextual"/>
+      </w:pPr>
+      <w:r>
+        <w:t>LISTA DE FIGURAS</w:t>
+      </w:r>
+    </w:p>
+    <w:p>
+      <w:pPr>
+        <w:pStyle w:val="Semrecuo"/>
+        <w:tabs>
+          <w:tab w:pos="8787" w:val="right" w:leader="dot"/>
+        </w:tabs>
+        <w:spacing w:line="240" w:lineRule="auto" w:after="100"/>
+        <w:ind w:firstLine="0"/>
+      </w:pPr>
+      <w:r>
+        <w:rPr>
+          <w:rFonts w:ascii="Arial" w:hAnsi="Arial"/>
+          <w:sz w:val="20"/>
+        </w:rPr>
+        <w:t>Figura 1 – Visão geral da arquitetura do sistema</w:t>
+      </w:r>
+      <w:r>
+        <w:tab/>
+      </w:r>
+      <w:r>
+        <w:rPr>
+          <w:rFonts w:ascii="Arial" w:hAnsi="Arial"/>
+          <w:sz w:val="20"/>
+        </w:rPr>
+        <w:fldChar w:fldCharType="begin" w:dirty="true"/>
+        <w:instrText xml:space="preserve"> PAGEREF _TccFig1 \h </w:instrText>
+        <w:fldChar w:fldCharType="separate"/>
+        <w:t>26</w:t>
+        <w:fldChar w:fldCharType="end"/>
+      </w:r>
+    </w:p>
+    <w:p>
+      <w:pPr>
+        <w:pStyle w:val="Semrecuo"/>
+        <w:tabs>
+          <w:tab w:pos="8787" w:val="right" w:leader="dot"/>
+        </w:tabs>
+        <w:spacing w:line="240" w:lineRule="auto" w:after="100"/>
+        <w:ind w:firstLine="0"/>
+      </w:pPr>
+      <w:r>
+        <w:rPr>
+          <w:rFonts w:ascii="Arial" w:hAnsi="Arial"/>
+          <w:sz w:val="20"/>
+        </w:rPr>
+        <w:t>Figura 2 – Painel principal e acompanhamento do progresso do estudante</w:t>
+      </w:r>
+      <w:r>
+        <w:tab/>
+      </w:r>
+      <w:r>
+        <w:rPr>
+          <w:rFonts w:ascii="Arial" w:hAnsi="Arial"/>
+          <w:sz w:val="20"/>
+        </w:rPr>
+        <w:fldChar w:fldCharType="begin" w:dirty="true"/>
+        <w:instrText xml:space="preserve"> PAGEREF _TccFig2 \h </w:instrText>
+        <w:fldChar w:fldCharType="separate"/>
+        <w:t>28</w:t>
+        <w:fldChar w:fldCharType="end"/>
+      </w:r>
+    </w:p>
+    <w:p>
+      <w:pPr>
+        <w:pStyle w:val="Semrecuo"/>
+        <w:tabs>
+          <w:tab w:pos="8787" w:val="right" w:leader="dot"/>
+        </w:tabs>
+        <w:spacing w:line="240" w:lineRule="auto" w:after="100"/>
+        <w:ind w:firstLine="0"/>
+      </w:pPr>
+      <w:r>
+        <w:rPr>
+          <w:rFonts w:ascii="Arial" w:hAnsi="Arial"/>
+          <w:sz w:val="20"/>
+        </w:rPr>
+        <w:t>Figura 3 – Fluxo principal do estudante</w:t>
+      </w:r>
+      <w:r>
+        <w:tab/>
+      </w:r>
+      <w:r>
+        <w:rPr>
+          <w:rFonts w:ascii="Arial" w:hAnsi="Arial"/>
+          <w:sz w:val="20"/>
+        </w:rPr>
+        <w:fldChar w:fldCharType="begin" w:dirty="true"/>
+        <w:instrText xml:space="preserve"> PAGEREF _TccFig3 \h </w:instrText>
+        <w:fldChar w:fldCharType="separate"/>
+        <w:t>29</w:t>
+        <w:fldChar w:fldCharType="end"/>
+      </w:r>
+    </w:p>
+    <w:p>
+      <w:pPr>
+        <w:pStyle w:val="Semrecuo"/>
+        <w:tabs>
+          <w:tab w:pos="8787" w:val="right" w:leader="dot"/>
+        </w:tabs>
+        <w:spacing w:line="240" w:lineRule="auto" w:after="100"/>
+        <w:ind w:firstLine="0"/>
+      </w:pPr>
+      <w:r>
+        <w:rPr>
+          <w:rFonts w:ascii="Arial" w:hAnsi="Arial"/>
+          <w:sz w:val="20"/>
+        </w:rPr>
+        <w:t>Figura 4 – Centro de Estudos e trilha recomendada</w:t>
+      </w:r>
+      <w:r>
+        <w:tab/>
+      </w:r>
+      <w:r>
+        <w:rPr>
+          <w:rFonts w:ascii="Arial" w:hAnsi="Arial"/>
+          <w:sz w:val="20"/>
+        </w:rPr>
+        <w:fldChar w:fldCharType="begin" w:dirty="true"/>
+        <w:instrText xml:space="preserve"> PAGEREF _TccFig4 \h </w:instrText>
+        <w:fldChar w:fldCharType="separate"/>
+        <w:t>30</w:t>
+        <w:fldChar w:fldCharType="end"/>
+      </w:r>
+    </w:p>
+    <w:p>
+      <w:pPr>
+        <w:pStyle w:val="Semrecuo"/>
+        <w:tabs>
+          <w:tab w:pos="8787" w:val="right" w:leader="dot"/>
+        </w:tabs>
+        <w:spacing w:line="240" w:lineRule="auto" w:after="100"/>
+        <w:ind w:firstLine="0"/>
+      </w:pPr>
+      <w:r>
+        <w:rPr>
+          <w:rFonts w:ascii="Arial" w:hAnsi="Arial"/>
+          <w:sz w:val="20"/>
+        </w:rPr>
+        <w:t>Figura 5 – Catálogo de projetos práticos e acesso aos briefings</w:t>
+      </w:r>
+      <w:r>
+        <w:tab/>
+      </w:r>
+      <w:r>
+        <w:rPr>
+          <w:rFonts w:ascii="Arial" w:hAnsi="Arial"/>
+          <w:sz w:val="20"/>
+        </w:rPr>
+        <w:fldChar w:fldCharType="begin" w:dirty="true"/>
+        <w:instrText xml:space="preserve"> PAGEREF _TccFig5 \h </w:instrText>
+        <w:fldChar w:fldCharType="separate"/>
+        <w:t>32</w:t>
+        <w:fldChar w:fldCharType="end"/>
+      </w:r>
+    </w:p>
+    <w:p>
+      <w:pPr>
+        <w:pStyle w:val="Semrecuo"/>
+        <w:tabs>
+          <w:tab w:pos="8787" w:val="right" w:leader="dot"/>
+        </w:tabs>
+        <w:spacing w:line="240" w:lineRule="auto" w:after="100"/>
+        <w:ind w:firstLine="0"/>
+      </w:pPr>
+      <w:r>
+        <w:rPr>
+          <w:rFonts w:ascii="Arial" w:hAnsi="Arial"/>
+          <w:sz w:val="20"/>
+        </w:rPr>
+        <w:t>Figura 6 – Certificados emitidos após a conclusão dos exercícios</w:t>
+      </w:r>
+      <w:r>
+        <w:tab/>
+      </w:r>
+      <w:r>
+        <w:rPr>
+          <w:rFonts w:ascii="Arial" w:hAnsi="Arial"/>
+          <w:sz w:val="20"/>
+        </w:rPr>
+        <w:fldChar w:fldCharType="begin" w:dirty="true"/>
+        <w:instrText xml:space="preserve"> PAGEREF _TccFig6 \h </w:instrText>
+        <w:fldChar w:fldCharType="separate"/>
+        <w:t>33</w:t>
+        <w:fldChar w:fldCharType="end"/>
+      </w:r>
+    </w:p>
+    <w:p>
+      <w:pPr>
+        <w:pStyle w:val="Semrecuo"/>
+        <w:tabs>
+          <w:tab w:pos="8787" w:val="right" w:leader="dot"/>
+        </w:tabs>
+        <w:spacing w:line="240" w:lineRule="auto" w:after="100"/>
+        <w:ind w:firstLine="0"/>
+      </w:pPr>
+      <w:r>
+        <w:rPr>
+          <w:rFonts w:ascii="Arial" w:hAnsi="Arial"/>
+          <w:sz w:val="20"/>
+        </w:rPr>
+        <w:t>Figura 7 – Portfólio digital e controle de publicação</w:t>
+      </w:r>
+      <w:r>
+        <w:tab/>
+      </w:r>
+      <w:r>
+        <w:rPr>
+          <w:rFonts w:ascii="Arial" w:hAnsi="Arial"/>
+          <w:sz w:val="20"/>
+        </w:rPr>
+        <w:fldChar w:fldCharType="begin" w:dirty="true"/>
+        <w:instrText xml:space="preserve"> PAGEREF _TccFig7 \h </w:instrText>
+        <w:fldChar w:fldCharType="separate"/>
+        <w:t>34</w:t>
+        <w:fldChar w:fldCharType="end"/>
+      </w:r>
+    </w:p>
+    <w:p>
+      <w:pPr>
+        <w:pStyle w:val="Semrecuo"/>
+        <w:tabs>
+          <w:tab w:pos="8787" w:val="right" w:leader="dot"/>
+        </w:tabs>
+        <w:spacing w:line="240" w:lineRule="auto" w:after="100"/>
+        <w:ind w:firstLine="0"/>
+      </w:pPr>
+      <w:r>
+        <w:rPr>
+          <w:rFonts w:ascii="Arial" w:hAnsi="Arial"/>
+          <w:sz w:val="20"/>
+        </w:rPr>
+        <w:t>Figura 8 – Relacionamento lógico entre as entidades</w:t>
+      </w:r>
+      <w:r>
+        <w:tab/>
+      </w:r>
+      <w:r>
+        <w:rPr>
+          <w:rFonts w:ascii="Arial" w:hAnsi="Arial"/>
+          <w:sz w:val="20"/>
+        </w:rPr>
+        <w:fldChar w:fldCharType="begin" w:dirty="true"/>
+        <w:instrText xml:space="preserve"> PAGEREF _TccFig8 \h </w:instrText>
+        <w:fldChar w:fldCharType="separate"/>
+        <w:t>35</w:t>
+        <w:fldChar w:fldCharType="end"/>
+      </w:r>
+    </w:p>
+    <w:p>
+      <w:pPr>
+        <w:pStyle w:val="Semrecuo"/>
+        <w:tabs>
+          <w:tab w:pos="8787" w:val="right" w:leader="dot"/>
+        </w:tabs>
+        <w:spacing w:line="240" w:lineRule="auto" w:after="100"/>
+        <w:ind w:firstLine="0"/>
+      </w:pPr>
+      <w:r>
+        <w:rPr>
+          <w:rFonts w:ascii="Arial" w:hAnsi="Arial"/>
+          <w:sz w:val="20"/>
+        </w:rPr>
+        <w:t>Figura 9 – Painel administrativo com dados pessoais protegidos</w:t>
+      </w:r>
+      <w:r>
+        <w:tab/>
+      </w:r>
+      <w:r>
+        <w:rPr>
+          <w:rFonts w:ascii="Arial" w:hAnsi="Arial"/>
+          <w:sz w:val="20"/>
+        </w:rPr>
+        <w:fldChar w:fldCharType="begin" w:dirty="true"/>
+        <w:instrText xml:space="preserve"> PAGEREF _TccFig9 \h </w:instrText>
+        <w:fldChar w:fldCharType="separate"/>
+        <w:t>37</w:t>
+        <w:fldChar w:fldCharType="end"/>
+      </w:r>
+    </w:p>
+    <w:p>
+      <w:pPr>
+        <w:pStyle w:val="Semrecuo"/>
+        <w:tabs>
+          <w:tab w:pos="8787" w:val="right" w:leader="dot"/>
+        </w:tabs>
+        <w:spacing w:line="240" w:lineRule="auto" w:after="100"/>
+        <w:ind w:firstLine="0"/>
+      </w:pPr>
+      <w:r>
+        <w:rPr>
+          <w:rFonts w:ascii="Arial" w:hAnsi="Arial"/>
+          <w:sz w:val="20"/>
+        </w:rPr>
+        <w:t>Figura 10 – Perfil do estudante e informações acadêmicas</w:t>
+      </w:r>
+      <w:r>
+        <w:tab/>
+      </w:r>
+      <w:r>
+        <w:rPr>
+          <w:rFonts w:ascii="Arial" w:hAnsi="Arial"/>
+          <w:sz w:val="20"/>
+        </w:rPr>
+        <w:fldChar w:fldCharType="begin" w:dirty="true"/>
+        <w:instrText xml:space="preserve"> PAGEREF _TccFig10 \h </w:instrText>
+        <w:fldChar w:fldCharType="separate"/>
+        <w:t>38</w:t>
+        <w:fldChar w:fldCharType="end"/>
+      </w:r>
+    </w:p>
+    <w:p>
+      <w:pPr>
+        <w:pStyle w:val="Semrecuo"/>
+        <w:tabs>
+          <w:tab w:pos="8787" w:val="right" w:leader="dot"/>
+        </w:tabs>
+        <w:spacing w:line="240" w:lineRule="auto" w:after="100"/>
+        <w:ind w:firstLine="0"/>
+      </w:pPr>
+      <w:r>
+        <w:rPr>
+          <w:rFonts w:ascii="Arial" w:hAnsi="Arial"/>
+          <w:sz w:val="20"/>
+        </w:rPr>
+        <w:t>Figura 11 – Relação entre matérias e possibilidades de carreira</w:t>
+      </w:r>
+      <w:r>
+        <w:tab/>
+      </w:r>
+      <w:r>
+        <w:rPr>
+          <w:rFonts w:ascii="Arial" w:hAnsi="Arial"/>
+          <w:sz w:val="20"/>
+        </w:rPr>
+        <w:fldChar w:fldCharType="begin" w:dirty="true"/>
+        <w:instrText xml:space="preserve"> PAGEREF _TccFig11 \h </w:instrText>
+        <w:fldChar w:fldCharType="separate"/>
+        <w:t>39</w:t>
+        <w:fldChar w:fldCharType="end"/>
+      </w:r>
+    </w:p>
+    <w:p>
+      <w:pPr>
+        <w:pStyle w:val="Semrecuo"/>
+        <w:tabs>
+          <w:tab w:pos="8787" w:val="right" w:leader="dot"/>
+        </w:tabs>
+        <w:spacing w:line="240" w:lineRule="auto" w:after="100"/>
+        <w:ind w:firstLine="0"/>
+      </w:pPr>
+      <w:r>
+        <w:rPr>
+          <w:rFonts w:ascii="Arial" w:hAnsi="Arial"/>
+          <w:sz w:val="20"/>
+        </w:rPr>
+        <w:t>Figura 12 – Apresentação dos conteúdos do Curso Técnico</w:t>
+      </w:r>
+      <w:r>
+        <w:tab/>
+      </w:r>
+      <w:r>
+        <w:rPr>
+          <w:rFonts w:ascii="Arial" w:hAnsi="Arial"/>
+          <w:sz w:val="20"/>
+        </w:rPr>
+        <w:fldChar w:fldCharType="begin" w:dirty="true"/>
+        <w:instrText xml:space="preserve"> PAGEREF _TccFig12 \h </w:instrText>
+        <w:fldChar w:fldCharType="separate"/>
+        <w:t>40</w:t>
+        <w:fldChar w:fldCharType="end"/>
       </w:r>
     </w:p>
     <w:p>
@@ -1644,7 +2066,7 @@
         <w:fldChar w:fldCharType="begin" w:dirty="true"/>
         <w:instrText xml:space="preserve"> PAGEREF _TccToc1 \h </w:instrText>
         <w:fldChar w:fldCharType="separate"/>
-        <w:t>10</w:t>
+        <w:t>12</w:t>
         <w:fldChar w:fldCharType="end"/>
       </w:r>
     </w:p>
@@ -1676,7 +2098,7 @@
         <w:fldChar w:fldCharType="begin" w:dirty="true"/>
         <w:instrText xml:space="preserve"> PAGEREF _TccToc2 \h </w:instrText>
         <w:fldChar w:fldCharType="separate"/>
-        <w:t>10</w:t>
+        <w:t>12</w:t>
         <w:fldChar w:fldCharType="end"/>
       </w:r>
     </w:p>
@@ -1708,7 +2130,7 @@
         <w:fldChar w:fldCharType="begin" w:dirty="true"/>
         <w:instrText xml:space="preserve"> PAGEREF _TccToc3 \h </w:instrText>
         <w:fldChar w:fldCharType="separate"/>
-        <w:t>10</w:t>
+        <w:t>12</w:t>
         <w:fldChar w:fldCharType="end"/>
       </w:r>
     </w:p>
@@ -1740,7 +2162,7 @@
         <w:fldChar w:fldCharType="begin" w:dirty="true"/>
         <w:instrText xml:space="preserve"> PAGEREF _TccToc4 \h </w:instrText>
         <w:fldChar w:fldCharType="separate"/>
-        <w:t>10</w:t>
+        <w:t>12</w:t>
         <w:fldChar w:fldCharType="end"/>
       </w:r>
     </w:p>
@@ -1772,7 +2194,7 @@
         <w:fldChar w:fldCharType="begin" w:dirty="true"/>
         <w:instrText xml:space="preserve"> PAGEREF _TccToc5 \h </w:instrText>
         <w:fldChar w:fldCharType="separate"/>
-        <w:t>11</w:t>
+        <w:t>13</w:t>
         <w:fldChar w:fldCharType="end"/>
       </w:r>
     </w:p>
@@ -1804,7 +2226,7 @@
         <w:fldChar w:fldCharType="begin" w:dirty="true"/>
         <w:instrText xml:space="preserve"> PAGEREF _TccToc6 \h </w:instrText>
         <w:fldChar w:fldCharType="separate"/>
-        <w:t>11</w:t>
+        <w:t>13</w:t>
         <w:fldChar w:fldCharType="end"/>
       </w:r>
     </w:p>
@@ -1836,7 +2258,7 @@
         <w:fldChar w:fldCharType="begin" w:dirty="true"/>
         <w:instrText xml:space="preserve"> PAGEREF _TccToc7 \h </w:instrText>
         <w:fldChar w:fldCharType="separate"/>
-        <w:t>11</w:t>
+        <w:t>13</w:t>
         <w:fldChar w:fldCharType="end"/>
       </w:r>
     </w:p>
@@ -1868,7 +2290,7 @@
         <w:fldChar w:fldCharType="begin" w:dirty="true"/>
         <w:instrText xml:space="preserve"> PAGEREF _TccToc8 \h </w:instrText>
         <w:fldChar w:fldCharType="separate"/>
-        <w:t>12</w:t>
+        <w:t>14</w:t>
         <w:fldChar w:fldCharType="end"/>
       </w:r>
     </w:p>
@@ -1900,7 +2322,7 @@
         <w:fldChar w:fldCharType="begin" w:dirty="true"/>
         <w:instrText xml:space="preserve"> PAGEREF _TccToc9 \h </w:instrText>
         <w:fldChar w:fldCharType="separate"/>
-        <w:t>13</w:t>
+        <w:t>15</w:t>
         <w:fldChar w:fldCharType="end"/>
       </w:r>
     </w:p>
@@ -1932,7 +2354,7 @@
         <w:fldChar w:fldCharType="begin" w:dirty="true"/>
         <w:instrText xml:space="preserve"> PAGEREF _TccToc10 \h </w:instrText>
         <w:fldChar w:fldCharType="separate"/>
-        <w:t>13</w:t>
+        <w:t>15</w:t>
         <w:fldChar w:fldCharType="end"/>
       </w:r>
     </w:p>
@@ -1964,7 +2386,7 @@
         <w:fldChar w:fldCharType="begin" w:dirty="true"/>
         <w:instrText xml:space="preserve"> PAGEREF _TccToc11 \h </w:instrText>
         <w:fldChar w:fldCharType="separate"/>
-        <w:t>13</w:t>
+        <w:t>15</w:t>
         <w:fldChar w:fldCharType="end"/>
       </w:r>
     </w:p>
@@ -1996,7 +2418,7 @@
         <w:fldChar w:fldCharType="begin" w:dirty="true"/>
         <w:instrText xml:space="preserve"> PAGEREF _TccToc12 \h </w:instrText>
         <w:fldChar w:fldCharType="separate"/>
-        <w:t>13</w:t>
+        <w:t>15</w:t>
         <w:fldChar w:fldCharType="end"/>
       </w:r>
     </w:p>
@@ -2028,7 +2450,7 @@
         <w:fldChar w:fldCharType="begin" w:dirty="true"/>
         <w:instrText xml:space="preserve"> PAGEREF _TccToc13 \h </w:instrText>
         <w:fldChar w:fldCharType="separate"/>
-        <w:t>14</w:t>
+        <w:t>16</w:t>
         <w:fldChar w:fldCharType="end"/>
       </w:r>
     </w:p>
@@ -2060,7 +2482,7 @@
         <w:fldChar w:fldCharType="begin" w:dirty="true"/>
         <w:instrText xml:space="preserve"> PAGEREF _TccToc14 \h </w:instrText>
         <w:fldChar w:fldCharType="separate"/>
-        <w:t>14</w:t>
+        <w:t>16</w:t>
         <w:fldChar w:fldCharType="end"/>
       </w:r>
     </w:p>
@@ -2092,7 +2514,7 @@
         <w:fldChar w:fldCharType="begin" w:dirty="true"/>
         <w:instrText xml:space="preserve"> PAGEREF _TccToc15 \h </w:instrText>
         <w:fldChar w:fldCharType="separate"/>
-        <w:t>14</w:t>
+        <w:t>16</w:t>
         <w:fldChar w:fldCharType="end"/>
       </w:r>
     </w:p>
@@ -2124,7 +2546,7 @@
         <w:fldChar w:fldCharType="begin" w:dirty="true"/>
         <w:instrText xml:space="preserve"> PAGEREF _TccToc16 \h </w:instrText>
         <w:fldChar w:fldCharType="separate"/>
-        <w:t>16</w:t>
+        <w:t>18</w:t>
         <w:fldChar w:fldCharType="end"/>
       </w:r>
     </w:p>
@@ -2156,7 +2578,7 @@
         <w:fldChar w:fldCharType="begin" w:dirty="true"/>
         <w:instrText xml:space="preserve"> PAGEREF _TccToc17 \h </w:instrText>
         <w:fldChar w:fldCharType="separate"/>
-        <w:t>16</w:t>
+        <w:t>18</w:t>
         <w:fldChar w:fldCharType="end"/>
       </w:r>
     </w:p>
@@ -2188,7 +2610,7 @@
         <w:fldChar w:fldCharType="begin" w:dirty="true"/>
         <w:instrText xml:space="preserve"> PAGEREF _TccToc18 \h </w:instrText>
         <w:fldChar w:fldCharType="separate"/>
-        <w:t>16</w:t>
+        <w:t>18</w:t>
         <w:fldChar w:fldCharType="end"/>
       </w:r>
     </w:p>
@@ -2220,7 +2642,7 @@
         <w:fldChar w:fldCharType="begin" w:dirty="true"/>
         <w:instrText xml:space="preserve"> PAGEREF _TccToc19 \h </w:instrText>
         <w:fldChar w:fldCharType="separate"/>
-        <w:t>16</w:t>
+        <w:t>18</w:t>
         <w:fldChar w:fldCharType="end"/>
       </w:r>
     </w:p>
@@ -2252,7 +2674,7 @@
         <w:fldChar w:fldCharType="begin" w:dirty="true"/>
         <w:instrText xml:space="preserve"> PAGEREF _TccToc20 \h </w:instrText>
         <w:fldChar w:fldCharType="separate"/>
-        <w:t>17</w:t>
+        <w:t>19</w:t>
         <w:fldChar w:fldCharType="end"/>
       </w:r>
     </w:p>
@@ -2284,7 +2706,7 @@
         <w:fldChar w:fldCharType="begin" w:dirty="true"/>
         <w:instrText xml:space="preserve"> PAGEREF _TccToc21 \h </w:instrText>
         <w:fldChar w:fldCharType="separate"/>
-        <w:t>17</w:t>
+        <w:t>19</w:t>
         <w:fldChar w:fldCharType="end"/>
       </w:r>
     </w:p>
@@ -2316,7 +2738,7 @@
         <w:fldChar w:fldCharType="begin" w:dirty="true"/>
         <w:instrText xml:space="preserve"> PAGEREF _TccToc22 \h </w:instrText>
         <w:fldChar w:fldCharType="separate"/>
-        <w:t>19</w:t>
+        <w:t>21</w:t>
         <w:fldChar w:fldCharType="end"/>
       </w:r>
     </w:p>
@@ -2348,7 +2770,7 @@
         <w:fldChar w:fldCharType="begin" w:dirty="true"/>
         <w:instrText xml:space="preserve"> PAGEREF _TccToc23 \h </w:instrText>
         <w:fldChar w:fldCharType="separate"/>
-        <w:t>19</w:t>
+        <w:t>21</w:t>
         <w:fldChar w:fldCharType="end"/>
       </w:r>
     </w:p>
@@ -2380,7 +2802,7 @@
         <w:fldChar w:fldCharType="begin" w:dirty="true"/>
         <w:instrText xml:space="preserve"> PAGEREF _TccToc24 \h </w:instrText>
         <w:fldChar w:fldCharType="separate"/>
-        <w:t>19</w:t>
+        <w:t>21</w:t>
         <w:fldChar w:fldCharType="end"/>
       </w:r>
     </w:p>
@@ -2412,7 +2834,7 @@
         <w:fldChar w:fldCharType="begin" w:dirty="true"/>
         <w:instrText xml:space="preserve"> PAGEREF _TccToc25 \h </w:instrText>
         <w:fldChar w:fldCharType="separate"/>
-        <w:t>19</w:t>
+        <w:t>21</w:t>
         <w:fldChar w:fldCharType="end"/>
       </w:r>
     </w:p>
@@ -2444,7 +2866,7 @@
         <w:fldChar w:fldCharType="begin" w:dirty="true"/>
         <w:instrText xml:space="preserve"> PAGEREF _TccToc26 \h </w:instrText>
         <w:fldChar w:fldCharType="separate"/>
-        <w:t>20</w:t>
+        <w:t>22</w:t>
         <w:fldChar w:fldCharType="end"/>
       </w:r>
     </w:p>
@@ -2476,7 +2898,7 @@
         <w:fldChar w:fldCharType="begin" w:dirty="true"/>
         <w:instrText xml:space="preserve"> PAGEREF _TccToc27 \h </w:instrText>
         <w:fldChar w:fldCharType="separate"/>
-        <w:t>20</w:t>
+        <w:t>22</w:t>
         <w:fldChar w:fldCharType="end"/>
       </w:r>
     </w:p>
@@ -2508,7 +2930,7 @@
         <w:fldChar w:fldCharType="begin" w:dirty="true"/>
         <w:instrText xml:space="preserve"> PAGEREF _TccToc28 \h </w:instrText>
         <w:fldChar w:fldCharType="separate"/>
-        <w:t>23</w:t>
+        <w:t>25</w:t>
         <w:fldChar w:fldCharType="end"/>
       </w:r>
     </w:p>
@@ -2540,7 +2962,7 @@
         <w:fldChar w:fldCharType="begin" w:dirty="true"/>
         <w:instrText xml:space="preserve"> PAGEREF _TccToc29 \h </w:instrText>
         <w:fldChar w:fldCharType="separate"/>
-        <w:t>23</w:t>
+        <w:t>25</w:t>
         <w:fldChar w:fldCharType="end"/>
       </w:r>
     </w:p>
@@ -2572,7 +2994,7 @@
         <w:fldChar w:fldCharType="begin" w:dirty="true"/>
         <w:instrText xml:space="preserve"> PAGEREF _TccToc30 \h </w:instrText>
         <w:fldChar w:fldCharType="separate"/>
-        <w:t>23</w:t>
+        <w:t>25</w:t>
         <w:fldChar w:fldCharType="end"/>
       </w:r>
     </w:p>
@@ -2604,7 +3026,7 @@
         <w:fldChar w:fldCharType="begin" w:dirty="true"/>
         <w:instrText xml:space="preserve"> PAGEREF _TccToc31 \h </w:instrText>
         <w:fldChar w:fldCharType="separate"/>
-        <w:t>23</w:t>
+        <w:t>25</w:t>
         <w:fldChar w:fldCharType="end"/>
       </w:r>
     </w:p>
@@ -2636,7 +3058,7 @@
         <w:fldChar w:fldCharType="begin" w:dirty="true"/>
         <w:instrText xml:space="preserve"> PAGEREF _TccToc32 \h </w:instrText>
         <w:fldChar w:fldCharType="separate"/>
-        <w:t>24</w:t>
+        <w:t>26</w:t>
         <w:fldChar w:fldCharType="end"/>
       </w:r>
     </w:p>
@@ -2668,7 +3090,7 @@
         <w:fldChar w:fldCharType="begin" w:dirty="true"/>
         <w:instrText xml:space="preserve"> PAGEREF _TccToc33 \h </w:instrText>
         <w:fldChar w:fldCharType="separate"/>
-        <w:t>24</w:t>
+        <w:t>26</w:t>
         <w:fldChar w:fldCharType="end"/>
       </w:r>
     </w:p>
@@ -2700,7 +3122,7 @@
         <w:fldChar w:fldCharType="begin" w:dirty="true"/>
         <w:instrText xml:space="preserve"> PAGEREF _TccToc34 \h </w:instrText>
         <w:fldChar w:fldCharType="separate"/>
-        <w:t>24</w:t>
+        <w:t>26</w:t>
         <w:fldChar w:fldCharType="end"/>
       </w:r>
     </w:p>
@@ -2732,7 +3154,7 @@
         <w:fldChar w:fldCharType="begin" w:dirty="true"/>
         <w:instrText xml:space="preserve"> PAGEREF _TccToc35 \h </w:instrText>
         <w:fldChar w:fldCharType="separate"/>
-        <w:t>25</w:t>
+        <w:t>27</w:t>
         <w:fldChar w:fldCharType="end"/>
       </w:r>
     </w:p>
@@ -2764,7 +3186,7 @@
         <w:fldChar w:fldCharType="begin" w:dirty="true"/>
         <w:instrText xml:space="preserve"> PAGEREF _TccToc36 \h </w:instrText>
         <w:fldChar w:fldCharType="separate"/>
-        <w:t>25</w:t>
+        <w:t>27</w:t>
         <w:fldChar w:fldCharType="end"/>
       </w:r>
     </w:p>
@@ -2796,7 +3218,7 @@
         <w:fldChar w:fldCharType="begin" w:dirty="true"/>
         <w:instrText xml:space="preserve"> PAGEREF _TccToc37 \h </w:instrText>
         <w:fldChar w:fldCharType="separate"/>
-        <w:t>25</w:t>
+        <w:t>27</w:t>
         <w:fldChar w:fldCharType="end"/>
       </w:r>
     </w:p>
@@ -2828,7 +3250,39 @@
         <w:fldChar w:fldCharType="begin" w:dirty="true"/>
         <w:instrText xml:space="preserve"> PAGEREF _TccToc38 \h </w:instrText>
         <w:fldChar w:fldCharType="separate"/>
-        <w:t>26</w:t>
+        <w:t>28</w:t>
+        <w:fldChar w:fldCharType="end"/>
+      </w:r>
+    </w:p>
+    <w:p>
+      <w:pPr>
+        <w:pStyle w:val="Semrecuo"/>
+        <w:tabs>
+          <w:tab w:pos="8787" w:val="right" w:leader="dot"/>
+        </w:tabs>
+        <w:spacing w:line="240" w:lineRule="auto" w:after="60"/>
+        <w:ind w:left="425" w:firstLine="0"/>
+      </w:pPr>
+      <w:r>
+        <w:rPr>
+          <w:rFonts w:ascii="Arial" w:hAnsi="Arial"/>
+          <w:b w:val="0"/>
+          <w:sz w:val="20"/>
+        </w:rPr>
+        <w:t>5.11 OUTRAS INTERFACES DO SISTEMA</w:t>
+      </w:r>
+      <w:r>
+        <w:tab/>
+      </w:r>
+      <w:r>
+        <w:rPr>
+          <w:rFonts w:ascii="Arial" w:hAnsi="Arial"/>
+          <w:sz w:val="20"/>
+        </w:rPr>
+        <w:fldChar w:fldCharType="begin" w:dirty="true"/>
+        <w:instrText xml:space="preserve"> PAGEREF _TccToc39 \h </w:instrText>
+        <w:fldChar w:fldCharType="separate"/>
+        <w:t>28</w:t>
         <w:fldChar w:fldCharType="end"/>
       </w:r>
     </w:p>
@@ -2858,9 +3312,9 @@
           <w:sz w:val="20"/>
         </w:rPr>
         <w:fldChar w:fldCharType="begin" w:dirty="true"/>
-        <w:instrText xml:space="preserve"> PAGEREF _TccToc39 \h </w:instrText>
+        <w:instrText xml:space="preserve"> PAGEREF _TccToc40 \h </w:instrText>
         <w:fldChar w:fldCharType="separate"/>
-        <w:t>31</w:t>
+        <w:t>40</w:t>
         <w:fldChar w:fldCharType="end"/>
       </w:r>
     </w:p>
@@ -2890,9 +3344,9 @@
           <w:sz w:val="20"/>
         </w:rPr>
         <w:fldChar w:fldCharType="begin" w:dirty="true"/>
-        <w:instrText xml:space="preserve"> PAGEREF _TccToc40 \h </w:instrText>
+        <w:instrText xml:space="preserve"> PAGEREF _TccToc41 \h </w:instrText>
         <w:fldChar w:fldCharType="separate"/>
-        <w:t>31</w:t>
+        <w:t>40</w:t>
         <w:fldChar w:fldCharType="end"/>
       </w:r>
     </w:p>
@@ -2922,9 +3376,9 @@
           <w:sz w:val="20"/>
         </w:rPr>
         <w:fldChar w:fldCharType="begin" w:dirty="true"/>
-        <w:instrText xml:space="preserve"> PAGEREF _TccToc41 \h </w:instrText>
+        <w:instrText xml:space="preserve"> PAGEREF _TccToc42 \h </w:instrText>
         <w:fldChar w:fldCharType="separate"/>
-        <w:t>31</w:t>
+        <w:t>40</w:t>
         <w:fldChar w:fldCharType="end"/>
       </w:r>
     </w:p>
@@ -2954,9 +3408,9 @@
           <w:sz w:val="20"/>
         </w:rPr>
         <w:fldChar w:fldCharType="begin" w:dirty="true"/>
-        <w:instrText xml:space="preserve"> PAGEREF _TccToc42 \h </w:instrText>
+        <w:instrText xml:space="preserve"> PAGEREF _TccToc43 \h </w:instrText>
         <w:fldChar w:fldCharType="separate"/>
-        <w:t>31</w:t>
+        <w:t>40</w:t>
         <w:fldChar w:fldCharType="end"/>
       </w:r>
     </w:p>
@@ -2986,9 +3440,9 @@
           <w:sz w:val="20"/>
         </w:rPr>
         <w:fldChar w:fldCharType="begin" w:dirty="true"/>
-        <w:instrText xml:space="preserve"> PAGEREF _TccToc43 \h </w:instrText>
+        <w:instrText xml:space="preserve"> PAGEREF _TccToc44 \h </w:instrText>
         <w:fldChar w:fldCharType="separate"/>
-        <w:t>32</w:t>
+        <w:t>41</w:t>
         <w:fldChar w:fldCharType="end"/>
       </w:r>
     </w:p>
@@ -3018,9 +3472,9 @@
           <w:sz w:val="20"/>
         </w:rPr>
         <w:fldChar w:fldCharType="begin" w:dirty="true"/>
-        <w:instrText xml:space="preserve"> PAGEREF _TccToc44 \h </w:instrText>
+        <w:instrText xml:space="preserve"> PAGEREF _TccToc45 \h </w:instrText>
         <w:fldChar w:fldCharType="separate"/>
-        <w:t>32</w:t>
+        <w:t>41</w:t>
         <w:fldChar w:fldCharType="end"/>
       </w:r>
     </w:p>
@@ -3050,9 +3504,9 @@
           <w:sz w:val="20"/>
         </w:rPr>
         <w:fldChar w:fldCharType="begin" w:dirty="true"/>
-        <w:instrText xml:space="preserve"> PAGEREF _TccToc45 \h </w:instrText>
+        <w:instrText xml:space="preserve"> PAGEREF _TccToc46 \h </w:instrText>
         <w:fldChar w:fldCharType="separate"/>
-        <w:t>34</w:t>
+        <w:t>43</w:t>
         <w:fldChar w:fldCharType="end"/>
       </w:r>
     </w:p>
@@ -3082,9 +3536,9 @@
           <w:sz w:val="20"/>
         </w:rPr>
         <w:fldChar w:fldCharType="begin" w:dirty="true"/>
-        <w:instrText xml:space="preserve"> PAGEREF _TccToc46 \h </w:instrText>
+        <w:instrText xml:space="preserve"> PAGEREF _TccToc47 \h </w:instrText>
         <w:fldChar w:fldCharType="separate"/>
-        <w:t>34</w:t>
+        <w:t>43</w:t>
         <w:fldChar w:fldCharType="end"/>
       </w:r>
     </w:p>
@@ -3114,9 +3568,9 @@
           <w:sz w:val="20"/>
         </w:rPr>
         <w:fldChar w:fldCharType="begin" w:dirty="true"/>
-        <w:instrText xml:space="preserve"> PAGEREF _TccToc47 \h </w:instrText>
+        <w:instrText xml:space="preserve"> PAGEREF _TccToc48 \h </w:instrText>
         <w:fldChar w:fldCharType="separate"/>
-        <w:t>34</w:t>
+        <w:t>43</w:t>
         <w:fldChar w:fldCharType="end"/>
       </w:r>
     </w:p>
@@ -3146,9 +3600,9 @@
           <w:sz w:val="20"/>
         </w:rPr>
         <w:fldChar w:fldCharType="begin" w:dirty="true"/>
-        <w:instrText xml:space="preserve"> PAGEREF _TccToc48 \h </w:instrText>
+        <w:instrText xml:space="preserve"> PAGEREF _TccToc49 \h </w:instrText>
         <w:fldChar w:fldCharType="separate"/>
-        <w:t>34</w:t>
+        <w:t>43</w:t>
         <w:fldChar w:fldCharType="end"/>
       </w:r>
     </w:p>
@@ -3178,9 +3632,9 @@
           <w:sz w:val="20"/>
         </w:rPr>
         <w:fldChar w:fldCharType="begin" w:dirty="true"/>
-        <w:instrText xml:space="preserve"> PAGEREF _TccToc49 \h </w:instrText>
+        <w:instrText xml:space="preserve"> PAGEREF _TccToc50 \h </w:instrText>
         <w:fldChar w:fldCharType="separate"/>
-        <w:t>36</w:t>
+        <w:t>45</w:t>
         <w:fldChar w:fldCharType="end"/>
       </w:r>
     </w:p>
@@ -3210,9 +3664,9 @@
           <w:sz w:val="20"/>
         </w:rPr>
         <w:fldChar w:fldCharType="begin" w:dirty="true"/>
-        <w:instrText xml:space="preserve"> PAGEREF _TccToc50 \h </w:instrText>
+        <w:instrText xml:space="preserve"> PAGEREF _TccToc51 \h </w:instrText>
         <w:fldChar w:fldCharType="separate"/>
-        <w:t>37</w:t>
+        <w:t>46</w:t>
         <w:fldChar w:fldCharType="end"/>
       </w:r>
     </w:p>
@@ -3242,9 +3696,9 @@
           <w:sz w:val="20"/>
         </w:rPr>
         <w:fldChar w:fldCharType="begin" w:dirty="true"/>
-        <w:instrText xml:space="preserve"> PAGEREF _TccToc51 \h </w:instrText>
+        <w:instrText xml:space="preserve"> PAGEREF _TccToc52 \h </w:instrText>
         <w:fldChar w:fldCharType="separate"/>
-        <w:t>39</w:t>
+        <w:t>48</w:t>
         <w:fldChar w:fldCharType="end"/>
       </w:r>
     </w:p>
@@ -3274,9 +3728,9 @@
           <w:sz w:val="20"/>
         </w:rPr>
         <w:fldChar w:fldCharType="begin" w:dirty="true"/>
-        <w:instrText xml:space="preserve"> PAGEREF _TccToc52 \h </w:instrText>
+        <w:instrText xml:space="preserve"> PAGEREF _TccToc53 \h </w:instrText>
         <w:fldChar w:fldCharType="separate"/>
-        <w:t>39</w:t>
+        <w:t>48</w:t>
         <w:fldChar w:fldCharType="end"/>
       </w:r>
     </w:p>
@@ -3306,9 +3760,9 @@
           <w:sz w:val="20"/>
         </w:rPr>
         <w:fldChar w:fldCharType="begin" w:dirty="true"/>
-        <w:instrText xml:space="preserve"> PAGEREF _TccToc53 \h </w:instrText>
+        <w:instrText xml:space="preserve"> PAGEREF _TccToc54 \h </w:instrText>
         <w:fldChar w:fldCharType="separate"/>
-        <w:t>39</w:t>
+        <w:t>48</w:t>
         <w:fldChar w:fldCharType="end"/>
       </w:r>
     </w:p>
@@ -3338,9 +3792,9 @@
           <w:sz w:val="20"/>
         </w:rPr>
         <w:fldChar w:fldCharType="begin" w:dirty="true"/>
-        <w:instrText xml:space="preserve"> PAGEREF _TccToc54 \h </w:instrText>
+        <w:instrText xml:space="preserve"> PAGEREF _TccToc55 \h </w:instrText>
         <w:fldChar w:fldCharType="separate"/>
-        <w:t>39</w:t>
+        <w:t>48</w:t>
         <w:fldChar w:fldCharType="end"/>
       </w:r>
     </w:p>
@@ -3370,9 +3824,9 @@
           <w:sz w:val="20"/>
         </w:rPr>
         <w:fldChar w:fldCharType="begin" w:dirty="true"/>
-        <w:instrText xml:space="preserve"> PAGEREF _TccToc55 \h </w:instrText>
+        <w:instrText xml:space="preserve"> PAGEREF _TccToc56 \h </w:instrText>
         <w:fldChar w:fldCharType="separate"/>
-        <w:t>40</w:t>
+        <w:t>49</w:t>
         <w:fldChar w:fldCharType="end"/>
       </w:r>
     </w:p>
@@ -3402,9 +3856,9 @@
           <w:sz w:val="20"/>
         </w:rPr>
         <w:fldChar w:fldCharType="begin" w:dirty="true"/>
-        <w:instrText xml:space="preserve"> PAGEREF _TccToc56 \h </w:instrText>
+        <w:instrText xml:space="preserve"> PAGEREF _TccToc57 \h </w:instrText>
         <w:fldChar w:fldCharType="separate"/>
-        <w:t>41</w:t>
+        <w:t>50</w:t>
         <w:fldChar w:fldCharType="end"/>
       </w:r>
     </w:p>
@@ -3434,9 +3888,9 @@
           <w:sz w:val="20"/>
         </w:rPr>
         <w:fldChar w:fldCharType="begin" w:dirty="true"/>
-        <w:instrText xml:space="preserve"> PAGEREF _TccToc57 \h </w:instrText>
+        <w:instrText xml:space="preserve"> PAGEREF _TccToc58 \h </w:instrText>
         <w:fldChar w:fldCharType="separate"/>
-        <w:t>42</w:t>
+        <w:t>51</w:t>
         <w:fldChar w:fldCharType="end"/>
       </w:r>
     </w:p>
@@ -6750,6 +7204,42 @@
       </w:r>
     </w:p>
     <w:p>
+      <w:bookmarkStart w:id="2001" w:name="_TccFig1"/>
+      <w:pPr>
+        <w:spacing w:before="120" w:after="80"/>
+        <w:ind w:firstLine="0"/>
+        <w:jc w:val="center"/>
+      </w:pPr>
+      <w:r>
+        <w:rPr>
+          <w:b w:val="0"/>
+          <w:i w:val="0"/>
+        </w:rPr>
+      </w:r>
+      <w:r>
+        <w:rPr>
+          <w:b/>
+          <w:sz w:val="20"/>
+        </w:rPr>
+        <w:t>Figura 1 – Visão geral da arquitetura do sistema</w:t>
+      </w:r>
+      <w:bookmarkEnd w:id="2001"/>
+    </w:p>
+    <w:p>
+      <w:pPr>
+        <w:spacing w:before="0" w:after="0"/>
+        <w:ind w:firstLine="0"/>
+        <w:jc w:val="center"/>
+      </w:pPr>
+      <w:r>
+        <w:rPr>
+          <w:b/>
+          <w:i w:val="0"/>
+        </w:rPr>
+        <w:t>NAVEGADOR  →  HTTPS / SUPABASE JS  →  AUTH + POSTGRESQL/RLS/RPC + STORAGE</w:t>
+      </w:r>
+    </w:p>
+    <w:p>
       <w:pPr>
         <w:pStyle w:val="Legenda"/>
         <w:spacing w:before="0" w:after="0"/>
@@ -6760,8 +7250,277 @@
           <w:b w:val="0"/>
           <w:i w:val="0"/>
         </w:rPr>
-        <w:t>Figura 1 — Visão geral da arquitetura do sistema</w:t>
-      </w:r>
+        <w:t>Fonte: Elaborado pelos autores (2026).</w:t>
+      </w:r>
+    </w:p>
+    <w:p>
+      <w:bookmarkStart w:id="1030" w:name="_TccToc30"/>
+      <w:pPr>
+        <w:pStyle w:val="Heading2"/>
+        <w:keepNext/>
+      </w:pPr>
+      <w:r>
+        <w:t>5.2 ORGANIZAÇÃO DO FRONTEND</w:t>
+      </w:r>
+      <w:bookmarkEnd w:id="1030"/>
+    </w:p>
+    <w:p>
+      <w:pPr>
+        <w:spacing w:before="0" w:after="0"/>
+      </w:pPr>
+      <w:r>
+        <w:rPr>
+          <w:b w:val="0"/>
+          <w:i w:val="0"/>
+        </w:rPr>
+        <w:t>O arquivo index.html reúne landing page, autenticação, aplicação principal, modais e visão pública. O style.css complementa o Tailwind com estilos próprios para navegação móvel, diploma, briefing e elementos específicos. O script.js mantém o estado da sessão, os conteúdos das matérias, os briefings, a renderização e os eventos. O supabase.js concentra a criação do cliente e as funções de acesso ao backend.</w:t>
+      </w:r>
+    </w:p>
+    <w:p>
+      <w:pPr>
+        <w:spacing w:before="0" w:after="0"/>
+      </w:pPr>
+      <w:r>
+        <w:rPr>
+          <w:b w:val="0"/>
+          <w:i w:val="0"/>
+        </w:rPr>
+        <w:t>A inicialização consulta a sessão existente. Sem sessão, a landing page é exibida; com sessão válida, perfil e dados essenciais são carregados antes da aplicação. Dados secundários são carregados depois para reduzir o bloqueio inicial. A rota por hash #publico/&lt;id&gt; é tratada separadamente e pode ser aberta sem autenticação.</w:t>
+      </w:r>
+    </w:p>
+    <w:p>
+      <w:bookmarkStart w:id="1031" w:name="_TccToc31"/>
+      <w:pPr>
+        <w:pStyle w:val="Heading2"/>
+        <w:keepNext/>
+      </w:pPr>
+      <w:r>
+        <w:t>5.3 JORNADA DO ESTUDANTE</w:t>
+      </w:r>
+      <w:bookmarkEnd w:id="1031"/>
+    </w:p>
+    <w:p>
+      <w:pPr>
+        <w:pStyle w:val="Semrecuo"/>
+        <w:ind w:left="425" w:hanging="425"/>
+      </w:pPr>
+      <w:r>
+        <w:rPr>
+          <w:b/>
+        </w:rPr>
+        <w:t xml:space="preserve">1. </w:t>
+      </w:r>
+      <w:r>
+        <w:t>o visitante conhece a proposta na página inicial e escolhe entrar ou cadastrar;</w:t>
+      </w:r>
+    </w:p>
+    <w:p>
+      <w:pPr>
+        <w:pStyle w:val="Semrecuo"/>
+        <w:ind w:left="425" w:hanging="425"/>
+      </w:pPr>
+      <w:r>
+        <w:rPr>
+          <w:b/>
+        </w:rPr>
+        <w:t xml:space="preserve">2. </w:t>
+      </w:r>
+      <w:r>
+        <w:t>após o cadastro, responde ao quiz sobre nível, área e objetivo;</w:t>
+      </w:r>
+    </w:p>
+    <w:p>
+      <w:pPr>
+        <w:pStyle w:val="Semrecuo"/>
+        <w:ind w:left="425" w:hanging="425"/>
+      </w:pPr>
+      <w:r>
+        <w:rPr>
+          <w:b/>
+        </w:rPr>
+        <w:t xml:space="preserve">3. </w:t>
+      </w:r>
+      <w:r>
+        <w:t>o painel apresenta XP, nível e acesso aos módulos;</w:t>
+      </w:r>
+    </w:p>
+    <w:p>
+      <w:pPr>
+        <w:pStyle w:val="Semrecuo"/>
+        <w:ind w:left="425" w:hanging="425"/>
+      </w:pPr>
+      <w:r>
+        <w:rPr>
+          <w:b/>
+        </w:rPr>
+        <w:t xml:space="preserve">4. </w:t>
+      </w:r>
+      <w:r>
+        <w:t>o Centro de Estudos destaca a próxima matéria recomendada;</w:t>
+      </w:r>
+    </w:p>
+    <w:p>
+      <w:pPr>
+        <w:pStyle w:val="Semrecuo"/>
+        <w:ind w:left="425" w:hanging="425"/>
+      </w:pPr>
+      <w:r>
+        <w:rPr>
+          <w:b/>
+        </w:rPr>
+        <w:t xml:space="preserve">5. </w:t>
+      </w:r>
+      <w:r>
+        <w:t>o estudante lê o conteúdo, realiza o teste rápido e conclui o exercício;</w:t>
+      </w:r>
+    </w:p>
+    <w:p>
+      <w:pPr>
+        <w:pStyle w:val="Semrecuo"/>
+        <w:ind w:left="425" w:hanging="425"/>
+      </w:pPr>
+      <w:r>
+        <w:rPr>
+          <w:b/>
+        </w:rPr>
+        <w:t xml:space="preserve">6. </w:t>
+      </w:r>
+      <w:r>
+        <w:t>projetos práticos podem ser abertos em formato de briefing;</w:t>
+      </w:r>
+    </w:p>
+    <w:p>
+      <w:pPr>
+        <w:pStyle w:val="Semrecuo"/>
+        <w:ind w:left="425" w:hanging="425"/>
+      </w:pPr>
+      <w:r>
+        <w:rPr>
+          <w:b/>
+        </w:rPr>
+        <w:t xml:space="preserve">7. </w:t>
+      </w:r>
+      <w:r>
+        <w:t>certificados e projetos concluídos compõem o portfólio;</w:t>
+      </w:r>
+    </w:p>
+    <w:p>
+      <w:pPr>
+        <w:pStyle w:val="Semrecuo"/>
+        <w:ind w:left="425" w:hanging="425"/>
+      </w:pPr>
+      <w:r>
+        <w:rPr>
+          <w:b/>
+        </w:rPr>
+        <w:t xml:space="preserve">8. </w:t>
+      </w:r>
+      <w:r>
+        <w:t>quando desejar, o estudante publica um link público e pode torná-lo privado novamente.</w:t>
+      </w:r>
+    </w:p>
+    <w:p>
+      <w:r>
+        <w:br w:type="page"/>
+      </w:r>
+    </w:p>
+    <w:p>
+      <w:bookmarkStart w:id="2002" w:name="_TccFig2"/>
+      <w:pPr>
+        <w:spacing w:before="120" w:after="80"/>
+        <w:ind w:firstLine="0"/>
+        <w:jc w:val="center"/>
+      </w:pPr>
+      <w:r>
+        <w:rPr>
+          <w:b w:val="0"/>
+          <w:i w:val="0"/>
+        </w:rPr>
+      </w:r>
+      <w:r>
+        <w:rPr>
+          <w:b/>
+          <w:sz w:val="20"/>
+        </w:rPr>
+        <w:t>Figura 2 – Painel principal e acompanhamento do progresso do estudante</w:t>
+      </w:r>
+      <w:bookmarkEnd w:id="2002"/>
+    </w:p>
+    <w:p>
+      <w:pPr>
+        <w:pStyle w:val="Semrecuo"/>
+        <w:jc w:val="center"/>
+      </w:pPr>
+      <w:r>
+        <w:drawing>
+          <wp:inline xmlns:a="http://schemas.openxmlformats.org/drawingml/2006/main" xmlns:pic="http://schemas.openxmlformats.org/drawingml/2006/picture">
+            <wp:extent cx="5580000" cy="2679968"/>
+            <wp:docPr id="1" name="Picture 1"/>
+            <wp:cNvGraphicFramePr>
+              <a:graphicFrameLocks noChangeAspect="1"/>
+            </wp:cNvGraphicFramePr>
+            <a:graphic>
+              <a:graphicData uri="http://schemas.openxmlformats.org/drawingml/2006/picture">
+                <pic:pic>
+                  <pic:nvPicPr>
+                    <pic:cNvPr id="0" name="Captura de tela 2026-10-06 210533.png"/>
+                    <pic:cNvPicPr/>
+                  </pic:nvPicPr>
+                  <pic:blipFill>
+                    <a:blip r:embed="rId11"/>
+                    <a:stretch>
+                      <a:fillRect/>
+                    </a:stretch>
+                  </pic:blipFill>
+                  <pic:spPr>
+                    <a:xfrm>
+                      <a:off x="0" y="0"/>
+                      <a:ext cx="5580000" cy="2679968"/>
+                    </a:xfrm>
+                    <a:prstGeom prst="rect"/>
+                  </pic:spPr>
+                </pic:pic>
+              </a:graphicData>
+            </a:graphic>
+          </wp:inline>
+        </w:drawing>
+      </w:r>
+    </w:p>
+    <w:p>
+      <w:pPr>
+        <w:pStyle w:val="Legenda"/>
+        <w:spacing w:before="0" w:after="160"/>
+        <w:ind w:firstLine="0"/>
+      </w:pPr>
+      <w:r>
+        <w:rPr>
+          <w:b w:val="0"/>
+          <w:i w:val="0"/>
+        </w:rPr>
+        <w:t>Fonte: Elaborado pelos autores (2026).</w:t>
+      </w:r>
+    </w:p>
+    <w:p>
+      <w:bookmarkStart w:id="2003" w:name="_TccFig3"/>
+      <w:pPr>
+        <w:spacing w:before="120" w:after="80"/>
+        <w:ind w:firstLine="0"/>
+        <w:jc w:val="center"/>
+      </w:pPr>
+      <w:r>
+        <w:rPr>
+          <w:b w:val="0"/>
+          <w:i w:val="0"/>
+        </w:rPr>
+      </w:r>
+      <w:r>
+        <w:rPr>
+          <w:b/>
+          <w:sz w:val="20"/>
+        </w:rPr>
+        <w:t>Figura 3 – Fluxo principal do estudante</w:t>
+      </w:r>
+      <w:bookmarkEnd w:id="2003"/>
     </w:p>
     <w:p>
       <w:pPr>
@@ -6774,7 +7533,7 @@
           <w:b/>
           <w:i w:val="0"/>
         </w:rPr>
-        <w:t>NAVEGADOR  →  HTTPS / SUPABASE JS  →  AUTH + POSTGRESQL/RLS/RPC + STORAGE</w:t>
+        <w:t>VISITANTE → CADASTRO → QUIZ → ESTUDOS → EXERCÍCIOS/PROJETOS → CERTIFICADOS → PORTFÓLIO</w:t>
       </w:r>
     </w:p>
     <w:p>
@@ -6792,15 +7551,15 @@
       </w:r>
     </w:p>
     <w:p>
-      <w:bookmarkStart w:id="1030" w:name="_TccToc30"/>
+      <w:bookmarkStart w:id="1032" w:name="_TccToc32"/>
       <w:pPr>
         <w:pStyle w:val="Heading2"/>
         <w:keepNext/>
       </w:pPr>
       <w:r>
-        <w:t>5.2 ORGANIZAÇÃO DO FRONTEND</w:t>
-      </w:r>
-      <w:bookmarkEnd w:id="1030"/>
+        <w:t>5.4 CENTRO DE ESTUDOS</w:t>
+      </w:r>
+      <w:bookmarkEnd w:id="1032"/>
     </w:p>
     <w:p>
       <w:pPr>
@@ -6811,220 +7570,227 @@
           <w:b w:val="0"/>
           <w:i w:val="0"/>
         </w:rPr>
-        <w:t>O arquivo index.html reúne landing page, autenticação, aplicação principal, modais e visão pública. O style.css complementa o Tailwind com estilos próprios para navegação móvel, diploma, briefing e elementos específicos. O script.js mantém o estado da sessão, os conteúdos das matérias, os briefings, a renderização e os eventos. O supabase.js concentra a criação do cliente e as funções de acesso ao backend.</w:t>
-      </w:r>
-    </w:p>
-    <w:p>
-      <w:pPr>
-        <w:spacing w:before="0" w:after="0"/>
+        <w:t>O Centro de Estudos contém doze matérias. Cada item informa nível e tempo estimado, apresenta conceitos, exemplo, erros comuns, referências externas e teste de três questões com correção imediata. A trilha recomendada deriva da área selecionada no quiz. O destaque “Comece por aqui” avança para a primeira matéria da sequência que ainda não possui certificado.</w:t>
+      </w:r>
+    </w:p>
+    <w:p>
+      <w:r>
+        <w:br w:type="page"/>
+      </w:r>
+    </w:p>
+    <w:p>
+      <w:bookmarkStart w:id="2004" w:name="_TccFig4"/>
+      <w:pPr>
+        <w:spacing w:before="120" w:after="80"/>
+        <w:ind w:firstLine="0"/>
+        <w:jc w:val="center"/>
       </w:pPr>
       <w:r>
         <w:rPr>
           <w:b w:val="0"/>
           <w:i w:val="0"/>
         </w:rPr>
-        <w:t>A inicialização consulta a sessão existente. Sem sessão, a landing page é exibida; com sessão válida, perfil e dados essenciais são carregados antes da aplicação. Dados secundários são carregados depois para reduzir o bloqueio inicial. A rota por hash #publico/&lt;id&gt; é tratada separadamente e pode ser aberta sem autenticação.</w:t>
-      </w:r>
-    </w:p>
-    <w:p>
-      <w:bookmarkStart w:id="1031" w:name="_TccToc31"/>
+      </w:r>
+      <w:r>
+        <w:rPr>
+          <w:b/>
+          <w:sz w:val="20"/>
+        </w:rPr>
+        <w:t>Figura 4 – Centro de Estudos e trilha recomendada</w:t>
+      </w:r>
+      <w:bookmarkEnd w:id="2004"/>
+    </w:p>
+    <w:p>
+      <w:pPr>
+        <w:pStyle w:val="Semrecuo"/>
+        <w:jc w:val="center"/>
+      </w:pPr>
+      <w:r>
+        <w:drawing>
+          <wp:inline xmlns:a="http://schemas.openxmlformats.org/drawingml/2006/main" xmlns:pic="http://schemas.openxmlformats.org/drawingml/2006/picture">
+            <wp:extent cx="5580000" cy="2679849"/>
+            <wp:docPr id="2" name="Picture 2"/>
+            <wp:cNvGraphicFramePr>
+              <a:graphicFrameLocks noChangeAspect="1"/>
+            </wp:cNvGraphicFramePr>
+            <a:graphic>
+              <a:graphicData uri="http://schemas.openxmlformats.org/drawingml/2006/picture">
+                <pic:pic>
+                  <pic:nvPicPr>
+                    <pic:cNvPr id="0" name="Captura de tela 2026-10-06 210555.png"/>
+                    <pic:cNvPicPr/>
+                  </pic:nvPicPr>
+                  <pic:blipFill>
+                    <a:blip r:embed="rId12"/>
+                    <a:stretch>
+                      <a:fillRect/>
+                    </a:stretch>
+                  </pic:blipFill>
+                  <pic:spPr>
+                    <a:xfrm>
+                      <a:off x="0" y="0"/>
+                      <a:ext cx="5580000" cy="2679849"/>
+                    </a:xfrm>
+                    <a:prstGeom prst="rect"/>
+                  </pic:spPr>
+                </pic:pic>
+              </a:graphicData>
+            </a:graphic>
+          </wp:inline>
+        </w:drawing>
+      </w:r>
+    </w:p>
+    <w:p>
+      <w:pPr>
+        <w:pStyle w:val="Legenda"/>
+        <w:spacing w:before="0" w:after="160"/>
+        <w:ind w:firstLine="0"/>
+      </w:pPr>
+      <w:r>
+        <w:rPr>
+          <w:b w:val="0"/>
+          <w:i w:val="0"/>
+        </w:rPr>
+        <w:t>Fonte: Elaborado pelos autores (2026).</w:t>
+      </w:r>
+    </w:p>
+    <w:p>
+      <w:bookmarkStart w:id="1033" w:name="_TccToc33"/>
       <w:pPr>
         <w:pStyle w:val="Heading2"/>
         <w:keepNext/>
       </w:pPr>
       <w:r>
-        <w:t>5.3 JORNADA DO ESTUDANTE</w:t>
-      </w:r>
-      <w:bookmarkEnd w:id="1031"/>
-    </w:p>
-    <w:p>
-      <w:pPr>
-        <w:pStyle w:val="Semrecuo"/>
-        <w:ind w:left="425" w:hanging="425"/>
-      </w:pPr>
-      <w:r>
-        <w:rPr>
-          <w:b/>
-        </w:rPr>
-        <w:t xml:space="preserve">1. </w:t>
-      </w:r>
-      <w:r>
-        <w:t>o visitante conhece a proposta na página inicial e escolhe entrar ou cadastrar;</w:t>
-      </w:r>
-    </w:p>
-    <w:p>
-      <w:pPr>
-        <w:pStyle w:val="Semrecuo"/>
-        <w:ind w:left="425" w:hanging="425"/>
-      </w:pPr>
-      <w:r>
-        <w:rPr>
-          <w:b/>
-        </w:rPr>
-        <w:t xml:space="preserve">2. </w:t>
-      </w:r>
-      <w:r>
-        <w:t>após o cadastro, responde ao quiz sobre nível, área e objetivo;</w:t>
-      </w:r>
-    </w:p>
-    <w:p>
-      <w:pPr>
-        <w:pStyle w:val="Semrecuo"/>
-        <w:ind w:left="425" w:hanging="425"/>
-      </w:pPr>
-      <w:r>
-        <w:rPr>
-          <w:b/>
-        </w:rPr>
-        <w:t xml:space="preserve">3. </w:t>
-      </w:r>
-      <w:r>
-        <w:t>o painel apresenta XP, nível e acesso aos módulos;</w:t>
-      </w:r>
-    </w:p>
-    <w:p>
-      <w:pPr>
-        <w:pStyle w:val="Semrecuo"/>
-        <w:ind w:left="425" w:hanging="425"/>
-      </w:pPr>
-      <w:r>
-        <w:rPr>
-          <w:b/>
-        </w:rPr>
-        <w:t xml:space="preserve">4. </w:t>
-      </w:r>
-      <w:r>
-        <w:t>o Centro de Estudos destaca a próxima matéria recomendada;</w:t>
-      </w:r>
-    </w:p>
-    <w:p>
-      <w:pPr>
-        <w:pStyle w:val="Semrecuo"/>
-        <w:ind w:left="425" w:hanging="425"/>
-      </w:pPr>
-      <w:r>
-        <w:rPr>
-          <w:b/>
-        </w:rPr>
-        <w:t xml:space="preserve">5. </w:t>
-      </w:r>
-      <w:r>
-        <w:t>o estudante lê o conteúdo, realiza o teste rápido e conclui o exercício;</w:t>
-      </w:r>
-    </w:p>
-    <w:p>
-      <w:pPr>
-        <w:pStyle w:val="Semrecuo"/>
-        <w:ind w:left="425" w:hanging="425"/>
-      </w:pPr>
-      <w:r>
-        <w:rPr>
-          <w:b/>
-        </w:rPr>
-        <w:t xml:space="preserve">6. </w:t>
-      </w:r>
-      <w:r>
-        <w:t>projetos práticos podem ser abertos em formato de briefing;</w:t>
-      </w:r>
-    </w:p>
-    <w:p>
-      <w:pPr>
-        <w:pStyle w:val="Semrecuo"/>
-        <w:ind w:left="425" w:hanging="425"/>
-      </w:pPr>
-      <w:r>
-        <w:rPr>
-          <w:b/>
-        </w:rPr>
-        <w:t xml:space="preserve">7. </w:t>
-      </w:r>
-      <w:r>
-        <w:t>certificados e projetos concluídos compõem o portfólio;</w:t>
-      </w:r>
-    </w:p>
-    <w:p>
-      <w:pPr>
-        <w:pStyle w:val="Semrecuo"/>
-        <w:ind w:left="425" w:hanging="425"/>
-      </w:pPr>
-      <w:r>
-        <w:rPr>
-          <w:b/>
-        </w:rPr>
-        <w:t xml:space="preserve">8. </w:t>
-      </w:r>
-      <w:r>
-        <w:t>quando desejar, o estudante publica um link público e pode torná-lo privado novamente.</w:t>
-      </w:r>
-    </w:p>
-    <w:p>
-      <w:pPr>
-        <w:pStyle w:val="Legenda"/>
+        <w:t>5.5 PROJETOS, CERTIFICADOS E PORTFÓLIO</w:t>
+      </w:r>
+      <w:bookmarkEnd w:id="1033"/>
+    </w:p>
+    <w:p>
+      <w:pPr>
         <w:spacing w:before="0" w:after="0"/>
-        <w:ind w:firstLine="0"/>
       </w:pPr>
       <w:r>
         <w:rPr>
           <w:b w:val="0"/>
           <w:i w:val="0"/>
         </w:rPr>
-        <w:t>Figura 2 — Fluxo principal do estudante</w:t>
+        <w:t>O catálogo oferece nove projetos organizados por dificuldade. Cada briefing informa cenário, tecnologias, requisitos funcionais, entregáveis e critérios de aceite. Ao concluir, a aplicação chama a operação persistente e atualiza a interface somente após resposta positiva, evitando que uma falha seja mostrada como sucesso.</w:t>
       </w:r>
     </w:p>
     <w:p>
       <w:pPr>
         <w:spacing w:before="0" w:after="0"/>
+      </w:pPr>
+      <w:r>
+        <w:rPr>
+          <w:b w:val="0"/>
+          <w:i w:val="0"/>
+        </w:rPr>
+        <w:t>O certificado é renderizado em canvas com nome do aluno, módulo, data, trilha, nível, XP e código de verificação determinístico. A imagem pode ser baixada em PNG ou impressa para PDF. O registro persistido em certificates, e não o desenho do canvas, é a fonte da verdade sobre a conclusão.</w:t>
+      </w:r>
+    </w:p>
+    <w:p>
+      <w:pPr>
+        <w:spacing w:before="0" w:after="0"/>
+      </w:pPr>
+      <w:r>
+        <w:rPr>
+          <w:b w:val="0"/>
+          <w:i w:val="0"/>
+        </w:rPr>
+        <w:t>O portfólio reúne perfil, projetos e certificados. Publicá-lo altera portfolio_public e produz um link contendo o identificador do perfil. A visualização pública solicita apenas os campos autorizados e não exige login. A retirada da publicação impede novas leituras anônimas.</w:t>
+      </w:r>
+    </w:p>
+    <w:p>
+      <w:r>
+        <w:br w:type="page"/>
+      </w:r>
+    </w:p>
+    <w:p>
+      <w:bookmarkStart w:id="2005" w:name="_TccFig5"/>
+      <w:pPr>
+        <w:spacing w:before="120" w:after="80"/>
         <w:ind w:firstLine="0"/>
         <w:jc w:val="center"/>
       </w:pPr>
       <w:r>
         <w:rPr>
-          <w:b/>
-          <w:i w:val="0"/>
-        </w:rPr>
-        <w:t>VISITANTE → CADASTRO → QUIZ → ESTUDOS → EXERCÍCIOS/PROJETOS → CERTIFICADOS → PORTFÓLIO</w:t>
-      </w:r>
-    </w:p>
-    <w:p>
-      <w:pPr>
-        <w:pStyle w:val="Legenda"/>
-        <w:spacing w:before="0" w:after="0"/>
-        <w:ind w:firstLine="0"/>
-      </w:pPr>
-      <w:r>
-        <w:rPr>
           <w:b w:val="0"/>
           <w:i w:val="0"/>
         </w:rPr>
-        <w:t>Fonte: Elaborado pelos autores (2026).</w:t>
-      </w:r>
-    </w:p>
-    <w:p>
-      <w:bookmarkStart w:id="1032" w:name="_TccToc32"/>
-      <w:pPr>
-        <w:pStyle w:val="Heading2"/>
-        <w:keepNext/>
-      </w:pPr>
-      <w:r>
-        <w:t>5.4 CENTRO DE ESTUDOS</w:t>
-      </w:r>
-      <w:bookmarkEnd w:id="1032"/>
-    </w:p>
-    <w:p>
-      <w:pPr>
-        <w:spacing w:before="0" w:after="0"/>
+      </w:r>
+      <w:r>
+        <w:rPr>
+          <w:b/>
+          <w:sz w:val="20"/>
+        </w:rPr>
+        <w:t>Figura 5 – Catálogo de projetos práticos e acesso aos briefings</w:t>
+      </w:r>
+      <w:bookmarkEnd w:id="2005"/>
+    </w:p>
+    <w:p>
+      <w:pPr>
+        <w:pStyle w:val="Semrecuo"/>
+        <w:jc w:val="center"/>
+      </w:pPr>
+      <w:r>
+        <w:drawing>
+          <wp:inline xmlns:a="http://schemas.openxmlformats.org/drawingml/2006/main" xmlns:pic="http://schemas.openxmlformats.org/drawingml/2006/picture">
+            <wp:extent cx="5580000" cy="2683213"/>
+            <wp:docPr id="3" name="Picture 3"/>
+            <wp:cNvGraphicFramePr>
+              <a:graphicFrameLocks noChangeAspect="1"/>
+            </wp:cNvGraphicFramePr>
+            <a:graphic>
+              <a:graphicData uri="http://schemas.openxmlformats.org/drawingml/2006/picture">
+                <pic:pic>
+                  <pic:nvPicPr>
+                    <pic:cNvPr id="0" name="Captura de tela 2026-10-06 210656.png"/>
+                    <pic:cNvPicPr/>
+                  </pic:nvPicPr>
+                  <pic:blipFill>
+                    <a:blip r:embed="rId13"/>
+                    <a:stretch>
+                      <a:fillRect/>
+                    </a:stretch>
+                  </pic:blipFill>
+                  <pic:spPr>
+                    <a:xfrm>
+                      <a:off x="0" y="0"/>
+                      <a:ext cx="5580000" cy="2683213"/>
+                    </a:xfrm>
+                    <a:prstGeom prst="rect"/>
+                  </pic:spPr>
+                </pic:pic>
+              </a:graphicData>
+            </a:graphic>
+          </wp:inline>
+        </w:drawing>
+      </w:r>
+    </w:p>
+    <w:p>
+      <w:pPr>
+        <w:pStyle w:val="Legenda"/>
+        <w:spacing w:before="0" w:after="160"/>
+        <w:ind w:firstLine="0"/>
       </w:pPr>
       <w:r>
         <w:rPr>
           <w:b w:val="0"/>
           <w:i w:val="0"/>
         </w:rPr>
-        <w:t>O Centro de Estudos contém doze matérias. Cada item informa nível e tempo estimado, apresenta conceitos, exemplo, erros comuns, referências externas e teste de três questões com correção imediata. A trilha recomendada deriva da área selecionada no quiz. O destaque “Comece por aqui” avança para a primeira matéria da sequência que ainda não possui certificado.</w:t>
-      </w:r>
-    </w:p>
-    <w:p>
-      <w:pPr>
-        <w:spacing w:before="120" w:after="120"/>
+        <w:t>Fonte: Elaborado pelos autores (2026).</w:t>
+      </w:r>
+    </w:p>
+    <w:p>
+      <w:r>
+        <w:br w:type="page"/>
+      </w:r>
+    </w:p>
+    <w:p>
+      <w:bookmarkStart w:id="2006" w:name="_TccFig6"/>
+      <w:pPr>
+        <w:spacing w:before="120" w:after="80"/>
         <w:ind w:firstLine="0"/>
         <w:jc w:val="center"/>
       </w:pPr>
@@ -7037,76 +7803,145 @@
       <w:r>
         <w:rPr>
           <w:b/>
-          <w:color w:val="C00000"/>
-        </w:rPr>
-        <w:t>[CAMPO EDITÁVEL — Inserir captura de tela do Centro de Estudos e adicionar legenda como Figura]</w:t>
-      </w:r>
-    </w:p>
-    <w:p>
-      <w:bookmarkStart w:id="1033" w:name="_TccToc33"/>
-      <w:pPr>
-        <w:pStyle w:val="Heading2"/>
-        <w:keepNext/>
-      </w:pPr>
-      <w:r>
-        <w:t>5.5 PROJETOS, CERTIFICADOS E PORTFÓLIO</w:t>
-      </w:r>
-      <w:bookmarkEnd w:id="1033"/>
-    </w:p>
-    <w:p>
-      <w:pPr>
-        <w:spacing w:before="0" w:after="0"/>
+          <w:sz w:val="20"/>
+        </w:rPr>
+        <w:t>Figura 6 – Certificados emitidos após a conclusão dos exercícios</w:t>
+      </w:r>
+      <w:bookmarkEnd w:id="2006"/>
+    </w:p>
+    <w:p>
+      <w:pPr>
+        <w:pStyle w:val="Semrecuo"/>
+        <w:jc w:val="center"/>
+      </w:pPr>
+      <w:r>
+        <w:drawing>
+          <wp:inline xmlns:a="http://schemas.openxmlformats.org/drawingml/2006/main" xmlns:pic="http://schemas.openxmlformats.org/drawingml/2006/picture">
+            <wp:extent cx="5580000" cy="2674189"/>
+            <wp:docPr id="4" name="Picture 4"/>
+            <wp:cNvGraphicFramePr>
+              <a:graphicFrameLocks noChangeAspect="1"/>
+            </wp:cNvGraphicFramePr>
+            <a:graphic>
+              <a:graphicData uri="http://schemas.openxmlformats.org/drawingml/2006/picture">
+                <pic:pic>
+                  <pic:nvPicPr>
+                    <pic:cNvPr id="0" name="Captura de tela 2026-10-06 210634.png"/>
+                    <pic:cNvPicPr/>
+                  </pic:nvPicPr>
+                  <pic:blipFill>
+                    <a:blip r:embed="rId14"/>
+                    <a:stretch>
+                      <a:fillRect/>
+                    </a:stretch>
+                  </pic:blipFill>
+                  <pic:spPr>
+                    <a:xfrm>
+                      <a:off x="0" y="0"/>
+                      <a:ext cx="5580000" cy="2674189"/>
+                    </a:xfrm>
+                    <a:prstGeom prst="rect"/>
+                  </pic:spPr>
+                </pic:pic>
+              </a:graphicData>
+            </a:graphic>
+          </wp:inline>
+        </w:drawing>
+      </w:r>
+    </w:p>
+    <w:p>
+      <w:pPr>
+        <w:pStyle w:val="Legenda"/>
+        <w:spacing w:before="0" w:after="160"/>
+        <w:ind w:firstLine="0"/>
       </w:pPr>
       <w:r>
         <w:rPr>
           <w:b w:val="0"/>
           <w:i w:val="0"/>
         </w:rPr>
-        <w:t>O catálogo oferece nove projetos organizados por dificuldade. Cada briefing informa cenário, tecnologias, requisitos funcionais, entregáveis e critérios de aceite. Ao concluir, a aplicação chama a operação persistente e atualiza a interface somente após resposta positiva, evitando que uma falha seja mostrada como sucesso.</w:t>
-      </w:r>
-    </w:p>
-    <w:p>
-      <w:pPr>
-        <w:spacing w:before="0" w:after="0"/>
+        <w:t>Fonte: Elaborado pelos autores (2026).</w:t>
+      </w:r>
+    </w:p>
+    <w:p>
+      <w:r>
+        <w:br w:type="page"/>
+      </w:r>
+    </w:p>
+    <w:p>
+      <w:bookmarkStart w:id="2007" w:name="_TccFig7"/>
+      <w:pPr>
+        <w:spacing w:before="120" w:after="80"/>
+        <w:ind w:firstLine="0"/>
+        <w:jc w:val="center"/>
       </w:pPr>
       <w:r>
         <w:rPr>
           <w:b w:val="0"/>
           <w:i w:val="0"/>
         </w:rPr>
-        <w:t>O certificado é renderizado em canvas com nome do aluno, módulo, data, trilha, nível, XP e código de verificação determinístico. A imagem pode ser baixada em PNG ou impressa para PDF. O registro persistido em certificates, e não o desenho do canvas, é a fonte da verdade sobre a conclusão.</w:t>
-      </w:r>
-    </w:p>
-    <w:p>
-      <w:pPr>
-        <w:spacing w:before="0" w:after="0"/>
+      </w:r>
+      <w:r>
+        <w:rPr>
+          <w:b/>
+          <w:sz w:val="20"/>
+        </w:rPr>
+        <w:t>Figura 7 – Portfólio digital e controle de publicação</w:t>
+      </w:r>
+      <w:bookmarkEnd w:id="2007"/>
+    </w:p>
+    <w:p>
+      <w:pPr>
+        <w:pStyle w:val="Semrecuo"/>
+        <w:jc w:val="center"/>
+      </w:pPr>
+      <w:r>
+        <w:drawing>
+          <wp:inline xmlns:a="http://schemas.openxmlformats.org/drawingml/2006/main" xmlns:pic="http://schemas.openxmlformats.org/drawingml/2006/picture">
+            <wp:extent cx="5580000" cy="2681650"/>
+            <wp:docPr id="5" name="Picture 5"/>
+            <wp:cNvGraphicFramePr>
+              <a:graphicFrameLocks noChangeAspect="1"/>
+            </wp:cNvGraphicFramePr>
+            <a:graphic>
+              <a:graphicData uri="http://schemas.openxmlformats.org/drawingml/2006/picture">
+                <pic:pic>
+                  <pic:nvPicPr>
+                    <pic:cNvPr id="0" name="Captura de tela 2026-10-06 210645.png"/>
+                    <pic:cNvPicPr/>
+                  </pic:nvPicPr>
+                  <pic:blipFill>
+                    <a:blip r:embed="rId15"/>
+                    <a:stretch>
+                      <a:fillRect/>
+                    </a:stretch>
+                  </pic:blipFill>
+                  <pic:spPr>
+                    <a:xfrm>
+                      <a:off x="0" y="0"/>
+                      <a:ext cx="5580000" cy="2681650"/>
+                    </a:xfrm>
+                    <a:prstGeom prst="rect"/>
+                  </pic:spPr>
+                </pic:pic>
+              </a:graphicData>
+            </a:graphic>
+          </wp:inline>
+        </w:drawing>
+      </w:r>
+    </w:p>
+    <w:p>
+      <w:pPr>
+        <w:pStyle w:val="Legenda"/>
+        <w:spacing w:before="0" w:after="160"/>
+        <w:ind w:firstLine="0"/>
       </w:pPr>
       <w:r>
         <w:rPr>
           <w:b w:val="0"/>
           <w:i w:val="0"/>
         </w:rPr>
-        <w:t>O portfólio reúne perfil, projetos e certificados. Publicá-lo altera portfolio_public e produz um link contendo o identificador do perfil. A visualização pública solicita apenas os campos autorizados e não exige login. A retirada da publicação impede novas leituras anônimas.</w:t>
-      </w:r>
-    </w:p>
-    <w:p>
-      <w:pPr>
-        <w:spacing w:before="120" w:after="120"/>
-        <w:ind w:firstLine="0"/>
-        <w:jc w:val="center"/>
-      </w:pPr>
-      <w:r>
-        <w:rPr>
-          <w:b w:val="0"/>
-          <w:i w:val="0"/>
-        </w:rPr>
-      </w:r>
-      <w:r>
-        <w:rPr>
-          <w:b/>
-          <w:color w:val="C00000"/>
-        </w:rPr>
-        <w:t>[CAMPO EDITÁVEL — Inserir capturas do certificado e do portfólio; atualizar a Lista de Figuras]</w:t>
+        <w:t>Fonte: Elaborado pelos autores (2026).</w:t>
       </w:r>
     </w:p>
     <w:p>
@@ -7580,6 +8415,42 @@
       </w:r>
     </w:p>
     <w:p>
+      <w:bookmarkStart w:id="2008" w:name="_TccFig8"/>
+      <w:pPr>
+        <w:spacing w:before="120" w:after="80"/>
+        <w:ind w:firstLine="0"/>
+        <w:jc w:val="center"/>
+      </w:pPr>
+      <w:r>
+        <w:rPr>
+          <w:b w:val="0"/>
+          <w:i w:val="0"/>
+        </w:rPr>
+      </w:r>
+      <w:r>
+        <w:rPr>
+          <w:b/>
+          <w:sz w:val="20"/>
+        </w:rPr>
+        <w:t>Figura 8 – Relacionamento lógico entre as entidades</w:t>
+      </w:r>
+      <w:bookmarkEnd w:id="2008"/>
+    </w:p>
+    <w:p>
+      <w:pPr>
+        <w:spacing w:before="0" w:after="0"/>
+        <w:ind w:firstLine="0"/>
+        <w:jc w:val="center"/>
+      </w:pPr>
+      <w:r>
+        <w:rPr>
+          <w:b/>
+          <w:i w:val="0"/>
+        </w:rPr>
+        <w:t>auth.users 1—1 profiles 1—N {quiz_answers, subject_progress, certificates, user_projects} N—1 projects</w:t>
+      </w:r>
+    </w:p>
+    <w:p>
       <w:pPr>
         <w:pStyle w:val="Legenda"/>
         <w:spacing w:before="0" w:after="0"/>
@@ -7590,47 +8461,277 @@
           <w:b w:val="0"/>
           <w:i w:val="0"/>
         </w:rPr>
-        <w:t>Figura 3 — Relacionamento lógico entre as entidades</w:t>
-      </w:r>
+        <w:t>Fonte: Elaborado pelos autores (2026).</w:t>
+      </w:r>
+    </w:p>
+    <w:p>
+      <w:bookmarkStart w:id="1035" w:name="_TccToc35"/>
+      <w:pPr>
+        <w:pStyle w:val="Heading2"/>
+        <w:keepNext/>
+      </w:pPr>
+      <w:r>
+        <w:t>5.7 REGRAS DE XP E CONSISTÊNCIA</w:t>
+      </w:r>
+      <w:bookmarkEnd w:id="1035"/>
     </w:p>
     <w:p>
       <w:pPr>
         <w:spacing w:before="0" w:after="0"/>
+      </w:pPr>
+      <w:r>
+        <w:rPr>
+          <w:b w:val="0"/>
+          <w:i w:val="0"/>
+        </w:rPr>
+        <w:t>Quatro funções principais controlam as recompensas: award_quiz_xp, award_subject_view_xp, award_exercise_xp e award_project_xp. Restrições únicas registram se a atividade já ocorreu. A atualização e o recálculo do nível fazem parte da operação no banco, reduzindo condições de corrida e divergências entre interface e persistência.</w:t>
+      </w:r>
+    </w:p>
+    <w:p>
+      <w:pPr>
+        <w:spacing w:before="0" w:after="0"/>
+      </w:pPr>
+      <w:r>
+        <w:rPr>
+          <w:b w:val="0"/>
+          <w:i w:val="0"/>
+        </w:rPr>
+        <w:t>As funções privilegiadas fixam o search_path e revalidam a identidade. Triggers impedem que um cliente comum altere diretamente XP, nível ou papel administrativo. Operações administrativas permanecem condicionadas à verificação do papel no banco.</w:t>
+      </w:r>
+    </w:p>
+    <w:p>
+      <w:bookmarkStart w:id="1036" w:name="_TccToc36"/>
+      <w:pPr>
+        <w:pStyle w:val="Heading2"/>
+        <w:keepNext/>
+      </w:pPr>
+      <w:r>
+        <w:t>5.8 SEGURANÇA E PRIVACIDADE</w:t>
+      </w:r>
+      <w:bookmarkEnd w:id="1036"/>
+    </w:p>
+    <w:p>
+      <w:pPr>
+        <w:pStyle w:val="Semrecuo"/>
+        <w:ind w:left="425" w:hanging="283"/>
+      </w:pPr>
+      <w:r>
+        <w:t xml:space="preserve">• </w:t>
+      </w:r>
+      <w:r>
+        <w:t>RLS habilitado nas tabelas públicas;</w:t>
+      </w:r>
+    </w:p>
+    <w:p>
+      <w:pPr>
+        <w:pStyle w:val="Semrecuo"/>
+        <w:ind w:left="425" w:hanging="283"/>
+      </w:pPr>
+      <w:r>
+        <w:t xml:space="preserve">• </w:t>
+      </w:r>
+      <w:r>
+        <w:t>privilégio anônimo limitado às colunas necessárias do portfólio;</w:t>
+      </w:r>
+    </w:p>
+    <w:p>
+      <w:pPr>
+        <w:pStyle w:val="Semrecuo"/>
+        <w:ind w:left="425" w:hanging="283"/>
+      </w:pPr>
+      <w:r>
+        <w:t xml:space="preserve">• </w:t>
+      </w:r>
+      <w:r>
+        <w:t>consultas públicas sem select(*) e sem exposição de e-mail, idade ou is_admin;</w:t>
+      </w:r>
+    </w:p>
+    <w:p>
+      <w:pPr>
+        <w:pStyle w:val="Semrecuo"/>
+        <w:ind w:left="425" w:hanging="283"/>
+      </w:pPr>
+      <w:r>
+        <w:t xml:space="preserve">• </w:t>
+      </w:r>
+      <w:r>
+        <w:t>escape de nomes e conteúdos antes da inserção em HTML;</w:t>
+      </w:r>
+    </w:p>
+    <w:p>
+      <w:pPr>
+        <w:pStyle w:val="Semrecuo"/>
+        <w:ind w:left="425" w:hanging="283"/>
+      </w:pPr>
+      <w:r>
+        <w:t xml:space="preserve">• </w:t>
+      </w:r>
+      <w:r>
+        <w:t>bucket de avatar privado e uso de URL assinada;</w:t>
+      </w:r>
+    </w:p>
+    <w:p>
+      <w:pPr>
+        <w:pStyle w:val="Semrecuo"/>
+        <w:ind w:left="425" w:hanging="283"/>
+      </w:pPr>
+      <w:r>
+        <w:t xml:space="preserve">• </w:t>
+      </w:r>
+      <w:r>
+        <w:t>validação de tipo e tamanho da imagem no cliente e no Storage;</w:t>
+      </w:r>
+    </w:p>
+    <w:p>
+      <w:pPr>
+        <w:pStyle w:val="Semrecuo"/>
+        <w:ind w:left="425" w:hanging="283"/>
+      </w:pPr>
+      <w:r>
+        <w:t xml:space="preserve">• </w:t>
+      </w:r>
+      <w:r>
+        <w:t>mensagem idêntica para perfil privado e inexistente;</w:t>
+      </w:r>
+    </w:p>
+    <w:p>
+      <w:pPr>
+        <w:pStyle w:val="Semrecuo"/>
+        <w:ind w:left="425" w:hanging="283"/>
+      </w:pPr>
+      <w:r>
+        <w:t xml:space="preserve">• </w:t>
+      </w:r>
+      <w:r>
+        <w:t>confirmação antes de bloqueio, exclusão e outras ações críticas;</w:t>
+      </w:r>
+    </w:p>
+    <w:p>
+      <w:pPr>
+        <w:pStyle w:val="Semrecuo"/>
+        <w:ind w:left="425" w:hanging="283"/>
+      </w:pPr>
+      <w:r>
+        <w:t xml:space="preserve">• </w:t>
+      </w:r>
+      <w:r>
+        <w:t>ausência de chave service_role no frontend.</w:t>
+      </w:r>
+    </w:p>
+    <w:p>
+      <w:bookmarkStart w:id="1037" w:name="_TccToc37"/>
+      <w:pPr>
+        <w:pStyle w:val="Heading2"/>
+        <w:keepNext/>
+      </w:pPr>
+      <w:r>
+        <w:t>5.9 PAINEL ADMINISTRATIVO</w:t>
+      </w:r>
+      <w:bookmarkEnd w:id="1037"/>
+    </w:p>
+    <w:p>
+      <w:pPr>
+        <w:spacing w:before="0" w:after="0"/>
+      </w:pPr>
+      <w:r>
+        <w:rPr>
+          <w:b w:val="0"/>
+          <w:i w:val="0"/>
+        </w:rPr>
+        <w:t>O painel administrativo lista estudantes e permite consultar detalhes de nivelamento, projetos e certificados. Também contém ações para reiniciar XP, promover, bloquear, desbloquear ou remover os dados acadêmicos. A ocultação dos botões no frontend melhora a experiência, porém a autorização real é repetida no banco. A exclusão implementada não remove a identidade do Supabase Auth, pois isso exigiria uma API administrativa executada em ambiente seguro.</w:t>
+      </w:r>
+    </w:p>
+    <w:p>
+      <w:r>
+        <w:br w:type="page"/>
+      </w:r>
+    </w:p>
+    <w:p>
+      <w:bookmarkStart w:id="2009" w:name="_TccFig9"/>
+      <w:pPr>
+        <w:spacing w:before="120" w:after="80"/>
         <w:ind w:firstLine="0"/>
         <w:jc w:val="center"/>
       </w:pPr>
       <w:r>
         <w:rPr>
-          <w:b/>
-          <w:i w:val="0"/>
-        </w:rPr>
-        <w:t>auth.users 1—1 profiles 1—N {quiz_answers, subject_progress, certificates, user_projects} N—1 projects</w:t>
-      </w:r>
-    </w:p>
-    <w:p>
-      <w:pPr>
-        <w:pStyle w:val="Legenda"/>
-        <w:spacing w:before="0" w:after="0"/>
-        <w:ind w:firstLine="0"/>
-      </w:pPr>
-      <w:r>
-        <w:rPr>
           <w:b w:val="0"/>
           <w:i w:val="0"/>
         </w:rPr>
+      </w:r>
+      <w:r>
+        <w:rPr>
+          <w:b/>
+          <w:sz w:val="20"/>
+        </w:rPr>
+        <w:t>Figura 9 – Painel administrativo com dados pessoais protegidos</w:t>
+      </w:r>
+      <w:bookmarkEnd w:id="2009"/>
+    </w:p>
+    <w:p>
+      <w:pPr>
+        <w:pStyle w:val="Semrecuo"/>
+        <w:jc w:val="center"/>
+      </w:pPr>
+      <w:r>
+        <w:drawing>
+          <wp:inline xmlns:a="http://schemas.openxmlformats.org/drawingml/2006/main" xmlns:pic="http://schemas.openxmlformats.org/drawingml/2006/picture">
+            <wp:extent cx="5580000" cy="2679968"/>
+            <wp:docPr id="6" name="Picture 6"/>
+            <wp:cNvGraphicFramePr>
+              <a:graphicFrameLocks noChangeAspect="1"/>
+            </wp:cNvGraphicFramePr>
+            <a:graphic>
+              <a:graphicData uri="http://schemas.openxmlformats.org/drawingml/2006/picture">
+                <pic:pic>
+                  <pic:nvPicPr>
+                    <pic:cNvPr id="0" name="painel-administrativo-dados-protegidos.png"/>
+                    <pic:cNvPicPr/>
+                  </pic:nvPicPr>
+                  <pic:blipFill>
+                    <a:blip r:embed="rId16"/>
+                    <a:stretch>
+                      <a:fillRect/>
+                    </a:stretch>
+                  </pic:blipFill>
+                  <pic:spPr>
+                    <a:xfrm>
+                      <a:off x="0" y="0"/>
+                      <a:ext cx="5580000" cy="2679968"/>
+                    </a:xfrm>
+                    <a:prstGeom prst="rect"/>
+                  </pic:spPr>
+                </pic:pic>
+              </a:graphicData>
+            </a:graphic>
+          </wp:inline>
+        </w:drawing>
+      </w:r>
+    </w:p>
+    <w:p>
+      <w:pPr>
+        <w:pStyle w:val="Legenda"/>
+        <w:spacing w:before="0" w:after="160"/>
+        <w:ind w:firstLine="0"/>
+      </w:pPr>
+      <w:r>
+        <w:rPr>
+          <w:b w:val="0"/>
+          <w:i w:val="0"/>
+        </w:rPr>
         <w:t>Fonte: Elaborado pelos autores (2026).</w:t>
       </w:r>
     </w:p>
     <w:p>
-      <w:bookmarkStart w:id="1035" w:name="_TccToc35"/>
+      <w:bookmarkStart w:id="1038" w:name="_TccToc38"/>
       <w:pPr>
         <w:pStyle w:val="Heading2"/>
         <w:keepNext/>
       </w:pPr>
       <w:r>
-        <w:t>5.7 REGRAS DE XP E CONSISTÊNCIA</w:t>
-      </w:r>
-      <w:bookmarkEnd w:id="1035"/>
+        <w:t>5.10 PUBLICAÇÃO</w:t>
+      </w:r>
+      <w:bookmarkEnd w:id="1038"/>
     </w:p>
     <w:p>
       <w:pPr>
@@ -7641,8 +8742,19 @@
           <w:b w:val="0"/>
           <w:i w:val="0"/>
         </w:rPr>
-        <w:t>Quatro funções principais controlam as recompensas: award_quiz_xp, award_subject_view_xp, award_exercise_xp e award_project_xp. Restrições únicas registram se a atividade já ocorreu. A atualização e o recálculo do nível fazem parte da operação no banco, reduzindo condições de corrida e divergências entre interface e persistência.</w:t>
-      </w:r>
+        <w:t>O repositório é publicado pelo GitHub Pages e pode ser acessado em https://joaocaetano19.github.io/TCC/. Como não há compilação, os arquivos estáticos são entregues diretamente. A implantação do banco exige executar database/schema.sql em um projeto Supabase e configurar a URL e a chave publicável em supabase.js. As URLs autorizadas de autenticação também precisam corresponder ao ambiente publicado.</w:t>
+      </w:r>
+    </w:p>
+    <w:p>
+      <w:bookmarkStart w:id="1039" w:name="_TccToc39"/>
+      <w:pPr>
+        <w:pStyle w:val="Heading2"/>
+        <w:keepNext/>
+      </w:pPr>
+      <w:r>
+        <w:t>5.11 OUTRAS INTERFACES DO SISTEMA</w:t>
+      </w:r>
+      <w:bookmarkEnd w:id="1039"/>
     </w:p>
     <w:p>
       <w:pPr>
@@ -7653,176 +8765,254 @@
           <w:b w:val="0"/>
           <w:i w:val="0"/>
         </w:rPr>
-        <w:t>As funções privilegiadas fixam o search_path e revalidam a identidade. Triggers impedem que um cliente comum altere diretamente XP, nível ou papel administrativo. Operações administrativas permanecem condicionadas à verificação do papel no banco.</w:t>
-      </w:r>
-    </w:p>
-    <w:p>
-      <w:bookmarkStart w:id="1036" w:name="_TccToc36"/>
-      <w:pPr>
-        <w:pStyle w:val="Heading2"/>
-        <w:keepNext/>
-      </w:pPr>
-      <w:r>
-        <w:t>5.8 SEGURANÇA E PRIVACIDADE</w:t>
-      </w:r>
-      <w:bookmarkEnd w:id="1036"/>
-    </w:p>
-    <w:p>
-      <w:pPr>
-        <w:pStyle w:val="Semrecuo"/>
-        <w:ind w:left="425" w:hanging="283"/>
-      </w:pPr>
-      <w:r>
-        <w:t xml:space="preserve">• </w:t>
-      </w:r>
-      <w:r>
-        <w:t>RLS habilitado nas tabelas públicas;</w:t>
-      </w:r>
-    </w:p>
-    <w:p>
-      <w:pPr>
-        <w:pStyle w:val="Semrecuo"/>
-        <w:ind w:left="425" w:hanging="283"/>
-      </w:pPr>
-      <w:r>
-        <w:t xml:space="preserve">• </w:t>
-      </w:r>
-      <w:r>
-        <w:t>privilégio anônimo limitado às colunas necessárias do portfólio;</w:t>
-      </w:r>
-    </w:p>
-    <w:p>
-      <w:pPr>
-        <w:pStyle w:val="Semrecuo"/>
-        <w:ind w:left="425" w:hanging="283"/>
-      </w:pPr>
-      <w:r>
-        <w:t xml:space="preserve">• </w:t>
-      </w:r>
-      <w:r>
-        <w:t>consultas públicas sem select(*) e sem exposição de e-mail, idade ou is_admin;</w:t>
-      </w:r>
-    </w:p>
-    <w:p>
-      <w:pPr>
-        <w:pStyle w:val="Semrecuo"/>
-        <w:ind w:left="425" w:hanging="283"/>
-      </w:pPr>
-      <w:r>
-        <w:t xml:space="preserve">• </w:t>
-      </w:r>
-      <w:r>
-        <w:t>escape de nomes e conteúdos antes da inserção em HTML;</w:t>
-      </w:r>
-    </w:p>
-    <w:p>
-      <w:pPr>
-        <w:pStyle w:val="Semrecuo"/>
-        <w:ind w:left="425" w:hanging="283"/>
-      </w:pPr>
-      <w:r>
-        <w:t xml:space="preserve">• </w:t>
-      </w:r>
-      <w:r>
-        <w:t>bucket de avatar privado e uso de URL assinada;</w:t>
-      </w:r>
-    </w:p>
-    <w:p>
-      <w:pPr>
-        <w:pStyle w:val="Semrecuo"/>
-        <w:ind w:left="425" w:hanging="283"/>
-      </w:pPr>
-      <w:r>
-        <w:t xml:space="preserve">• </w:t>
-      </w:r>
-      <w:r>
-        <w:t>validação de tipo e tamanho da imagem no cliente e no Storage;</w:t>
-      </w:r>
-    </w:p>
-    <w:p>
-      <w:pPr>
-        <w:pStyle w:val="Semrecuo"/>
-        <w:ind w:left="425" w:hanging="283"/>
-      </w:pPr>
-      <w:r>
-        <w:t xml:space="preserve">• </w:t>
-      </w:r>
-      <w:r>
-        <w:t>mensagem idêntica para perfil privado e inexistente;</w:t>
-      </w:r>
-    </w:p>
-    <w:p>
-      <w:pPr>
-        <w:pStyle w:val="Semrecuo"/>
-        <w:ind w:left="425" w:hanging="283"/>
-      </w:pPr>
-      <w:r>
-        <w:t xml:space="preserve">• </w:t>
-      </w:r>
-      <w:r>
-        <w:t>confirmação antes de bloqueio, exclusão e outras ações críticas;</w:t>
-      </w:r>
-    </w:p>
-    <w:p>
-      <w:pPr>
-        <w:pStyle w:val="Semrecuo"/>
-        <w:ind w:left="425" w:hanging="283"/>
-      </w:pPr>
-      <w:r>
-        <w:t xml:space="preserve">• </w:t>
-      </w:r>
-      <w:r>
-        <w:t>ausência de chave service_role no frontend.</w:t>
-      </w:r>
-    </w:p>
-    <w:p>
-      <w:bookmarkStart w:id="1037" w:name="_TccToc37"/>
-      <w:pPr>
-        <w:pStyle w:val="Heading2"/>
-        <w:keepNext/>
-      </w:pPr>
-      <w:r>
-        <w:t>5.9 PAINEL ADMINISTRATIVO</w:t>
-      </w:r>
-      <w:bookmarkEnd w:id="1037"/>
-    </w:p>
-    <w:p>
-      <w:pPr>
-        <w:spacing w:before="0" w:after="0"/>
+        <w:t>Além dos fluxos centrais, a plataforma apresenta telas específicas para identidade acadêmica, orientação profissional e contextualização do curso. O perfil reúne foto, nome, idade, nível, experiência e respostas do nivelamento. A área de evolução aproxima as matérias de possibilidades de carreira, enquanto a página Sobre o Curso descreve conteúdos e competências trabalhadas.</w:t>
+      </w:r>
+    </w:p>
+    <w:p>
+      <w:r>
+        <w:br w:type="page"/>
+      </w:r>
+    </w:p>
+    <w:p>
+      <w:bookmarkStart w:id="2010" w:name="_TccFig10"/>
+      <w:pPr>
+        <w:spacing w:before="120" w:after="80"/>
+        <w:ind w:firstLine="0"/>
+        <w:jc w:val="center"/>
       </w:pPr>
       <w:r>
         <w:rPr>
           <w:b w:val="0"/>
           <w:i w:val="0"/>
         </w:rPr>
-        <w:t>O painel administrativo lista estudantes e permite consultar detalhes de nivelamento, projetos e certificados. Também contém ações para reiniciar XP, promover, bloquear, desbloquear ou remover os dados acadêmicos. A ocultação dos botões no frontend melhora a experiência, porém a autorização real é repetida no banco. A exclusão implementada não remove a identidade do Supabase Auth, pois isso exigiria uma API administrativa executada em ambiente seguro.</w:t>
-      </w:r>
-    </w:p>
-    <w:p>
-      <w:bookmarkStart w:id="1038" w:name="_TccToc38"/>
-      <w:pPr>
-        <w:pStyle w:val="Heading2"/>
-        <w:keepNext/>
-      </w:pPr>
-      <w:r>
-        <w:t>5.10 PUBLICAÇÃO</w:t>
-      </w:r>
-      <w:bookmarkEnd w:id="1038"/>
-    </w:p>
-    <w:p>
-      <w:pPr>
-        <w:spacing w:before="0" w:after="0"/>
+      </w:r>
+      <w:r>
+        <w:rPr>
+          <w:b/>
+          <w:sz w:val="20"/>
+        </w:rPr>
+        <w:t>Figura 10 – Perfil do estudante e informações acadêmicas</w:t>
+      </w:r>
+      <w:bookmarkEnd w:id="2010"/>
+    </w:p>
+    <w:p>
+      <w:pPr>
+        <w:pStyle w:val="Semrecuo"/>
+        <w:jc w:val="center"/>
+      </w:pPr>
+      <w:r>
+        <w:drawing>
+          <wp:inline xmlns:a="http://schemas.openxmlformats.org/drawingml/2006/main" xmlns:pic="http://schemas.openxmlformats.org/drawingml/2006/picture">
+            <wp:extent cx="5580000" cy="2697956"/>
+            <wp:docPr id="7" name="Picture 7"/>
+            <wp:cNvGraphicFramePr>
+              <a:graphicFrameLocks noChangeAspect="1"/>
+            </wp:cNvGraphicFramePr>
+            <a:graphic>
+              <a:graphicData uri="http://schemas.openxmlformats.org/drawingml/2006/picture">
+                <pic:pic>
+                  <pic:nvPicPr>
+                    <pic:cNvPr id="0" name="Captura de tela 2026-10-06 210547.png"/>
+                    <pic:cNvPicPr/>
+                  </pic:nvPicPr>
+                  <pic:blipFill>
+                    <a:blip r:embed="rId17"/>
+                    <a:stretch>
+                      <a:fillRect/>
+                    </a:stretch>
+                  </pic:blipFill>
+                  <pic:spPr>
+                    <a:xfrm>
+                      <a:off x="0" y="0"/>
+                      <a:ext cx="5580000" cy="2697956"/>
+                    </a:xfrm>
+                    <a:prstGeom prst="rect"/>
+                  </pic:spPr>
+                </pic:pic>
+              </a:graphicData>
+            </a:graphic>
+          </wp:inline>
+        </w:drawing>
+      </w:r>
+    </w:p>
+    <w:p>
+      <w:pPr>
+        <w:pStyle w:val="Legenda"/>
+        <w:spacing w:before="0" w:after="160"/>
+        <w:ind w:firstLine="0"/>
       </w:pPr>
       <w:r>
         <w:rPr>
           <w:b w:val="0"/>
           <w:i w:val="0"/>
         </w:rPr>
-        <w:t>O repositório é publicado pelo GitHub Pages e pode ser acessado em https://joaocaetano19.github.io/TCC/. Como não há compilação, os arquivos estáticos são entregues diretamente. A implantação do banco exige executar database/schema.sql em um projeto Supabase e configurar a URL e a chave publicável em supabase.js. As URLs autorizadas de autenticação também precisam corresponder ao ambiente publicado.</w:t>
-      </w:r>
-    </w:p>
-    <w:p>
-      <w:bookmarkStart w:id="1039" w:name="_TccToc39"/>
+        <w:t>Fonte: Elaborado pelos autores (2026).</w:t>
+      </w:r>
+    </w:p>
+    <w:p>
+      <w:r>
+        <w:br w:type="page"/>
+      </w:r>
+    </w:p>
+    <w:p>
+      <w:bookmarkStart w:id="2011" w:name="_TccFig11"/>
+      <w:pPr>
+        <w:spacing w:before="120" w:after="80"/>
+        <w:ind w:firstLine="0"/>
+        <w:jc w:val="center"/>
+      </w:pPr>
+      <w:r>
+        <w:rPr>
+          <w:b w:val="0"/>
+          <w:i w:val="0"/>
+        </w:rPr>
+      </w:r>
+      <w:r>
+        <w:rPr>
+          <w:b/>
+          <w:sz w:val="20"/>
+        </w:rPr>
+        <w:t>Figura 11 – Relação entre matérias e possibilidades de carreira</w:t>
+      </w:r>
+      <w:bookmarkEnd w:id="2011"/>
+    </w:p>
+    <w:p>
+      <w:pPr>
+        <w:pStyle w:val="Semrecuo"/>
+        <w:jc w:val="center"/>
+      </w:pPr>
+      <w:r>
+        <w:drawing>
+          <wp:inline xmlns:a="http://schemas.openxmlformats.org/drawingml/2006/main" xmlns:pic="http://schemas.openxmlformats.org/drawingml/2006/picture">
+            <wp:extent cx="5580000" cy="2680205"/>
+            <wp:docPr id="8" name="Picture 8"/>
+            <wp:cNvGraphicFramePr>
+              <a:graphicFrameLocks noChangeAspect="1"/>
+            </wp:cNvGraphicFramePr>
+            <a:graphic>
+              <a:graphicData uri="http://schemas.openxmlformats.org/drawingml/2006/picture">
+                <pic:pic>
+                  <pic:nvPicPr>
+                    <pic:cNvPr id="0" name="Captura de tela 2026-10-06 210622.png"/>
+                    <pic:cNvPicPr/>
+                  </pic:nvPicPr>
+                  <pic:blipFill>
+                    <a:blip r:embed="rId18"/>
+                    <a:stretch>
+                      <a:fillRect/>
+                    </a:stretch>
+                  </pic:blipFill>
+                  <pic:spPr>
+                    <a:xfrm>
+                      <a:off x="0" y="0"/>
+                      <a:ext cx="5580000" cy="2680205"/>
+                    </a:xfrm>
+                    <a:prstGeom prst="rect"/>
+                  </pic:spPr>
+                </pic:pic>
+              </a:graphicData>
+            </a:graphic>
+          </wp:inline>
+        </w:drawing>
+      </w:r>
+    </w:p>
+    <w:p>
+      <w:pPr>
+        <w:pStyle w:val="Legenda"/>
+        <w:spacing w:before="0" w:after="160"/>
+        <w:ind w:firstLine="0"/>
+      </w:pPr>
+      <w:r>
+        <w:rPr>
+          <w:b w:val="0"/>
+          <w:i w:val="0"/>
+        </w:rPr>
+        <w:t>Fonte: Elaborado pelos autores (2026).</w:t>
+      </w:r>
+    </w:p>
+    <w:p>
+      <w:r>
+        <w:br w:type="page"/>
+      </w:r>
+    </w:p>
+    <w:p>
+      <w:bookmarkStart w:id="2012" w:name="_TccFig12"/>
+      <w:pPr>
+        <w:spacing w:before="120" w:after="80"/>
+        <w:ind w:firstLine="0"/>
+        <w:jc w:val="center"/>
+      </w:pPr>
+      <w:r>
+        <w:rPr>
+          <w:b w:val="0"/>
+          <w:i w:val="0"/>
+        </w:rPr>
+      </w:r>
+      <w:r>
+        <w:rPr>
+          <w:b/>
+          <w:sz w:val="20"/>
+        </w:rPr>
+        <w:t>Figura 12 – Apresentação dos conteúdos do Curso Técnico</w:t>
+      </w:r>
+      <w:bookmarkEnd w:id="2012"/>
+    </w:p>
+    <w:p>
+      <w:pPr>
+        <w:pStyle w:val="Semrecuo"/>
+        <w:jc w:val="center"/>
+      </w:pPr>
+      <w:r>
+        <w:drawing>
+          <wp:inline xmlns:a="http://schemas.openxmlformats.org/drawingml/2006/main" xmlns:pic="http://schemas.openxmlformats.org/drawingml/2006/picture">
+            <wp:extent cx="5580000" cy="2687890"/>
+            <wp:docPr id="9" name="Picture 9"/>
+            <wp:cNvGraphicFramePr>
+              <a:graphicFrameLocks noChangeAspect="1"/>
+            </wp:cNvGraphicFramePr>
+            <a:graphic>
+              <a:graphicData uri="http://schemas.openxmlformats.org/drawingml/2006/picture">
+                <pic:pic>
+                  <pic:nvPicPr>
+                    <pic:cNvPr id="0" name="Captura de tela 2026-10-06 210610.png"/>
+                    <pic:cNvPicPr/>
+                  </pic:nvPicPr>
+                  <pic:blipFill>
+                    <a:blip r:embed="rId19"/>
+                    <a:stretch>
+                      <a:fillRect/>
+                    </a:stretch>
+                  </pic:blipFill>
+                  <pic:spPr>
+                    <a:xfrm>
+                      <a:off x="0" y="0"/>
+                      <a:ext cx="5580000" cy="2687890"/>
+                    </a:xfrm>
+                    <a:prstGeom prst="rect"/>
+                  </pic:spPr>
+                </pic:pic>
+              </a:graphicData>
+            </a:graphic>
+          </wp:inline>
+        </w:drawing>
+      </w:r>
+    </w:p>
+    <w:p>
+      <w:pPr>
+        <w:pStyle w:val="Legenda"/>
+        <w:spacing w:before="0" w:after="160"/>
+        <w:ind w:firstLine="0"/>
+      </w:pPr>
+      <w:r>
+        <w:rPr>
+          <w:b w:val="0"/>
+          <w:i w:val="0"/>
+        </w:rPr>
+        <w:t>Fonte: Elaborado pelos autores (2026).</w:t>
+      </w:r>
+    </w:p>
+    <w:p>
+      <w:bookmarkStart w:id="1040" w:name="_TccToc40"/>
       <w:pPr>
         <w:pStyle w:val="Heading1"/>
         <w:pageBreakBefore/>
@@ -7831,10 +9021,10 @@
       <w:r>
         <w:t>6 TESTES E RESULTADOS</w:t>
       </w:r>
-      <w:bookmarkEnd w:id="1039"/>
-    </w:p>
-    <w:p>
-      <w:bookmarkStart w:id="1040" w:name="_TccToc40"/>
+      <w:bookmarkEnd w:id="1040"/>
+    </w:p>
+    <w:p>
+      <w:bookmarkStart w:id="1041" w:name="_TccToc41"/>
       <w:pPr>
         <w:pStyle w:val="Heading2"/>
         <w:keepNext/>
@@ -7842,7 +9032,7 @@
       <w:r>
         <w:t>6.1 ESTRATÉGIA DE TESTES</w:t>
       </w:r>
-      <w:bookmarkEnd w:id="1040"/>
+      <w:bookmarkEnd w:id="1041"/>
     </w:p>
     <w:p>
       <w:pPr>
@@ -7857,7 +9047,7 @@
       </w:r>
     </w:p>
     <w:p>
-      <w:bookmarkStart w:id="1041" w:name="_TccToc41"/>
+      <w:bookmarkStart w:id="1042" w:name="_TccToc42"/>
       <w:pPr>
         <w:pStyle w:val="Heading2"/>
         <w:keepNext/>
@@ -7865,7 +9055,7 @@
       <w:r>
         <w:t>6.2 RESULTADOS AUTOMATIZADOS</w:t>
       </w:r>
-      <w:bookmarkEnd w:id="1041"/>
+      <w:bookmarkEnd w:id="1042"/>
     </w:p>
     <w:p>
       <w:pPr>
@@ -8313,11 +9503,11 @@
           <w:b w:val="0"/>
           <w:i w:val="0"/>
         </w:rPr>
-        <w:t>As três suítes foram executadas novamente em 1º de outubro de 2026 no ambiente de desenvolvimento deste trabalho, após a instalação das dependências com npm ci. O resultado foi de 259 verificações aprovadas e nenhuma falha funcional nas suítes.</w:t>
-      </w:r>
-    </w:p>
-    <w:p>
-      <w:bookmarkStart w:id="1042" w:name="_TccToc42"/>
+        <w:t>As três suítes foram executadas novamente em 6 de outubro de 2026 no ambiente de desenvolvimento deste trabalho, após a instalação das dependências com npm ci. O resultado foi de 259 verificações aprovadas e nenhuma falha funcional nas suítes.</w:t>
+      </w:r>
+    </w:p>
+    <w:p>
+      <w:bookmarkStart w:id="1043" w:name="_TccToc43"/>
       <w:pPr>
         <w:pStyle w:val="Heading2"/>
         <w:keepNext/>
@@ -8325,7 +9515,7 @@
       <w:r>
         <w:t>6.3 CENÁRIOS REPRESENTATIVOS</w:t>
       </w:r>
-      <w:bookmarkEnd w:id="1042"/>
+      <w:bookmarkEnd w:id="1043"/>
     </w:p>
     <w:p>
       <w:pPr>
@@ -8448,7 +9638,7 @@
       </w:r>
     </w:p>
     <w:p>
-      <w:bookmarkStart w:id="1043" w:name="_TccToc43"/>
+      <w:bookmarkStart w:id="1044" w:name="_TccToc44"/>
       <w:pPr>
         <w:pStyle w:val="Heading2"/>
         <w:keepNext/>
@@ -8456,7 +9646,7 @@
       <w:r>
         <w:t>6.4 ANÁLISE DOS RESULTADOS</w:t>
       </w:r>
-      <w:bookmarkEnd w:id="1043"/>
+      <w:bookmarkEnd w:id="1044"/>
     </w:p>
     <w:p>
       <w:pPr>
@@ -8483,7 +9673,7 @@
       </w:r>
     </w:p>
     <w:p>
-      <w:bookmarkStart w:id="1044" w:name="_TccToc44"/>
+      <w:bookmarkStart w:id="1045" w:name="_TccToc45"/>
       <w:pPr>
         <w:pStyle w:val="Heading2"/>
         <w:keepNext/>
@@ -8491,7 +9681,7 @@
       <w:r>
         <w:t>6.5 VALIDAÇÃO MANUAL RECOMENDADA</w:t>
       </w:r>
-      <w:bookmarkEnd w:id="1044"/>
+      <w:bookmarkEnd w:id="1045"/>
     </w:p>
     <w:p>
       <w:pPr>
@@ -8506,7 +9696,7 @@
       </w:r>
     </w:p>
     <w:p>
-      <w:bookmarkStart w:id="1045" w:name="_TccToc45"/>
+      <w:bookmarkStart w:id="1046" w:name="_TccToc46"/>
       <w:pPr>
         <w:pStyle w:val="Heading1"/>
         <w:pageBreakBefore/>
@@ -8515,10 +9705,10 @@
       <w:r>
         <w:t>7 DISCUSSÃO, LIMITAÇÕES E TRABALHOS FUTUROS</w:t>
       </w:r>
-      <w:bookmarkEnd w:id="1045"/>
-    </w:p>
-    <w:p>
-      <w:bookmarkStart w:id="1046" w:name="_TccToc46"/>
+      <w:bookmarkEnd w:id="1046"/>
+    </w:p>
+    <w:p>
+      <w:bookmarkStart w:id="1047" w:name="_TccToc47"/>
       <w:pPr>
         <w:pStyle w:val="Heading2"/>
         <w:keepNext/>
@@ -8526,7 +9716,7 @@
       <w:r>
         <w:t>7.1 CONTRIBUIÇÕES</w:t>
       </w:r>
-      <w:bookmarkEnd w:id="1046"/>
+      <w:bookmarkEnd w:id="1047"/>
     </w:p>
     <w:p>
       <w:pPr>
@@ -8541,7 +9731,7 @@
       </w:r>
     </w:p>
     <w:p>
-      <w:bookmarkStart w:id="1047" w:name="_TccToc47"/>
+      <w:bookmarkStart w:id="1048" w:name="_TccToc48"/>
       <w:pPr>
         <w:pStyle w:val="Heading2"/>
         <w:keepNext/>
@@ -8549,7 +9739,7 @@
       <w:r>
         <w:t>7.2 LIMITAÇÕES</w:t>
       </w:r>
-      <w:bookmarkEnd w:id="1047"/>
+      <w:bookmarkEnd w:id="1048"/>
     </w:p>
     <w:p>
       <w:pPr>
@@ -8648,7 +9838,7 @@
       </w:r>
     </w:p>
     <w:p>
-      <w:bookmarkStart w:id="1048" w:name="_TccToc48"/>
+      <w:bookmarkStart w:id="1049" w:name="_TccToc49"/>
       <w:pPr>
         <w:pStyle w:val="Heading2"/>
         <w:keepNext/>
@@ -8656,7 +9846,7 @@
       <w:r>
         <w:t>7.3 POSSIBILIDADES DE EVOLUÇÃO</w:t>
       </w:r>
-      <w:bookmarkEnd w:id="1048"/>
+      <w:bookmarkEnd w:id="1049"/>
     </w:p>
     <w:p>
       <w:pPr>
@@ -8767,7 +9957,7 @@
       </w:r>
     </w:p>
     <w:p>
-      <w:bookmarkStart w:id="1049" w:name="_TccToc49"/>
+      <w:bookmarkStart w:id="1050" w:name="_TccToc50"/>
       <w:pPr>
         <w:pStyle w:val="Heading1"/>
         <w:pageBreakBefore/>
@@ -8776,7 +9966,7 @@
       <w:r>
         <w:t>8 CONCLUSÃO</w:t>
       </w:r>
-      <w:bookmarkEnd w:id="1049"/>
+      <w:bookmarkEnd w:id="1050"/>
     </w:p>
     <w:p>
       <w:pPr>
@@ -8815,7 +10005,7 @@
       </w:r>
     </w:p>
     <w:p>
-      <w:bookmarkStart w:id="1050" w:name="_TccToc50"/>
+      <w:bookmarkStart w:id="1051" w:name="_TccToc51"/>
       <w:pPr>
         <w:pStyle w:val="Heading1"/>
         <w:pageBreakBefore/>
@@ -8824,7 +10014,7 @@
       <w:r>
         <w:t>REFERÊNCIAS</w:t>
       </w:r>
-      <w:bookmarkEnd w:id="1050"/>
+      <w:bookmarkEnd w:id="1051"/>
     </w:p>
     <w:p>
       <w:pPr>
@@ -8893,7 +10083,7 @@
           <w:b w:val="0"/>
           <w:i w:val="0"/>
         </w:rPr>
-        <w:t>GITHUB. GitHub Pages documentation. Disponível em: https://docs.github.com/pages. Acesso em: 1 out. 2026.</w:t>
+        <w:t>GITHUB. GitHub Pages documentation. Disponível em: https://docs.github.com/pages. Acesso em: 6 out. 2026.</w:t>
       </w:r>
     </w:p>
     <w:p>
@@ -8921,7 +10111,7 @@
           <w:b w:val="0"/>
           <w:i w:val="0"/>
         </w:rPr>
-        <w:t>MDN WEB DOCS. JavaScript. Disponível em: https://developer.mozilla.org/docs/Web/JavaScript. Acesso em: 1 out. 2026.</w:t>
+        <w:t>MDN WEB DOCS. JavaScript. Disponível em: https://developer.mozilla.org/docs/Web/JavaScript. Acesso em: 6 out. 2026.</w:t>
       </w:r>
     </w:p>
     <w:p>
@@ -8949,7 +10139,7 @@
           <w:b w:val="0"/>
           <w:i w:val="0"/>
         </w:rPr>
-        <w:t>OWASP FOUNDATION. OWASP Top 10: the ten most critical web application security risks. Disponível em: https://owasp.org/www-project-top-ten/. Acesso em: 1 out. 2026.</w:t>
+        <w:t>OWASP FOUNDATION. OWASP Top 10: the ten most critical web application security risks. Disponível em: https://owasp.org/www-project-top-ten/. Acesso em: 6 out. 2026.</w:t>
       </w:r>
     </w:p>
     <w:p>
@@ -8963,7 +10153,7 @@
           <w:b w:val="0"/>
           <w:i w:val="0"/>
         </w:rPr>
-        <w:t>POSTGRESQL GLOBAL DEVELOPMENT GROUP. PostgreSQL documentation. Disponível em: https://www.postgresql.org/docs/. Acesso em: 1 out. 2026.</w:t>
+        <w:t>POSTGRESQL GLOBAL DEVELOPMENT GROUP. PostgreSQL documentation. Disponível em: https://www.postgresql.org/docs/. Acesso em: 6 out. 2026.</w:t>
       </w:r>
     </w:p>
     <w:p>
@@ -9005,7 +10195,7 @@
           <w:b w:val="0"/>
           <w:i w:val="0"/>
         </w:rPr>
-        <w:t>SUPABASE. Supabase documentation. Disponível em: https://supabase.com/docs. Acesso em: 1 out. 2026.</w:t>
+        <w:t>SUPABASE. Supabase documentation. Disponível em: https://supabase.com/docs. Acesso em: 6 out. 2026.</w:t>
       </w:r>
     </w:p>
     <w:p>
@@ -9019,11 +10209,11 @@
           <w:b w:val="0"/>
           <w:i w:val="0"/>
         </w:rPr>
-        <w:t>W3C — WORLD WIDE WEB CONSORTIUM. Web Content Accessibility Guidelines (WCAG) 2.2. Disponível em: https://www.w3.org/TR/WCAG22/. Acesso em: 1 out. 2026.</w:t>
-      </w:r>
-    </w:p>
-    <w:p>
-      <w:bookmarkStart w:id="1051" w:name="_TccToc51"/>
+        <w:t>W3C — WORLD WIDE WEB CONSORTIUM. Web Content Accessibility Guidelines (WCAG) 2.2. Disponível em: https://www.w3.org/TR/WCAG22/. Acesso em: 6 out. 2026.</w:t>
+      </w:r>
+    </w:p>
+    <w:p>
+      <w:bookmarkStart w:id="1052" w:name="_TccToc52"/>
       <w:pPr>
         <w:pStyle w:val="Heading1"/>
         <w:pageBreakBefore/>
@@ -9032,10 +10222,10 @@
       <w:r>
         <w:t>APÊNDICE A — GUIA DE INSTALAÇÃO E EXECUÇÃO</w:t>
       </w:r>
-      <w:bookmarkEnd w:id="1051"/>
-    </w:p>
-    <w:p>
-      <w:bookmarkStart w:id="1052" w:name="_TccToc52"/>
+      <w:bookmarkEnd w:id="1052"/>
+    </w:p>
+    <w:p>
+      <w:bookmarkStart w:id="1053" w:name="_TccToc53"/>
       <w:pPr>
         <w:pStyle w:val="Heading2"/>
         <w:keepNext/>
@@ -9043,7 +10233,7 @@
       <w:r>
         <w:t>A.1 PRÉ-REQUISITOS</w:t>
       </w:r>
-      <w:bookmarkEnd w:id="1052"/>
+      <w:bookmarkEnd w:id="1053"/>
     </w:p>
     <w:p>
       <w:pPr>
@@ -9094,7 +10284,7 @@
       </w:r>
     </w:p>
     <w:p>
-      <w:bookmarkStart w:id="1053" w:name="_TccToc53"/>
+      <w:bookmarkStart w:id="1054" w:name="_TccToc54"/>
       <w:pPr>
         <w:pStyle w:val="Heading2"/>
         <w:keepNext/>
@@ -9102,7 +10292,7 @@
       <w:r>
         <w:t>A.2 EXECUÇÃO LOCAL</w:t>
       </w:r>
-      <w:bookmarkEnd w:id="1053"/>
+      <w:bookmarkEnd w:id="1054"/>
     </w:p>
     <w:p>
       <w:pPr>
@@ -9175,7 +10365,7 @@
       </w:r>
     </w:p>
     <w:p>
-      <w:bookmarkStart w:id="1054" w:name="_TccToc54"/>
+      <w:bookmarkStart w:id="1055" w:name="_TccToc55"/>
       <w:pPr>
         <w:pStyle w:val="Heading2"/>
         <w:keepNext/>
@@ -9183,7 +10373,7 @@
       <w:r>
         <w:t>A.3 CONFIGURAÇÃO DO BANCO</w:t>
       </w:r>
-      <w:bookmarkEnd w:id="1054"/>
+      <w:bookmarkEnd w:id="1055"/>
     </w:p>
     <w:p>
       <w:pPr>
@@ -9261,7 +10451,7 @@
       </w:r>
     </w:p>
     <w:p>
-      <w:bookmarkStart w:id="1055" w:name="_TccToc55"/>
+      <w:bookmarkStart w:id="1056" w:name="_TccToc56"/>
       <w:pPr>
         <w:pStyle w:val="Heading2"/>
         <w:keepNext/>
@@ -9269,7 +10459,7 @@
       <w:r>
         <w:t>A.4 TESTES</w:t>
       </w:r>
-      <w:bookmarkEnd w:id="1055"/>
+      <w:bookmarkEnd w:id="1056"/>
     </w:p>
     <w:p>
       <w:pPr>
@@ -9332,7 +10522,7 @@
       </w:r>
     </w:p>
     <w:p>
-      <w:bookmarkStart w:id="1056" w:name="_TccToc56"/>
+      <w:bookmarkStart w:id="1057" w:name="_TccToc57"/>
       <w:pPr>
         <w:pStyle w:val="Heading1"/>
         <w:pageBreakBefore/>
@@ -9341,7 +10531,7 @@
       <w:r>
         <w:t>APÊNDICE B — ROTEIRO DE VALIDAÇÃO MANUAL</w:t>
       </w:r>
-      <w:bookmarkEnd w:id="1056"/>
+      <w:bookmarkEnd w:id="1057"/>
     </w:p>
     <w:p>
       <w:pPr>
@@ -9921,7 +11111,7 @@
       </w:r>
     </w:p>
     <w:p>
-      <w:bookmarkStart w:id="1057" w:name="_TccToc57"/>
+      <w:bookmarkStart w:id="1058" w:name="_TccToc58"/>
       <w:pPr>
         <w:pStyle w:val="Heading1"/>
         <w:pageBreakBefore/>
@@ -9930,7 +11120,7 @@
       <w:r>
         <w:t>APÊNDICE C — CAMPOS A CONFERIR ANTES DA ENTREGA</w:t>
       </w:r>
-      <w:bookmarkEnd w:id="1057"/>
+      <w:bookmarkEnd w:id="1058"/>
     </w:p>
     <w:p>
       <w:pPr>
@@ -9953,7 +11143,7 @@
         <w:t xml:space="preserve">• </w:t>
       </w:r>
       <w:r>
-        <w:t>preencher data, conceito, coordenação e demais integrantes da banca;</w:t>
+        <w:t>preencher data, conceito, coordenação e demais integrantes da banca quando essas informações forem divulgadas;</w:t>
       </w:r>
     </w:p>
     <w:p>
@@ -9965,7 +11155,7 @@
         <w:t xml:space="preserve">• </w:t>
       </w:r>
       <w:r>
-        <w:t>inserir capturas de tela nos campos destacados;</w:t>
+        <w:t>atualizar o sumário e a Lista de Figuras no editor de texto após qualquer alteração;</w:t>
       </w:r>
     </w:p>
     <w:p>
@@ -9977,7 +11167,7 @@
         <w:t xml:space="preserve">• </w:t>
       </w:r>
       <w:r>
-        <w:t>atualizar o sumário e a lista de figuras no editor de texto;</w:t>
+        <w:t>confirmar se a instituição exige ficha catalográfica;</w:t>
       </w:r>
     </w:p>
     <w:p>
@@ -9989,19 +11179,7 @@
         <w:t xml:space="preserve">• </w:t>
       </w:r>
       <w:r>
-        <w:t>confirmar se a instituição exige dedicatória, agradecimentos ou ficha catalográfica;</w:t>
-      </w:r>
-    </w:p>
-    <w:p>
-      <w:pPr>
-        <w:pStyle w:val="Semrecuo"/>
-        <w:ind w:left="425" w:hanging="283"/>
-      </w:pPr>
-      <w:r>
-        <w:t xml:space="preserve">• </w:t>
-      </w:r>
-      <w:r>
-        <w:t>revisar citações, ortografia e regras específicas do professor;</w:t>
+        <w:t>realizar a revisão final com o professor orientador;</w:t>
       </w:r>
     </w:p>
     <w:p>
@@ -10022,7 +11200,7 @@
       <w:pgMar w:top="1701" w:right="1134" w:bottom="1134" w:left="1701" w:header="1134" w:footer="709" w:gutter="0"/>
       <w:cols w:space="720"/>
       <w:docGrid w:linePitch="360"/>
-      <w:pgNumType w:start="10"/>
+      <w:pgNumType w:start="12"/>
     </w:sectPr>
   </w:body>
 </w:document>

</xml_diff>

<commit_message>
fix: associa capturas às seções corretas do TCC
Co-authored-by: arena-agent <297053741+arena-agent@users.noreply.github.com>
</commit_message>
<xml_diff>
--- a/docs/TCC-Pratica-dev-2.0-editavel.docx
+++ b/docs/TCC-Pratica-dev-2.0-editavel.docx
@@ -7608,8 +7608,217 @@
       <w:r>
         <w:drawing>
           <wp:inline xmlns:a="http://schemas.openxmlformats.org/drawingml/2006/main" xmlns:pic="http://schemas.openxmlformats.org/drawingml/2006/picture">
+            <wp:extent cx="5580000" cy="2680205"/>
+            <wp:docPr id="2" name="Picture 2"/>
+            <wp:cNvGraphicFramePr>
+              <a:graphicFrameLocks noChangeAspect="1"/>
+            </wp:cNvGraphicFramePr>
+            <a:graphic>
+              <a:graphicData uri="http://schemas.openxmlformats.org/drawingml/2006/picture">
+                <pic:pic>
+                  <pic:nvPicPr>
+                    <pic:cNvPr id="0" name="Captura de tela 2026-10-06 210622.png"/>
+                    <pic:cNvPicPr/>
+                  </pic:nvPicPr>
+                  <pic:blipFill>
+                    <a:blip r:embed="rId12"/>
+                    <a:stretch>
+                      <a:fillRect/>
+                    </a:stretch>
+                  </pic:blipFill>
+                  <pic:spPr>
+                    <a:xfrm>
+                      <a:off x="0" y="0"/>
+                      <a:ext cx="5580000" cy="2680205"/>
+                    </a:xfrm>
+                    <a:prstGeom prst="rect"/>
+                  </pic:spPr>
+                </pic:pic>
+              </a:graphicData>
+            </a:graphic>
+          </wp:inline>
+        </w:drawing>
+      </w:r>
+    </w:p>
+    <w:p>
+      <w:pPr>
+        <w:pStyle w:val="Legenda"/>
+        <w:spacing w:before="0" w:after="160"/>
+        <w:ind w:firstLine="0"/>
+      </w:pPr>
+      <w:r>
+        <w:rPr>
+          <w:b w:val="0"/>
+          <w:i w:val="0"/>
+        </w:rPr>
+        <w:t>Fonte: Elaborado pelos autores (2026).</w:t>
+      </w:r>
+    </w:p>
+    <w:p>
+      <w:bookmarkStart w:id="1033" w:name="_TccToc33"/>
+      <w:pPr>
+        <w:pStyle w:val="Heading2"/>
+        <w:keepNext/>
+      </w:pPr>
+      <w:r>
+        <w:t>5.5 PROJETOS, CERTIFICADOS E PORTFÓLIO</w:t>
+      </w:r>
+      <w:bookmarkEnd w:id="1033"/>
+    </w:p>
+    <w:p>
+      <w:pPr>
+        <w:spacing w:before="0" w:after="0"/>
+      </w:pPr>
+      <w:r>
+        <w:rPr>
+          <w:b w:val="0"/>
+          <w:i w:val="0"/>
+        </w:rPr>
+        <w:t>O catálogo oferece nove projetos organizados por dificuldade. Cada briefing informa cenário, tecnologias, requisitos funcionais, entregáveis e critérios de aceite. Ao concluir, a aplicação chama a operação persistente e atualiza a interface somente após resposta positiva, evitando que uma falha seja mostrada como sucesso.</w:t>
+      </w:r>
+    </w:p>
+    <w:p>
+      <w:pPr>
+        <w:spacing w:before="0" w:after="0"/>
+      </w:pPr>
+      <w:r>
+        <w:rPr>
+          <w:b w:val="0"/>
+          <w:i w:val="0"/>
+        </w:rPr>
+        <w:t>O certificado é renderizado em canvas com nome do aluno, módulo, data, trilha, nível, XP e código de verificação determinístico. A imagem pode ser baixada em PNG ou impressa para PDF. O registro persistido em certificates, e não o desenho do canvas, é a fonte da verdade sobre a conclusão.</w:t>
+      </w:r>
+    </w:p>
+    <w:p>
+      <w:pPr>
+        <w:spacing w:before="0" w:after="0"/>
+      </w:pPr>
+      <w:r>
+        <w:rPr>
+          <w:b w:val="0"/>
+          <w:i w:val="0"/>
+        </w:rPr>
+        <w:t>O portfólio reúne perfil, projetos e certificados. Publicá-lo altera portfolio_public e produz um link contendo o identificador do perfil. A visualização pública solicita apenas os campos autorizados e não exige login. A retirada da publicação impede novas leituras anônimas.</w:t>
+      </w:r>
+    </w:p>
+    <w:p>
+      <w:r>
+        <w:br w:type="page"/>
+      </w:r>
+    </w:p>
+    <w:p>
+      <w:bookmarkStart w:id="2005" w:name="_TccFig5"/>
+      <w:pPr>
+        <w:spacing w:before="120" w:after="80"/>
+        <w:ind w:firstLine="0"/>
+        <w:jc w:val="center"/>
+      </w:pPr>
+      <w:r>
+        <w:rPr>
+          <w:b w:val="0"/>
+          <w:i w:val="0"/>
+        </w:rPr>
+      </w:r>
+      <w:r>
+        <w:rPr>
+          <w:b/>
+          <w:sz w:val="20"/>
+        </w:rPr>
+        <w:t>Figura 5 – Catálogo de projetos práticos e acesso aos briefings</w:t>
+      </w:r>
+      <w:bookmarkEnd w:id="2005"/>
+    </w:p>
+    <w:p>
+      <w:pPr>
+        <w:pStyle w:val="Semrecuo"/>
+        <w:jc w:val="center"/>
+      </w:pPr>
+      <w:r>
+        <w:drawing>
+          <wp:inline xmlns:a="http://schemas.openxmlformats.org/drawingml/2006/main" xmlns:pic="http://schemas.openxmlformats.org/drawingml/2006/picture">
+            <wp:extent cx="5580000" cy="2681650"/>
+            <wp:docPr id="3" name="Picture 3"/>
+            <wp:cNvGraphicFramePr>
+              <a:graphicFrameLocks noChangeAspect="1"/>
+            </wp:cNvGraphicFramePr>
+            <a:graphic>
+              <a:graphicData uri="http://schemas.openxmlformats.org/drawingml/2006/picture">
+                <pic:pic>
+                  <pic:nvPicPr>
+                    <pic:cNvPr id="0" name="Captura de tela 2026-10-06 210645.png"/>
+                    <pic:cNvPicPr/>
+                  </pic:nvPicPr>
+                  <pic:blipFill>
+                    <a:blip r:embed="rId13"/>
+                    <a:stretch>
+                      <a:fillRect/>
+                    </a:stretch>
+                  </pic:blipFill>
+                  <pic:spPr>
+                    <a:xfrm>
+                      <a:off x="0" y="0"/>
+                      <a:ext cx="5580000" cy="2681650"/>
+                    </a:xfrm>
+                    <a:prstGeom prst="rect"/>
+                  </pic:spPr>
+                </pic:pic>
+              </a:graphicData>
+            </a:graphic>
+          </wp:inline>
+        </w:drawing>
+      </w:r>
+    </w:p>
+    <w:p>
+      <w:pPr>
+        <w:pStyle w:val="Legenda"/>
+        <w:spacing w:before="0" w:after="160"/>
+        <w:ind w:firstLine="0"/>
+      </w:pPr>
+      <w:r>
+        <w:rPr>
+          <w:b w:val="0"/>
+          <w:i w:val="0"/>
+        </w:rPr>
+        <w:t>Fonte: Elaborado pelos autores (2026).</w:t>
+      </w:r>
+    </w:p>
+    <w:p>
+      <w:r>
+        <w:br w:type="page"/>
+      </w:r>
+    </w:p>
+    <w:p>
+      <w:bookmarkStart w:id="2006" w:name="_TccFig6"/>
+      <w:pPr>
+        <w:spacing w:before="120" w:after="80"/>
+        <w:ind w:firstLine="0"/>
+        <w:jc w:val="center"/>
+      </w:pPr>
+      <w:r>
+        <w:rPr>
+          <w:b w:val="0"/>
+          <w:i w:val="0"/>
+        </w:rPr>
+      </w:r>
+      <w:r>
+        <w:rPr>
+          <w:b/>
+          <w:sz w:val="20"/>
+        </w:rPr>
+        <w:t>Figura 6 – Certificados emitidos após a conclusão dos exercícios</w:t>
+      </w:r>
+      <w:bookmarkEnd w:id="2006"/>
+    </w:p>
+    <w:p>
+      <w:pPr>
+        <w:pStyle w:val="Semrecuo"/>
+        <w:jc w:val="center"/>
+      </w:pPr>
+      <w:r>
+        <w:drawing>
+          <wp:inline xmlns:a="http://schemas.openxmlformats.org/drawingml/2006/main" xmlns:pic="http://schemas.openxmlformats.org/drawingml/2006/picture">
             <wp:extent cx="5580000" cy="2679849"/>
-            <wp:docPr id="2" name="Picture 2"/>
+            <wp:docPr id="4" name="Picture 4"/>
             <wp:cNvGraphicFramePr>
               <a:graphicFrameLocks noChangeAspect="1"/>
             </wp:cNvGraphicFramePr>
@@ -7621,7 +7830,7 @@
                     <pic:cNvPicPr/>
                   </pic:nvPicPr>
                   <pic:blipFill>
-                    <a:blip r:embed="rId12"/>
+                    <a:blip r:embed="rId14"/>
                     <a:stretch>
                       <a:fillRect/>
                     </a:stretch>
@@ -7655,59 +7864,12 @@
       </w:r>
     </w:p>
     <w:p>
-      <w:bookmarkStart w:id="1033" w:name="_TccToc33"/>
-      <w:pPr>
-        <w:pStyle w:val="Heading2"/>
-        <w:keepNext/>
-      </w:pPr>
-      <w:r>
-        <w:t>5.5 PROJETOS, CERTIFICADOS E PORTFÓLIO</w:t>
-      </w:r>
-      <w:bookmarkEnd w:id="1033"/>
-    </w:p>
-    <w:p>
-      <w:pPr>
-        <w:spacing w:before="0" w:after="0"/>
-      </w:pPr>
-      <w:r>
-        <w:rPr>
-          <w:b w:val="0"/>
-          <w:i w:val="0"/>
-        </w:rPr>
-        <w:t>O catálogo oferece nove projetos organizados por dificuldade. Cada briefing informa cenário, tecnologias, requisitos funcionais, entregáveis e critérios de aceite. Ao concluir, a aplicação chama a operação persistente e atualiza a interface somente após resposta positiva, evitando que uma falha seja mostrada como sucesso.</w:t>
-      </w:r>
-    </w:p>
-    <w:p>
-      <w:pPr>
-        <w:spacing w:before="0" w:after="0"/>
-      </w:pPr>
-      <w:r>
-        <w:rPr>
-          <w:b w:val="0"/>
-          <w:i w:val="0"/>
-        </w:rPr>
-        <w:t>O certificado é renderizado em canvas com nome do aluno, módulo, data, trilha, nível, XP e código de verificação determinístico. A imagem pode ser baixada em PNG ou impressa para PDF. O registro persistido em certificates, e não o desenho do canvas, é a fonte da verdade sobre a conclusão.</w:t>
-      </w:r>
-    </w:p>
-    <w:p>
-      <w:pPr>
-        <w:spacing w:before="0" w:after="0"/>
-      </w:pPr>
-      <w:r>
-        <w:rPr>
-          <w:b w:val="0"/>
-          <w:i w:val="0"/>
-        </w:rPr>
-        <w:t>O portfólio reúne perfil, projetos e certificados. Publicá-lo altera portfolio_public e produz um link contendo o identificador do perfil. A visualização pública solicita apenas os campos autorizados e não exige login. A retirada da publicação impede novas leituras anônimas.</w:t>
-      </w:r>
-    </w:p>
-    <w:p>
       <w:r>
         <w:br w:type="page"/>
       </w:r>
     </w:p>
     <w:p>
-      <w:bookmarkStart w:id="2005" w:name="_TccFig5"/>
+      <w:bookmarkStart w:id="2007" w:name="_TccFig7"/>
       <w:pPr>
         <w:spacing w:before="120" w:after="80"/>
         <w:ind w:firstLine="0"/>
@@ -7724,9 +7886,9 @@
           <w:b/>
           <w:sz w:val="20"/>
         </w:rPr>
-        <w:t>Figura 5 – Catálogo de projetos práticos e acesso aos briefings</w:t>
-      </w:r>
-      <w:bookmarkEnd w:id="2005"/>
+        <w:t>Figura 7 – Portfólio digital e controle de publicação</w:t>
+      </w:r>
+      <w:bookmarkEnd w:id="2007"/>
     </w:p>
     <w:p>
       <w:pPr>
@@ -7737,7 +7899,7 @@
         <w:drawing>
           <wp:inline xmlns:a="http://schemas.openxmlformats.org/drawingml/2006/main" xmlns:pic="http://schemas.openxmlformats.org/drawingml/2006/picture">
             <wp:extent cx="5580000" cy="2683213"/>
-            <wp:docPr id="3" name="Picture 3"/>
+            <wp:docPr id="5" name="Picture 5"/>
             <wp:cNvGraphicFramePr>
               <a:graphicFrameLocks noChangeAspect="1"/>
             </wp:cNvGraphicFramePr>
@@ -7749,7 +7911,7 @@
                     <pic:cNvPicPr/>
                   </pic:nvPicPr>
                   <pic:blipFill>
-                    <a:blip r:embed="rId13"/>
+                    <a:blip r:embed="rId15"/>
                     <a:stretch>
                       <a:fillRect/>
                     </a:stretch>
@@ -7758,168 +7920,6 @@
                     <a:xfrm>
                       <a:off x="0" y="0"/>
                       <a:ext cx="5580000" cy="2683213"/>
-                    </a:xfrm>
-                    <a:prstGeom prst="rect"/>
-                  </pic:spPr>
-                </pic:pic>
-              </a:graphicData>
-            </a:graphic>
-          </wp:inline>
-        </w:drawing>
-      </w:r>
-    </w:p>
-    <w:p>
-      <w:pPr>
-        <w:pStyle w:val="Legenda"/>
-        <w:spacing w:before="0" w:after="160"/>
-        <w:ind w:firstLine="0"/>
-      </w:pPr>
-      <w:r>
-        <w:rPr>
-          <w:b w:val="0"/>
-          <w:i w:val="0"/>
-        </w:rPr>
-        <w:t>Fonte: Elaborado pelos autores (2026).</w:t>
-      </w:r>
-    </w:p>
-    <w:p>
-      <w:r>
-        <w:br w:type="page"/>
-      </w:r>
-    </w:p>
-    <w:p>
-      <w:bookmarkStart w:id="2006" w:name="_TccFig6"/>
-      <w:pPr>
-        <w:spacing w:before="120" w:after="80"/>
-        <w:ind w:firstLine="0"/>
-        <w:jc w:val="center"/>
-      </w:pPr>
-      <w:r>
-        <w:rPr>
-          <w:b w:val="0"/>
-          <w:i w:val="0"/>
-        </w:rPr>
-      </w:r>
-      <w:r>
-        <w:rPr>
-          <w:b/>
-          <w:sz w:val="20"/>
-        </w:rPr>
-        <w:t>Figura 6 – Certificados emitidos após a conclusão dos exercícios</w:t>
-      </w:r>
-      <w:bookmarkEnd w:id="2006"/>
-    </w:p>
-    <w:p>
-      <w:pPr>
-        <w:pStyle w:val="Semrecuo"/>
-        <w:jc w:val="center"/>
-      </w:pPr>
-      <w:r>
-        <w:drawing>
-          <wp:inline xmlns:a="http://schemas.openxmlformats.org/drawingml/2006/main" xmlns:pic="http://schemas.openxmlformats.org/drawingml/2006/picture">
-            <wp:extent cx="5580000" cy="2674189"/>
-            <wp:docPr id="4" name="Picture 4"/>
-            <wp:cNvGraphicFramePr>
-              <a:graphicFrameLocks noChangeAspect="1"/>
-            </wp:cNvGraphicFramePr>
-            <a:graphic>
-              <a:graphicData uri="http://schemas.openxmlformats.org/drawingml/2006/picture">
-                <pic:pic>
-                  <pic:nvPicPr>
-                    <pic:cNvPr id="0" name="Captura de tela 2026-10-06 210634.png"/>
-                    <pic:cNvPicPr/>
-                  </pic:nvPicPr>
-                  <pic:blipFill>
-                    <a:blip r:embed="rId14"/>
-                    <a:stretch>
-                      <a:fillRect/>
-                    </a:stretch>
-                  </pic:blipFill>
-                  <pic:spPr>
-                    <a:xfrm>
-                      <a:off x="0" y="0"/>
-                      <a:ext cx="5580000" cy="2674189"/>
-                    </a:xfrm>
-                    <a:prstGeom prst="rect"/>
-                  </pic:spPr>
-                </pic:pic>
-              </a:graphicData>
-            </a:graphic>
-          </wp:inline>
-        </w:drawing>
-      </w:r>
-    </w:p>
-    <w:p>
-      <w:pPr>
-        <w:pStyle w:val="Legenda"/>
-        <w:spacing w:before="0" w:after="160"/>
-        <w:ind w:firstLine="0"/>
-      </w:pPr>
-      <w:r>
-        <w:rPr>
-          <w:b w:val="0"/>
-          <w:i w:val="0"/>
-        </w:rPr>
-        <w:t>Fonte: Elaborado pelos autores (2026).</w:t>
-      </w:r>
-    </w:p>
-    <w:p>
-      <w:r>
-        <w:br w:type="page"/>
-      </w:r>
-    </w:p>
-    <w:p>
-      <w:bookmarkStart w:id="2007" w:name="_TccFig7"/>
-      <w:pPr>
-        <w:spacing w:before="120" w:after="80"/>
-        <w:ind w:firstLine="0"/>
-        <w:jc w:val="center"/>
-      </w:pPr>
-      <w:r>
-        <w:rPr>
-          <w:b w:val="0"/>
-          <w:i w:val="0"/>
-        </w:rPr>
-      </w:r>
-      <w:r>
-        <w:rPr>
-          <w:b/>
-          <w:sz w:val="20"/>
-        </w:rPr>
-        <w:t>Figura 7 – Portfólio digital e controle de publicação</w:t>
-      </w:r>
-      <w:bookmarkEnd w:id="2007"/>
-    </w:p>
-    <w:p>
-      <w:pPr>
-        <w:pStyle w:val="Semrecuo"/>
-        <w:jc w:val="center"/>
-      </w:pPr>
-      <w:r>
-        <w:drawing>
-          <wp:inline xmlns:a="http://schemas.openxmlformats.org/drawingml/2006/main" xmlns:pic="http://schemas.openxmlformats.org/drawingml/2006/picture">
-            <wp:extent cx="5580000" cy="2681650"/>
-            <wp:docPr id="5" name="Picture 5"/>
-            <wp:cNvGraphicFramePr>
-              <a:graphicFrameLocks noChangeAspect="1"/>
-            </wp:cNvGraphicFramePr>
-            <a:graphic>
-              <a:graphicData uri="http://schemas.openxmlformats.org/drawingml/2006/picture">
-                <pic:pic>
-                  <pic:nvPicPr>
-                    <pic:cNvPr id="0" name="Captura de tela 2026-10-06 210645.png"/>
-                    <pic:cNvPicPr/>
-                  </pic:nvPicPr>
-                  <pic:blipFill>
-                    <a:blip r:embed="rId15"/>
-                    <a:stretch>
-                      <a:fillRect/>
-                    </a:stretch>
-                  </pic:blipFill>
-                  <pic:spPr>
-                    <a:xfrm>
-                      <a:off x="0" y="0"/>
-                      <a:ext cx="5580000" cy="2681650"/>
                     </a:xfrm>
                     <a:prstGeom prst="rect"/>
                   </pic:spPr>
@@ -8884,7 +8884,7 @@
       <w:r>
         <w:drawing>
           <wp:inline xmlns:a="http://schemas.openxmlformats.org/drawingml/2006/main" xmlns:pic="http://schemas.openxmlformats.org/drawingml/2006/picture">
-            <wp:extent cx="5580000" cy="2680205"/>
+            <wp:extent cx="5580000" cy="2687890"/>
             <wp:docPr id="8" name="Picture 8"/>
             <wp:cNvGraphicFramePr>
               <a:graphicFrameLocks noChangeAspect="1"/>
@@ -8893,7 +8893,7 @@
               <a:graphicData uri="http://schemas.openxmlformats.org/drawingml/2006/picture">
                 <pic:pic>
                   <pic:nvPicPr>
-                    <pic:cNvPr id="0" name="Captura de tela 2026-10-06 210622.png"/>
+                    <pic:cNvPr id="0" name="Captura de tela 2026-10-06 210610.png"/>
                     <pic:cNvPicPr/>
                   </pic:nvPicPr>
                   <pic:blipFill>
@@ -8905,7 +8905,7 @@
                   <pic:spPr>
                     <a:xfrm>
                       <a:off x="0" y="0"/>
-                      <a:ext cx="5580000" cy="2680205"/>
+                      <a:ext cx="5580000" cy="2687890"/>
                     </a:xfrm>
                     <a:prstGeom prst="rect"/>
                   </pic:spPr>
@@ -8965,7 +8965,7 @@
       <w:r>
         <w:drawing>
           <wp:inline xmlns:a="http://schemas.openxmlformats.org/drawingml/2006/main" xmlns:pic="http://schemas.openxmlformats.org/drawingml/2006/picture">
-            <wp:extent cx="5580000" cy="2687890"/>
+            <wp:extent cx="5580000" cy="2674189"/>
             <wp:docPr id="9" name="Picture 9"/>
             <wp:cNvGraphicFramePr>
               <a:graphicFrameLocks noChangeAspect="1"/>
@@ -8974,7 +8974,7 @@
               <a:graphicData uri="http://schemas.openxmlformats.org/drawingml/2006/picture">
                 <pic:pic>
                   <pic:nvPicPr>
-                    <pic:cNvPr id="0" name="Captura de tela 2026-10-06 210610.png"/>
+                    <pic:cNvPr id="0" name="Captura de tela 2026-10-06 210634.png"/>
                     <pic:cNvPicPr/>
                   </pic:nvPicPr>
                   <pic:blipFill>
@@ -8986,7 +8986,7 @@
                   <pic:spPr>
                     <a:xfrm>
                       <a:off x="0" y="0"/>
-                      <a:ext cx="5580000" cy="2687890"/>
+                      <a:ext cx="5580000" cy="2674189"/>
                     </a:xfrm>
                     <a:prstGeom prst="rect"/>
                   </pic:spPr>

</xml_diff>

<commit_message>
docs: remove checklist interno da versão final
Co-authored-by: arena-agent <297053741+arena-agent@users.noreply.github.com>
</commit_message>
<xml_diff>
--- a/docs/TCC-Pratica-dev-2.0-editavel.docx
+++ b/docs/TCC-Pratica-dev-2.0-editavel.docx
@@ -3859,38 +3859,6 @@
         <w:instrText xml:space="preserve"> PAGEREF _TccToc57 \h </w:instrText>
         <w:fldChar w:fldCharType="separate"/>
         <w:t>50</w:t>
-        <w:fldChar w:fldCharType="end"/>
-      </w:r>
-    </w:p>
-    <w:p>
-      <w:pPr>
-        <w:pStyle w:val="Semrecuo"/>
-        <w:tabs>
-          <w:tab w:pos="8787" w:val="right" w:leader="dot"/>
-        </w:tabs>
-        <w:spacing w:line="240" w:lineRule="auto" w:after="60"/>
-        <w:ind w:left="0" w:firstLine="0"/>
-      </w:pPr>
-      <w:r>
-        <w:rPr>
-          <w:rFonts w:ascii="Arial" w:hAnsi="Arial"/>
-          <w:b/>
-          <w:sz w:val="20"/>
-        </w:rPr>
-        <w:t>APÊNDICE C — CAMPOS A CONFERIR ANTES DA ENTREGA</w:t>
-      </w:r>
-      <w:r>
-        <w:tab/>
-      </w:r>
-      <w:r>
-        <w:rPr>
-          <w:rFonts w:ascii="Arial" w:hAnsi="Arial"/>
-          <w:sz w:val="20"/>
-        </w:rPr>
-        <w:fldChar w:fldCharType="begin" w:dirty="true"/>
-        <w:instrText xml:space="preserve"> PAGEREF _TccToc58 \h </w:instrText>
-        <w:fldChar w:fldCharType="separate"/>
-        <w:t>51</w:t>
         <w:fldChar w:fldCharType="end"/>
       </w:r>
     </w:p>
@@ -11108,90 +11076,6 @@
           <w:i w:val="0"/>
         </w:rPr>
         <w:t>Fonte: Elaborado pelos autores (2026).</w:t>
-      </w:r>
-    </w:p>
-    <w:p>
-      <w:bookmarkStart w:id="1058" w:name="_TccToc58"/>
-      <w:pPr>
-        <w:pStyle w:val="Heading1"/>
-        <w:pageBreakBefore/>
-        <w:keepNext/>
-      </w:pPr>
-      <w:r>
-        <w:t>APÊNDICE C — CAMPOS A CONFERIR ANTES DA ENTREGA</w:t>
-      </w:r>
-      <w:bookmarkEnd w:id="1058"/>
-    </w:p>
-    <w:p>
-      <w:pPr>
-        <w:pStyle w:val="Semrecuo"/>
-        <w:ind w:left="425" w:hanging="283"/>
-      </w:pPr>
-      <w:r>
-        <w:t xml:space="preserve">• </w:t>
-      </w:r>
-      <w:r>
-        <w:t>confirmar a grafia de “Antonio Carlos Ramires Golçalves”;</w:t>
-      </w:r>
-    </w:p>
-    <w:p>
-      <w:pPr>
-        <w:pStyle w:val="Semrecuo"/>
-        <w:ind w:left="425" w:hanging="283"/>
-      </w:pPr>
-      <w:r>
-        <w:t xml:space="preserve">• </w:t>
-      </w:r>
-      <w:r>
-        <w:t>preencher data, conceito, coordenação e demais integrantes da banca quando essas informações forem divulgadas;</w:t>
-      </w:r>
-    </w:p>
-    <w:p>
-      <w:pPr>
-        <w:pStyle w:val="Semrecuo"/>
-        <w:ind w:left="425" w:hanging="283"/>
-      </w:pPr>
-      <w:r>
-        <w:t xml:space="preserve">• </w:t>
-      </w:r>
-      <w:r>
-        <w:t>atualizar o sumário e a Lista de Figuras no editor de texto após qualquer alteração;</w:t>
-      </w:r>
-    </w:p>
-    <w:p>
-      <w:pPr>
-        <w:pStyle w:val="Semrecuo"/>
-        <w:ind w:left="425" w:hanging="283"/>
-      </w:pPr>
-      <w:r>
-        <w:t xml:space="preserve">• </w:t>
-      </w:r>
-      <w:r>
-        <w:t>confirmar se a instituição exige ficha catalográfica;</w:t>
-      </w:r>
-    </w:p>
-    <w:p>
-      <w:pPr>
-        <w:pStyle w:val="Semrecuo"/>
-        <w:ind w:left="425" w:hanging="283"/>
-      </w:pPr>
-      <w:r>
-        <w:t xml:space="preserve">• </w:t>
-      </w:r>
-      <w:r>
-        <w:t>realizar a revisão final com o professor orientador;</w:t>
-      </w:r>
-    </w:p>
-    <w:p>
-      <w:pPr>
-        <w:pStyle w:val="Semrecuo"/>
-        <w:ind w:left="425" w:hanging="283"/>
-      </w:pPr>
-      <w:r>
-        <w:t xml:space="preserve">• </w:t>
-      </w:r>
-      <w:r>
-        <w:t>remover esta lista após concluir a conferência.</w:t>
       </w:r>
     </w:p>
     <w:sectPr>

</xml_diff>